<commit_message>
Select thresholds on training out-of-fold predictions; add district-bootstrap for H5, causal caveat, weighted-metric and importance explanations
</commit_message>
<xml_diff>
--- a/report/Milestone03_Report.docx
+++ b/report/Milestone03_Report.docx
@@ -350,7 +350,7 @@
           <w:b/>
           <w:sz w:val="19"/>
         </w:rPr>
-        <w:t>Table 2. Inner cross-validation results of the tuned configurations (mean over 5 district-grouped folds)</w:t>
+        <w:t>Table 2. Inner cross-validation results of the tuned configurations (mean over 5 district-grouped folds; recall, F1 and accuracy are at the default 0.5 threshold, ROC-AUC and PR-AUC are threshold-free)</w:t>
       </w:r>
     </w:p>
     <w:tbl>
@@ -805,7 +805,7 @@
     <w:p/>
     <w:p>
       <w:r>
-        <w:t>Hyperparameter exploration. The logistic grid covered C in {0.001, 0.01, 0.1, 1, 10} x class_weight in {none, balanced}; the best point was C = 0.001 with balanced weights (CV ROC-AUC 0.736 +/- 0.047). AUC was flat across C, while balancing matters for recall at the default threshold. The tree grid covered max_depth in {3, 5, 7, 10, 15, none} x min_samples_leaf in {1, 50, 200, 1000} x class_weight; the best point was depth 10, minimum leaf 200, no class weights (CV ROC-AUC 0.744 +/- 0.051; fitted tree depth 10, 221 leaves). Unconstrained trees over-fit district idiosyncrasies and lose AUC on unseen districts. Full grids: outputs/tables/t02-t04.</w:t>
+        <w:t>Hyperparameter exploration. The logistic grid covered C in {0.001, 0.01, 0.1, 1, 10} x class_weight in {none, balanced}; the best point was C = 0.001 with balanced weights (CV ROC-AUC 0.736 +/- 0.047). AUC was flat across C, while balancing matters for recall at the default threshold. The tree grid covered max_depth in {3, 5, 7, 10, 15, none} x min_samples_leaf in {1, 50, 200, 1000} x class_weight; the best point was depth 10, minimum leaf 200, no class weights (CV ROC-AUC 0.744 +/- 0.051; fitted tree depth 10, 221 leaves). Unconstrained trees over-fit district idiosyncrasies and lose AUC on unseen districts. Because refitting is on ROC-AUC, a threshold-free criterion, the selected tree carries no class weighting and at the default 0.5 cut-off flags almost nobody (recall 4.3% on the hold-out, Table 3): almost no leaf reaches a 50% out-of-school share. That is not a defect of the tree; it is why the operating threshold is set separately, and without looking at the hold-out, in section 5. Full grids: outputs/tables/t02-t04.</w:t>
       </w:r>
     </w:p>
     <w:p>
@@ -818,7 +818,7 @@
     </w:p>
     <w:p>
       <w:r>
-        <w:t>On identical inner folds, a logistic model using only age, sex and area reached ROC-AUC 0.586 (+/- 0.042) against 0.736 (+/- 0.047) for the 13-feature model: a gain of +0.150 AUC in every fold (paired t = 4.56, p = 0.010). On the hold-out districts the AUCs were 0.547 and 0.674. H0 for H5 is rejected: who is out of school is explained far better by household circumstances than by demographics alone.</w:t>
+        <w:t>On identical inner folds, a logistic model using only age, sex and area reached ROC-AUC 0.586 (+/- 0.042) against 0.736 (+/- 0.047) for the 13-feature model: a gain of +0.150 AUC in every fold (paired t = 4.56, p = 0.010). On the hold-out districts the AUCs were 0.547 and 0.674. Five folds are a thin basis for a t-test, so the hold-out gain was also bootstrapped by resampling the 29 held-out districts with replacement (1,000 draws): gain +0.127 AUC, 95% interval [+0.078, +0.173], positive in 100% of draws. H0 for H5 is rejected: who is out of school is explained far better by household circumstances than by demographics alone.</w:t>
       </w:r>
     </w:p>
     <w:p>
@@ -2109,7 +2109,7 @@
     <w:p/>
     <w:p>
       <w:r>
-        <w:t>The majority-class benchmark reaches 87.5% accuracy and finds no out-of-school child. The balanced logistic regression trades accuracy (62.0%) for recall (63.4%) at the default cut-off (ROC-AUC 0.674, PR-AUC 0.214). The decision tree ranks children better (ROC-AUC 0.711, PR-AUC 0.236) but, tuned without class weights, almost no leaf exceeds a 50% out-of-school share, so its default-threshold recall is only 4.3%. The threshold, not the learner, decides who is flagged. Survey-weighted metrics are close to the unweighted ones. Hold-out AUCs sit 0.03-0.06 below the CV means: the held-out districts are a harder group, within the fold-to-fold spread observed in CV.</w:t>
+        <w:t>The majority-class benchmark reaches 87.5% accuracy and finds no out-of-school child. The balanced logistic regression trades accuracy (62.0%) for recall (63.4%) at the default cut-off (ROC-AUC 0.674, PR-AUC 0.214). The decision tree ranks children better (ROC-AUC 0.711, PR-AUC 0.236) but, tuned without class weights, almost no leaf exceeds a 50% out-of-school share, so its default-threshold recall is only 4.3%. The threshold, not the learner, decides who is flagged. Applying the ASER sampling weights changes the picture in different directions for different models: ROC-AUC rises from 0.674 to 0.713 for the full logistic model and from 0.711 to 0.749 for the tree, but falls from 0.547 to 0.512 for the demographic-only model. The weights up-weight households that the sample under-represents - predominantly poorer, rural ones - where the household features carry most of their signal and where age, sex and area alone separate least; population-level claims should therefore quote the weighted figures. Hold-out AUCs sit 0.03-0.06 below the CV means: the held-out districts are a harder group, within the fold-to-fold spread observed in CV.</w:t>
       </w:r>
     </w:p>
     <w:p>
@@ -2224,7 +2224,7 @@
     </w:p>
     <w:p>
       <w:r>
-        <w:t>A false negative (model says 'in school', child is out of school) means a child who needs an enrolment or outreach intervention is never visited - the costly error for an education-access programme. A false positive (model says 'out of school', child is enrolled) spends an outreach visit or a stipend slot on a child who did not need it - wasteful but recoverable. We quantify this by pricing a false negative at r false positives (r = 1, 3, 5, 10), sweeping the threshold from 0.05 to 0.95 and computing the expected cost per 1,000 children screened.</w:t>
+        <w:t>A false negative (model says 'in school', child is out of school) means a child who needs an enrolment or outreach intervention is never visited - the costly error for an education-access programme. A false positive (model says 'out of school', child is enrolled) spends an outreach visit or a stipend slot on a child who did not need it - wasteful but recoverable. We quantify this by pricing a false negative at r false positives (r = 1, 3, 5, 10), sweeping the threshold from 0.05 to 0.95 and computing the expected cost per 1,000 children screened. The operating threshold is a model setting, so it is chosen without touching the hold-out: each tuned pipeline is re-fitted on the five district-grouped training folds, out-of-fold probabilities are collected for every training child, the cost curve is swept on those, and the cost-minimising threshold is then applied once to the hold-out districts. Table 4 reports both the training out-of-fold metrics that drove the choice and the hold-out metrics at that threshold; its last two columns show what the hold-out's own optimum would have been, to make visible how much selecting the threshold on the test set would have flattered the result.</w:t>
       </w:r>
     </w:p>
     <w:p>
@@ -2233,7 +2233,7 @@
           <w:b/>
           <w:sz w:val="19"/>
         </w:rPr>
-        <w:t>Table 4. Cost-minimising threshold for each cost ratio</w:t>
+        <w:t>Table 4. Cost-minimising threshold per cost ratio: chosen on training out-of-fold predictions, then evaluated once on the hold-out</w:t>
       </w:r>
     </w:p>
     <w:tbl>
@@ -2243,26 +2243,29 @@
         <w:tblLook w:firstColumn="1" w:firstRow="1" w:lastColumn="0" w:lastRow="0" w:noHBand="0" w:noVBand="1" w:val="04A0"/>
       </w:tblPr>
       <w:tblGrid>
-        <w:gridCol w:w="960"/>
-        <w:gridCol w:w="960"/>
-        <w:gridCol w:w="960"/>
-        <w:gridCol w:w="960"/>
-        <w:gridCol w:w="960"/>
-        <w:gridCol w:w="960"/>
-        <w:gridCol w:w="960"/>
-        <w:gridCol w:w="960"/>
-        <w:gridCol w:w="960"/>
+        <w:gridCol w:w="720"/>
+        <w:gridCol w:w="720"/>
+        <w:gridCol w:w="720"/>
+        <w:gridCol w:w="720"/>
+        <w:gridCol w:w="720"/>
+        <w:gridCol w:w="720"/>
+        <w:gridCol w:w="720"/>
+        <w:gridCol w:w="720"/>
+        <w:gridCol w:w="720"/>
+        <w:gridCol w:w="720"/>
+        <w:gridCol w:w="720"/>
+        <w:gridCol w:w="720"/>
       </w:tblGrid>
       <w:tr>
         <w:tc>
           <w:tcPr>
-            <w:tcW w:type="dxa" w:w="960"/>
+            <w:tcW w:type="dxa" w:w="720"/>
           </w:tcPr>
           <w:p>
             <w:r>
               <w:rPr>
                 <w:b/>
-                <w:sz w:val="17"/>
+                <w:sz w:val="15"/>
               </w:rPr>
               <w:t>Model</w:t>
             </w:r>
@@ -2270,113 +2273,155 @@
         </w:tc>
         <w:tc>
           <w:tcPr>
-            <w:tcW w:type="dxa" w:w="960"/>
+            <w:tcW w:type="dxa" w:w="720"/>
           </w:tcPr>
           <w:p>
             <w:r>
               <w:rPr>
                 <w:b/>
-                <w:sz w:val="17"/>
-              </w:rPr>
-              <w:t>FN:FP cost</w:t>
-            </w:r>
-          </w:p>
-        </w:tc>
-        <w:tc>
-          <w:tcPr>
-            <w:tcW w:type="dxa" w:w="960"/>
+                <w:sz w:val="15"/>
+              </w:rPr>
+              <w:t>FN:FP</w:t>
+            </w:r>
+          </w:p>
+        </w:tc>
+        <w:tc>
+          <w:tcPr>
+            <w:tcW w:type="dxa" w:w="720"/>
           </w:tcPr>
           <w:p>
             <w:r>
               <w:rPr>
                 <w:b/>
-                <w:sz w:val="17"/>
-              </w:rPr>
-              <w:t>Threshold</w:t>
-            </w:r>
-          </w:p>
-        </w:tc>
-        <w:tc>
-          <w:tcPr>
-            <w:tcW w:type="dxa" w:w="960"/>
+                <w:sz w:val="15"/>
+              </w:rPr>
+              <w:t>Threshold (chosen on train OOF)</w:t>
+            </w:r>
+          </w:p>
+        </w:tc>
+        <w:tc>
+          <w:tcPr>
+            <w:tcW w:type="dxa" w:w="720"/>
           </w:tcPr>
           <w:p>
             <w:r>
               <w:rPr>
                 <w:b/>
-                <w:sz w:val="17"/>
-              </w:rPr>
-              <w:t>Recall</w:t>
-            </w:r>
-          </w:p>
-        </w:tc>
-        <w:tc>
-          <w:tcPr>
-            <w:tcW w:type="dxa" w:w="960"/>
+                <w:sz w:val="15"/>
+              </w:rPr>
+              <w:t>OOF recall</w:t>
+            </w:r>
+          </w:p>
+        </w:tc>
+        <w:tc>
+          <w:tcPr>
+            <w:tcW w:type="dxa" w:w="720"/>
           </w:tcPr>
           <w:p>
             <w:r>
               <w:rPr>
                 <w:b/>
-                <w:sz w:val="17"/>
-              </w:rPr>
-              <w:t>Precision</w:t>
-            </w:r>
-          </w:p>
-        </w:tc>
-        <w:tc>
-          <w:tcPr>
-            <w:tcW w:type="dxa" w:w="960"/>
+                <w:sz w:val="15"/>
+              </w:rPr>
+              <w:t>OOF precision</w:t>
+            </w:r>
+          </w:p>
+        </w:tc>
+        <w:tc>
+          <w:tcPr>
+            <w:tcW w:type="dxa" w:w="720"/>
           </w:tcPr>
           <w:p>
             <w:r>
               <w:rPr>
                 <w:b/>
-                <w:sz w:val="17"/>
-              </w:rPr>
-              <w:t>Specificity</w:t>
-            </w:r>
-          </w:p>
-        </w:tc>
-        <w:tc>
-          <w:tcPr>
-            <w:tcW w:type="dxa" w:w="960"/>
+                <w:sz w:val="15"/>
+              </w:rPr>
+              <w:t>OOF cost/1,000</w:t>
+            </w:r>
+          </w:p>
+        </w:tc>
+        <w:tc>
+          <w:tcPr>
+            <w:tcW w:type="dxa" w:w="720"/>
           </w:tcPr>
           <w:p>
             <w:r>
               <w:rPr>
                 <w:b/>
-                <w:sz w:val="17"/>
-              </w:rPr>
-              <w:t>F1</w:t>
-            </w:r>
-          </w:p>
-        </w:tc>
-        <w:tc>
-          <w:tcPr>
-            <w:tcW w:type="dxa" w:w="960"/>
+                <w:sz w:val="15"/>
+              </w:rPr>
+              <w:t>Hold-out recall</w:t>
+            </w:r>
+          </w:p>
+        </w:tc>
+        <w:tc>
+          <w:tcPr>
+            <w:tcW w:type="dxa" w:w="720"/>
           </w:tcPr>
           <w:p>
             <w:r>
               <w:rPr>
                 <w:b/>
-                <w:sz w:val="17"/>
-              </w:rPr>
-              <w:t>Flagged share</w:t>
-            </w:r>
-          </w:p>
-        </w:tc>
-        <w:tc>
-          <w:tcPr>
-            <w:tcW w:type="dxa" w:w="960"/>
+                <w:sz w:val="15"/>
+              </w:rPr>
+              <w:t>Hold-out precision</w:t>
+            </w:r>
+          </w:p>
+        </w:tc>
+        <w:tc>
+          <w:tcPr>
+            <w:tcW w:type="dxa" w:w="720"/>
           </w:tcPr>
           <w:p>
             <w:r>
               <w:rPr>
                 <w:b/>
-                <w:sz w:val="17"/>
-              </w:rPr>
-              <w:t>Cost / 1,000</w:t>
+                <w:sz w:val="15"/>
+              </w:rPr>
+              <w:t>Hold-out flagged</w:t>
+            </w:r>
+          </w:p>
+        </w:tc>
+        <w:tc>
+          <w:tcPr>
+            <w:tcW w:type="dxa" w:w="720"/>
+          </w:tcPr>
+          <w:p>
+            <w:r>
+              <w:rPr>
+                <w:b/>
+                <w:sz w:val="15"/>
+              </w:rPr>
+              <w:t>Hold-out cost/1,000</w:t>
+            </w:r>
+          </w:p>
+        </w:tc>
+        <w:tc>
+          <w:tcPr>
+            <w:tcW w:type="dxa" w:w="720"/>
+          </w:tcPr>
+          <w:p>
+            <w:r>
+              <w:rPr>
+                <w:b/>
+                <w:sz w:val="15"/>
+              </w:rPr>
+              <w:t>Hold-out oracle thr.</w:t>
+            </w:r>
+          </w:p>
+        </w:tc>
+        <w:tc>
+          <w:tcPr>
+            <w:tcW w:type="dxa" w:w="720"/>
+          </w:tcPr>
+          <w:p>
+            <w:r>
+              <w:rPr>
+                <w:b/>
+                <w:sz w:val="15"/>
+              </w:rPr>
+              <w:t>Oracle cost/1,000</w:t>
             </w:r>
           </w:p>
         </w:tc>
@@ -2384,12 +2429,12 @@
       <w:tr>
         <w:tc>
           <w:tcPr>
-            <w:tcW w:type="dxa" w:w="960"/>
-          </w:tcPr>
-          <w:p>
-            <w:r>
-              <w:rPr>
-                <w:sz w:val="17"/>
+            <w:tcW w:type="dxa" w:w="720"/>
+          </w:tcPr>
+          <w:p>
+            <w:r>
+              <w:rPr>
+                <w:sz w:val="15"/>
               </w:rPr>
               <w:t>Logistic regression</w:t>
             </w:r>
@@ -2397,12 +2442,12 @@
         </w:tc>
         <w:tc>
           <w:tcPr>
-            <w:tcW w:type="dxa" w:w="960"/>
-          </w:tcPr>
-          <w:p>
-            <w:r>
-              <w:rPr>
-                <w:sz w:val="17"/>
+            <w:tcW w:type="dxa" w:w="720"/>
+          </w:tcPr>
+          <w:p>
+            <w:r>
+              <w:rPr>
+                <w:sz w:val="15"/>
               </w:rPr>
               <w:t>1</w:t>
             </w:r>
@@ -2410,12 +2455,12 @@
         </w:tc>
         <w:tc>
           <w:tcPr>
-            <w:tcW w:type="dxa" w:w="960"/>
-          </w:tcPr>
-          <w:p>
-            <w:r>
-              <w:rPr>
-                <w:sz w:val="17"/>
+            <w:tcW w:type="dxa" w:w="720"/>
+          </w:tcPr>
+          <w:p>
+            <w:r>
+              <w:rPr>
+                <w:sz w:val="15"/>
               </w:rPr>
               <w:t>0.930</w:t>
             </w:r>
@@ -2423,12 +2468,12 @@
         </w:tc>
         <w:tc>
           <w:tcPr>
-            <w:tcW w:type="dxa" w:w="960"/>
-          </w:tcPr>
-          <w:p>
-            <w:r>
-              <w:rPr>
-                <w:sz w:val="17"/>
+            <w:tcW w:type="dxa" w:w="720"/>
+          </w:tcPr>
+          <w:p>
+            <w:r>
+              <w:rPr>
+                <w:sz w:val="15"/>
               </w:rPr>
               <w:t>0.000</w:t>
             </w:r>
@@ -2436,12 +2481,12 @@
         </w:tc>
         <w:tc>
           <w:tcPr>
-            <w:tcW w:type="dxa" w:w="960"/>
-          </w:tcPr>
-          <w:p>
-            <w:r>
-              <w:rPr>
-                <w:sz w:val="17"/>
+            <w:tcW w:type="dxa" w:w="720"/>
+          </w:tcPr>
+          <w:p>
+            <w:r>
+              <w:rPr>
+                <w:sz w:val="15"/>
               </w:rPr>
               <w:t>-</w:t>
             </w:r>
@@ -2449,25 +2494,25 @@
         </w:tc>
         <w:tc>
           <w:tcPr>
-            <w:tcW w:type="dxa" w:w="960"/>
-          </w:tcPr>
-          <w:p>
-            <w:r>
-              <w:rPr>
-                <w:sz w:val="17"/>
-              </w:rPr>
-              <w:t>1.000</w:t>
-            </w:r>
-          </w:p>
-        </w:tc>
-        <w:tc>
-          <w:tcPr>
-            <w:tcW w:type="dxa" w:w="960"/>
-          </w:tcPr>
-          <w:p>
-            <w:r>
-              <w:rPr>
-                <w:sz w:val="17"/>
+            <w:tcW w:type="dxa" w:w="720"/>
+          </w:tcPr>
+          <w:p>
+            <w:r>
+              <w:rPr>
+                <w:sz w:val="15"/>
+              </w:rPr>
+              <w:t>133.192</w:t>
+            </w:r>
+          </w:p>
+        </w:tc>
+        <w:tc>
+          <w:tcPr>
+            <w:tcW w:type="dxa" w:w="720"/>
+          </w:tcPr>
+          <w:p>
+            <w:r>
+              <w:rPr>
+                <w:sz w:val="15"/>
               </w:rPr>
               <w:t>0.000</w:t>
             </w:r>
@@ -2475,12 +2520,25 @@
         </w:tc>
         <w:tc>
           <w:tcPr>
-            <w:tcW w:type="dxa" w:w="960"/>
-          </w:tcPr>
-          <w:p>
-            <w:r>
-              <w:rPr>
-                <w:sz w:val="17"/>
+            <w:tcW w:type="dxa" w:w="720"/>
+          </w:tcPr>
+          <w:p>
+            <w:r>
+              <w:rPr>
+                <w:sz w:val="15"/>
+              </w:rPr>
+              <w:t>-</w:t>
+            </w:r>
+          </w:p>
+        </w:tc>
+        <w:tc>
+          <w:tcPr>
+            <w:tcW w:type="dxa" w:w="720"/>
+          </w:tcPr>
+          <w:p>
+            <w:r>
+              <w:rPr>
+                <w:sz w:val="15"/>
               </w:rPr>
               <w:t>0.000</w:t>
             </w:r>
@@ -2488,12 +2546,38 @@
         </w:tc>
         <w:tc>
           <w:tcPr>
-            <w:tcW w:type="dxa" w:w="960"/>
-          </w:tcPr>
-          <w:p>
-            <w:r>
-              <w:rPr>
-                <w:sz w:val="17"/>
+            <w:tcW w:type="dxa" w:w="720"/>
+          </w:tcPr>
+          <w:p>
+            <w:r>
+              <w:rPr>
+                <w:sz w:val="15"/>
+              </w:rPr>
+              <w:t>125.108</w:t>
+            </w:r>
+          </w:p>
+        </w:tc>
+        <w:tc>
+          <w:tcPr>
+            <w:tcW w:type="dxa" w:w="720"/>
+          </w:tcPr>
+          <w:p>
+            <w:r>
+              <w:rPr>
+                <w:sz w:val="15"/>
+              </w:rPr>
+              <w:t>0.930</w:t>
+            </w:r>
+          </w:p>
+        </w:tc>
+        <w:tc>
+          <w:tcPr>
+            <w:tcW w:type="dxa" w:w="720"/>
+          </w:tcPr>
+          <w:p>
+            <w:r>
+              <w:rPr>
+                <w:sz w:val="15"/>
               </w:rPr>
               <w:t>125.108</w:t>
             </w:r>
@@ -2503,12 +2587,12 @@
       <w:tr>
         <w:tc>
           <w:tcPr>
-            <w:tcW w:type="dxa" w:w="960"/>
-          </w:tcPr>
-          <w:p>
-            <w:r>
-              <w:rPr>
-                <w:sz w:val="17"/>
+            <w:tcW w:type="dxa" w:w="720"/>
+          </w:tcPr>
+          <w:p>
+            <w:r>
+              <w:rPr>
+                <w:sz w:val="15"/>
               </w:rPr>
               <w:t>Logistic regression</w:t>
             </w:r>
@@ -2516,12 +2600,12 @@
         </w:tc>
         <w:tc>
           <w:tcPr>
-            <w:tcW w:type="dxa" w:w="960"/>
-          </w:tcPr>
-          <w:p>
-            <w:r>
-              <w:rPr>
-                <w:sz w:val="17"/>
+            <w:tcW w:type="dxa" w:w="720"/>
+          </w:tcPr>
+          <w:p>
+            <w:r>
+              <w:rPr>
+                <w:sz w:val="15"/>
               </w:rPr>
               <w:t>3</w:t>
             </w:r>
@@ -2529,12 +2613,116 @@
         </w:tc>
         <w:tc>
           <w:tcPr>
-            <w:tcW w:type="dxa" w:w="960"/>
-          </w:tcPr>
-          <w:p>
-            <w:r>
-              <w:rPr>
-                <w:sz w:val="17"/>
+            <w:tcW w:type="dxa" w:w="720"/>
+          </w:tcPr>
+          <w:p>
+            <w:r>
+              <w:rPr>
+                <w:sz w:val="15"/>
+              </w:rPr>
+              <w:t>0.600</w:t>
+            </w:r>
+          </w:p>
+        </w:tc>
+        <w:tc>
+          <w:tcPr>
+            <w:tcW w:type="dxa" w:w="720"/>
+          </w:tcPr>
+          <w:p>
+            <w:r>
+              <w:rPr>
+                <w:sz w:val="15"/>
+              </w:rPr>
+              <w:t>0.531</w:t>
+            </w:r>
+          </w:p>
+        </w:tc>
+        <w:tc>
+          <w:tcPr>
+            <w:tcW w:type="dxa" w:w="720"/>
+          </w:tcPr>
+          <w:p>
+            <w:r>
+              <w:rPr>
+                <w:sz w:val="15"/>
+              </w:rPr>
+              <w:t>0.286</w:t>
+            </w:r>
+          </w:p>
+        </w:tc>
+        <w:tc>
+          <w:tcPr>
+            <w:tcW w:type="dxa" w:w="720"/>
+          </w:tcPr>
+          <w:p>
+            <w:r>
+              <w:rPr>
+                <w:sz w:val="15"/>
+              </w:rPr>
+              <w:t>363.896</w:t>
+            </w:r>
+          </w:p>
+        </w:tc>
+        <w:tc>
+          <w:tcPr>
+            <w:tcW w:type="dxa" w:w="720"/>
+          </w:tcPr>
+          <w:p>
+            <w:r>
+              <w:rPr>
+                <w:sz w:val="15"/>
+              </w:rPr>
+              <w:t>0.409</w:t>
+            </w:r>
+          </w:p>
+        </w:tc>
+        <w:tc>
+          <w:tcPr>
+            <w:tcW w:type="dxa" w:w="720"/>
+          </w:tcPr>
+          <w:p>
+            <w:r>
+              <w:rPr>
+                <w:sz w:val="15"/>
+              </w:rPr>
+              <w:t>0.200</w:t>
+            </w:r>
+          </w:p>
+        </w:tc>
+        <w:tc>
+          <w:tcPr>
+            <w:tcW w:type="dxa" w:w="720"/>
+          </w:tcPr>
+          <w:p>
+            <w:r>
+              <w:rPr>
+                <w:sz w:val="15"/>
+              </w:rPr>
+              <w:t>0.256</w:t>
+            </w:r>
+          </w:p>
+        </w:tc>
+        <w:tc>
+          <w:tcPr>
+            <w:tcW w:type="dxa" w:w="720"/>
+          </w:tcPr>
+          <w:p>
+            <w:r>
+              <w:rPr>
+                <w:sz w:val="15"/>
+              </w:rPr>
+              <w:t>426.313</w:t>
+            </w:r>
+          </w:p>
+        </w:tc>
+        <w:tc>
+          <w:tcPr>
+            <w:tcW w:type="dxa" w:w="720"/>
+          </w:tcPr>
+          <w:p>
+            <w:r>
+              <w:rPr>
+                <w:sz w:val="15"/>
               </w:rPr>
               <w:t>0.780</w:t>
             </w:r>
@@ -2542,77 +2730,12 @@
         </w:tc>
         <w:tc>
           <w:tcPr>
-            <w:tcW w:type="dxa" w:w="960"/>
-          </w:tcPr>
-          <w:p>
-            <w:r>
-              <w:rPr>
-                <w:sz w:val="17"/>
-              </w:rPr>
-              <w:t>0.123</w:t>
-            </w:r>
-          </w:p>
-        </w:tc>
-        <w:tc>
-          <w:tcPr>
-            <w:tcW w:type="dxa" w:w="960"/>
-          </w:tcPr>
-          <w:p>
-            <w:r>
-              <w:rPr>
-                <w:sz w:val="17"/>
-              </w:rPr>
-              <w:t>0.307</w:t>
-            </w:r>
-          </w:p>
-        </w:tc>
-        <w:tc>
-          <w:tcPr>
-            <w:tcW w:type="dxa" w:w="960"/>
-          </w:tcPr>
-          <w:p>
-            <w:r>
-              <w:rPr>
-                <w:sz w:val="17"/>
-              </w:rPr>
-              <w:t>0.960</w:t>
-            </w:r>
-          </w:p>
-        </w:tc>
-        <w:tc>
-          <w:tcPr>
-            <w:tcW w:type="dxa" w:w="960"/>
-          </w:tcPr>
-          <w:p>
-            <w:r>
-              <w:rPr>
-                <w:sz w:val="17"/>
-              </w:rPr>
-              <w:t>0.175</w:t>
-            </w:r>
-          </w:p>
-        </w:tc>
-        <w:tc>
-          <w:tcPr>
-            <w:tcW w:type="dxa" w:w="960"/>
-          </w:tcPr>
-          <w:p>
-            <w:r>
-              <w:rPr>
-                <w:sz w:val="17"/>
-              </w:rPr>
-              <w:t>0.050</w:t>
-            </w:r>
-          </w:p>
-        </w:tc>
-        <w:tc>
-          <w:tcPr>
-            <w:tcW w:type="dxa" w:w="960"/>
-          </w:tcPr>
-          <w:p>
-            <w:r>
-              <w:rPr>
-                <w:sz w:val="17"/>
+            <w:tcW w:type="dxa" w:w="720"/>
+          </w:tcPr>
+          <w:p>
+            <w:r>
+              <w:rPr>
+                <w:sz w:val="15"/>
               </w:rPr>
               <w:t>363.913</w:t>
             </w:r>
@@ -2622,12 +2745,12 @@
       <w:tr>
         <w:tc>
           <w:tcPr>
-            <w:tcW w:type="dxa" w:w="960"/>
-          </w:tcPr>
-          <w:p>
-            <w:r>
-              <w:rPr>
-                <w:sz w:val="17"/>
+            <w:tcW w:type="dxa" w:w="720"/>
+          </w:tcPr>
+          <w:p>
+            <w:r>
+              <w:rPr>
+                <w:sz w:val="15"/>
               </w:rPr>
               <w:t>Logistic regression</w:t>
             </w:r>
@@ -2635,12 +2758,12 @@
         </w:tc>
         <w:tc>
           <w:tcPr>
-            <w:tcW w:type="dxa" w:w="960"/>
-          </w:tcPr>
-          <w:p>
-            <w:r>
-              <w:rPr>
-                <w:sz w:val="17"/>
+            <w:tcW w:type="dxa" w:w="720"/>
+          </w:tcPr>
+          <w:p>
+            <w:r>
+              <w:rPr>
+                <w:sz w:val="15"/>
               </w:rPr>
               <w:t>5</w:t>
             </w:r>
@@ -2648,12 +2771,116 @@
         </w:tc>
         <w:tc>
           <w:tcPr>
-            <w:tcW w:type="dxa" w:w="960"/>
-          </w:tcPr>
-          <w:p>
-            <w:r>
-              <w:rPr>
-                <w:sz w:val="17"/>
+            <w:tcW w:type="dxa" w:w="720"/>
+          </w:tcPr>
+          <w:p>
+            <w:r>
+              <w:rPr>
+                <w:sz w:val="15"/>
+              </w:rPr>
+              <w:t>0.540</w:t>
+            </w:r>
+          </w:p>
+        </w:tc>
+        <w:tc>
+          <w:tcPr>
+            <w:tcW w:type="dxa" w:w="720"/>
+          </w:tcPr>
+          <w:p>
+            <w:r>
+              <w:rPr>
+                <w:sz w:val="15"/>
+              </w:rPr>
+              <w:t>0.642</w:t>
+            </w:r>
+          </w:p>
+        </w:tc>
+        <w:tc>
+          <w:tcPr>
+            <w:tcW w:type="dxa" w:w="720"/>
+          </w:tcPr>
+          <w:p>
+            <w:r>
+              <w:rPr>
+                <w:sz w:val="15"/>
+              </w:rPr>
+              <w:t>0.263</w:t>
+            </w:r>
+          </w:p>
+        </w:tc>
+        <w:tc>
+          <w:tcPr>
+            <w:tcW w:type="dxa" w:w="720"/>
+          </w:tcPr>
+          <w:p>
+            <w:r>
+              <w:rPr>
+                <w:sz w:val="15"/>
+              </w:rPr>
+              <w:t>477.875</w:t>
+            </w:r>
+          </w:p>
+        </w:tc>
+        <w:tc>
+          <w:tcPr>
+            <w:tcW w:type="dxa" w:w="720"/>
+          </w:tcPr>
+          <w:p>
+            <w:r>
+              <w:rPr>
+                <w:sz w:val="15"/>
+              </w:rPr>
+              <w:t>0.568</w:t>
+            </w:r>
+          </w:p>
+        </w:tc>
+        <w:tc>
+          <w:tcPr>
+            <w:tcW w:type="dxa" w:w="720"/>
+          </w:tcPr>
+          <w:p>
+            <w:r>
+              <w:rPr>
+                <w:sz w:val="15"/>
+              </w:rPr>
+              <w:t>0.201</w:t>
+            </w:r>
+          </w:p>
+        </w:tc>
+        <w:tc>
+          <w:tcPr>
+            <w:tcW w:type="dxa" w:w="720"/>
+          </w:tcPr>
+          <w:p>
+            <w:r>
+              <w:rPr>
+                <w:sz w:val="15"/>
+              </w:rPr>
+              <w:t>0.353</w:t>
+            </w:r>
+          </w:p>
+        </w:tc>
+        <w:tc>
+          <w:tcPr>
+            <w:tcW w:type="dxa" w:w="720"/>
+          </w:tcPr>
+          <w:p>
+            <w:r>
+              <w:rPr>
+                <w:sz w:val="15"/>
+              </w:rPr>
+              <w:t>552.282</w:t>
+            </w:r>
+          </w:p>
+        </w:tc>
+        <w:tc>
+          <w:tcPr>
+            <w:tcW w:type="dxa" w:w="720"/>
+          </w:tcPr>
+          <w:p>
+            <w:r>
+              <w:rPr>
+                <w:sz w:val="15"/>
               </w:rPr>
               <w:t>0.570</w:t>
             </w:r>
@@ -2661,77 +2888,12 @@
         </w:tc>
         <w:tc>
           <w:tcPr>
-            <w:tcW w:type="dxa" w:w="960"/>
-          </w:tcPr>
-          <w:p>
-            <w:r>
-              <w:rPr>
-                <w:sz w:val="17"/>
-              </w:rPr>
-              <w:t>0.515</w:t>
-            </w:r>
-          </w:p>
-        </w:tc>
-        <w:tc>
-          <w:tcPr>
-            <w:tcW w:type="dxa" w:w="960"/>
-          </w:tcPr>
-          <w:p>
-            <w:r>
-              <w:rPr>
-                <w:sz w:val="17"/>
-              </w:rPr>
-              <w:t>0.210</w:t>
-            </w:r>
-          </w:p>
-        </w:tc>
-        <w:tc>
-          <w:tcPr>
-            <w:tcW w:type="dxa" w:w="960"/>
-          </w:tcPr>
-          <w:p>
-            <w:r>
-              <w:rPr>
-                <w:sz w:val="17"/>
-              </w:rPr>
-              <w:t>0.723</w:t>
-            </w:r>
-          </w:p>
-        </w:tc>
-        <w:tc>
-          <w:tcPr>
-            <w:tcW w:type="dxa" w:w="960"/>
-          </w:tcPr>
-          <w:p>
-            <w:r>
-              <w:rPr>
-                <w:sz w:val="17"/>
-              </w:rPr>
-              <w:t>0.299</w:t>
-            </w:r>
-          </w:p>
-        </w:tc>
-        <w:tc>
-          <w:tcPr>
-            <w:tcW w:type="dxa" w:w="960"/>
-          </w:tcPr>
-          <w:p>
-            <w:r>
-              <w:rPr>
-                <w:sz w:val="17"/>
-              </w:rPr>
-              <w:t>0.307</w:t>
-            </w:r>
-          </w:p>
-        </w:tc>
-        <w:tc>
-          <w:tcPr>
-            <w:tcW w:type="dxa" w:w="960"/>
-          </w:tcPr>
-          <w:p>
-            <w:r>
-              <w:rPr>
-                <w:sz w:val="17"/>
+            <w:tcW w:type="dxa" w:w="720"/>
+          </w:tcPr>
+          <w:p>
+            <w:r>
+              <w:rPr>
+                <w:sz w:val="15"/>
               </w:rPr>
               <w:t>545.455</w:t>
             </w:r>
@@ -2741,12 +2903,12 @@
       <w:tr>
         <w:tc>
           <w:tcPr>
-            <w:tcW w:type="dxa" w:w="960"/>
-          </w:tcPr>
-          <w:p>
-            <w:r>
-              <w:rPr>
-                <w:sz w:val="17"/>
+            <w:tcW w:type="dxa" w:w="720"/>
+          </w:tcPr>
+          <w:p>
+            <w:r>
+              <w:rPr>
+                <w:sz w:val="15"/>
               </w:rPr>
               <w:t>Logistic regression</w:t>
             </w:r>
@@ -2754,12 +2916,12 @@
         </w:tc>
         <w:tc>
           <w:tcPr>
-            <w:tcW w:type="dxa" w:w="960"/>
-          </w:tcPr>
-          <w:p>
-            <w:r>
-              <w:rPr>
-                <w:sz w:val="17"/>
+            <w:tcW w:type="dxa" w:w="720"/>
+          </w:tcPr>
+          <w:p>
+            <w:r>
+              <w:rPr>
+                <w:sz w:val="15"/>
               </w:rPr>
               <w:t>10</w:t>
             </w:r>
@@ -2767,12 +2929,116 @@
         </w:tc>
         <w:tc>
           <w:tcPr>
-            <w:tcW w:type="dxa" w:w="960"/>
-          </w:tcPr>
-          <w:p>
-            <w:r>
-              <w:rPr>
-                <w:sz w:val="17"/>
+            <w:tcW w:type="dxa" w:w="720"/>
+          </w:tcPr>
+          <w:p>
+            <w:r>
+              <w:rPr>
+                <w:sz w:val="15"/>
+              </w:rPr>
+              <w:t>0.430</w:t>
+            </w:r>
+          </w:p>
+        </w:tc>
+        <w:tc>
+          <w:tcPr>
+            <w:tcW w:type="dxa" w:w="720"/>
+          </w:tcPr>
+          <w:p>
+            <w:r>
+              <w:rPr>
+                <w:sz w:val="15"/>
+              </w:rPr>
+              <w:t>0.792</w:t>
+            </w:r>
+          </w:p>
+        </w:tc>
+        <w:tc>
+          <w:tcPr>
+            <w:tcW w:type="dxa" w:w="720"/>
+          </w:tcPr>
+          <w:p>
+            <w:r>
+              <w:rPr>
+                <w:sz w:val="15"/>
+              </w:rPr>
+              <w:t>0.223</w:t>
+            </w:r>
+          </w:p>
+        </w:tc>
+        <w:tc>
+          <w:tcPr>
+            <w:tcW w:type="dxa" w:w="720"/>
+          </w:tcPr>
+          <w:p>
+            <w:r>
+              <w:rPr>
+                <w:sz w:val="15"/>
+              </w:rPr>
+              <w:t>644.334</w:t>
+            </w:r>
+          </w:p>
+        </w:tc>
+        <w:tc>
+          <w:tcPr>
+            <w:tcW w:type="dxa" w:w="720"/>
+          </w:tcPr>
+          <w:p>
+            <w:r>
+              <w:rPr>
+                <w:sz w:val="15"/>
+              </w:rPr>
+              <w:t>0.748</w:t>
+            </w:r>
+          </w:p>
+        </w:tc>
+        <w:tc>
+          <w:tcPr>
+            <w:tcW w:type="dxa" w:w="720"/>
+          </w:tcPr>
+          <w:p>
+            <w:r>
+              <w:rPr>
+                <w:sz w:val="15"/>
+              </w:rPr>
+              <w:t>0.181</w:t>
+            </w:r>
+          </w:p>
+        </w:tc>
+        <w:tc>
+          <w:tcPr>
+            <w:tcW w:type="dxa" w:w="720"/>
+          </w:tcPr>
+          <w:p>
+            <w:r>
+              <w:rPr>
+                <w:sz w:val="15"/>
+              </w:rPr>
+              <w:t>0.517</w:t>
+            </w:r>
+          </w:p>
+        </w:tc>
+        <w:tc>
+          <w:tcPr>
+            <w:tcW w:type="dxa" w:w="720"/>
+          </w:tcPr>
+          <w:p>
+            <w:r>
+              <w:rPr>
+                <w:sz w:val="15"/>
+              </w:rPr>
+              <w:t>738.990</w:t>
+            </w:r>
+          </w:p>
+        </w:tc>
+        <w:tc>
+          <w:tcPr>
+            <w:tcW w:type="dxa" w:w="720"/>
+          </w:tcPr>
+          <w:p>
+            <w:r>
+              <w:rPr>
+                <w:sz w:val="15"/>
               </w:rPr>
               <w:t>0.410</w:t>
             </w:r>
@@ -2780,77 +3046,12 @@
         </w:tc>
         <w:tc>
           <w:tcPr>
-            <w:tcW w:type="dxa" w:w="960"/>
-          </w:tcPr>
-          <w:p>
-            <w:r>
-              <w:rPr>
-                <w:sz w:val="17"/>
-              </w:rPr>
-              <w:t>0.777</w:t>
-            </w:r>
-          </w:p>
-        </w:tc>
-        <w:tc>
-          <w:tcPr>
-            <w:tcW w:type="dxa" w:w="960"/>
-          </w:tcPr>
-          <w:p>
-            <w:r>
-              <w:rPr>
-                <w:sz w:val="17"/>
-              </w:rPr>
-              <w:t>0.177</w:t>
-            </w:r>
-          </w:p>
-        </w:tc>
-        <w:tc>
-          <w:tcPr>
-            <w:tcW w:type="dxa" w:w="960"/>
-          </w:tcPr>
-          <w:p>
-            <w:r>
-              <w:rPr>
-                <w:sz w:val="17"/>
-              </w:rPr>
-              <w:t>0.483</w:t>
-            </w:r>
-          </w:p>
-        </w:tc>
-        <w:tc>
-          <w:tcPr>
-            <w:tcW w:type="dxa" w:w="960"/>
-          </w:tcPr>
-          <w:p>
-            <w:r>
-              <w:rPr>
-                <w:sz w:val="17"/>
-              </w:rPr>
-              <w:t>0.288</w:t>
-            </w:r>
-          </w:p>
-        </w:tc>
-        <w:tc>
-          <w:tcPr>
-            <w:tcW w:type="dxa" w:w="960"/>
-          </w:tcPr>
-          <w:p>
-            <w:r>
-              <w:rPr>
-                <w:sz w:val="17"/>
-              </w:rPr>
-              <w:t>0.549</w:t>
-            </w:r>
-          </w:p>
-        </w:tc>
-        <w:tc>
-          <w:tcPr>
-            <w:tcW w:type="dxa" w:w="960"/>
-          </w:tcPr>
-          <w:p>
-            <w:r>
-              <w:rPr>
-                <w:sz w:val="17"/>
+            <w:tcW w:type="dxa" w:w="720"/>
+          </w:tcPr>
+          <w:p>
+            <w:r>
+              <w:rPr>
+                <w:sz w:val="15"/>
               </w:rPr>
               <w:t>731.486</w:t>
             </w:r>
@@ -2860,12 +3061,12 @@
       <w:tr>
         <w:tc>
           <w:tcPr>
-            <w:tcW w:type="dxa" w:w="960"/>
-          </w:tcPr>
-          <w:p>
-            <w:r>
-              <w:rPr>
-                <w:sz w:val="17"/>
+            <w:tcW w:type="dxa" w:w="720"/>
+          </w:tcPr>
+          <w:p>
+            <w:r>
+              <w:rPr>
+                <w:sz w:val="15"/>
               </w:rPr>
               <w:t>Decision tree</w:t>
             </w:r>
@@ -2873,12 +3074,12 @@
         </w:tc>
         <w:tc>
           <w:tcPr>
-            <w:tcW w:type="dxa" w:w="960"/>
-          </w:tcPr>
-          <w:p>
-            <w:r>
-              <w:rPr>
-                <w:sz w:val="17"/>
+            <w:tcW w:type="dxa" w:w="720"/>
+          </w:tcPr>
+          <w:p>
+            <w:r>
+              <w:rPr>
+                <w:sz w:val="15"/>
               </w:rPr>
               <w:t>1</w:t>
             </w:r>
@@ -2886,12 +3087,116 @@
         </w:tc>
         <w:tc>
           <w:tcPr>
-            <w:tcW w:type="dxa" w:w="960"/>
-          </w:tcPr>
-          <w:p>
-            <w:r>
-              <w:rPr>
-                <w:sz w:val="17"/>
+            <w:tcW w:type="dxa" w:w="720"/>
+          </w:tcPr>
+          <w:p>
+            <w:r>
+              <w:rPr>
+                <w:sz w:val="15"/>
+              </w:rPr>
+              <w:t>0.940</w:t>
+            </w:r>
+          </w:p>
+        </w:tc>
+        <w:tc>
+          <w:tcPr>
+            <w:tcW w:type="dxa" w:w="720"/>
+          </w:tcPr>
+          <w:p>
+            <w:r>
+              <w:rPr>
+                <w:sz w:val="15"/>
+              </w:rPr>
+              <w:t>0.000</w:t>
+            </w:r>
+          </w:p>
+        </w:tc>
+        <w:tc>
+          <w:tcPr>
+            <w:tcW w:type="dxa" w:w="720"/>
+          </w:tcPr>
+          <w:p>
+            <w:r>
+              <w:rPr>
+                <w:sz w:val="15"/>
+              </w:rPr>
+              <w:t>0.091</w:t>
+            </w:r>
+          </w:p>
+        </w:tc>
+        <w:tc>
+          <w:tcPr>
+            <w:tcW w:type="dxa" w:w="720"/>
+          </w:tcPr>
+          <w:p>
+            <w:r>
+              <w:rPr>
+                <w:sz w:val="15"/>
+              </w:rPr>
+              <w:t>133.262</w:t>
+            </w:r>
+          </w:p>
+        </w:tc>
+        <w:tc>
+          <w:tcPr>
+            <w:tcW w:type="dxa" w:w="720"/>
+          </w:tcPr>
+          <w:p>
+            <w:r>
+              <w:rPr>
+                <w:sz w:val="15"/>
+              </w:rPr>
+              <w:t>0.000</w:t>
+            </w:r>
+          </w:p>
+        </w:tc>
+        <w:tc>
+          <w:tcPr>
+            <w:tcW w:type="dxa" w:w="720"/>
+          </w:tcPr>
+          <w:p>
+            <w:r>
+              <w:rPr>
+                <w:sz w:val="15"/>
+              </w:rPr>
+              <w:t>-</w:t>
+            </w:r>
+          </w:p>
+        </w:tc>
+        <w:tc>
+          <w:tcPr>
+            <w:tcW w:type="dxa" w:w="720"/>
+          </w:tcPr>
+          <w:p>
+            <w:r>
+              <w:rPr>
+                <w:sz w:val="15"/>
+              </w:rPr>
+              <w:t>0.000</w:t>
+            </w:r>
+          </w:p>
+        </w:tc>
+        <w:tc>
+          <w:tcPr>
+            <w:tcW w:type="dxa" w:w="720"/>
+          </w:tcPr>
+          <w:p>
+            <w:r>
+              <w:rPr>
+                <w:sz w:val="15"/>
+              </w:rPr>
+              <w:t>125.108</w:t>
+            </w:r>
+          </w:p>
+        </w:tc>
+        <w:tc>
+          <w:tcPr>
+            <w:tcW w:type="dxa" w:w="720"/>
+          </w:tcPr>
+          <w:p>
+            <w:r>
+              <w:rPr>
+                <w:sz w:val="15"/>
               </w:rPr>
               <w:t>0.890</w:t>
             </w:r>
@@ -2899,77 +3204,12 @@
         </w:tc>
         <w:tc>
           <w:tcPr>
-            <w:tcW w:type="dxa" w:w="960"/>
-          </w:tcPr>
-          <w:p>
-            <w:r>
-              <w:rPr>
-                <w:sz w:val="17"/>
-              </w:rPr>
-              <w:t>0.002</w:t>
-            </w:r>
-          </w:p>
-        </w:tc>
-        <w:tc>
-          <w:tcPr>
-            <w:tcW w:type="dxa" w:w="960"/>
-          </w:tcPr>
-          <w:p>
-            <w:r>
-              <w:rPr>
-                <w:sz w:val="17"/>
-              </w:rPr>
-              <w:t>0.500</w:t>
-            </w:r>
-          </w:p>
-        </w:tc>
-        <w:tc>
-          <w:tcPr>
-            <w:tcW w:type="dxa" w:w="960"/>
-          </w:tcPr>
-          <w:p>
-            <w:r>
-              <w:rPr>
-                <w:sz w:val="17"/>
-              </w:rPr>
-              <w:t>1.000</w:t>
-            </w:r>
-          </w:p>
-        </w:tc>
-        <w:tc>
-          <w:tcPr>
-            <w:tcW w:type="dxa" w:w="960"/>
-          </w:tcPr>
-          <w:p>
-            <w:r>
-              <w:rPr>
-                <w:sz w:val="17"/>
-              </w:rPr>
-              <w:t>0.005</w:t>
-            </w:r>
-          </w:p>
-        </w:tc>
-        <w:tc>
-          <w:tcPr>
-            <w:tcW w:type="dxa" w:w="960"/>
-          </w:tcPr>
-          <w:p>
-            <w:r>
-              <w:rPr>
-                <w:sz w:val="17"/>
-              </w:rPr>
-              <w:t>0.001</w:t>
-            </w:r>
-          </w:p>
-        </w:tc>
-        <w:tc>
-          <w:tcPr>
-            <w:tcW w:type="dxa" w:w="960"/>
-          </w:tcPr>
-          <w:p>
-            <w:r>
-              <w:rPr>
-                <w:sz w:val="17"/>
+            <w:tcW w:type="dxa" w:w="720"/>
+          </w:tcPr>
+          <w:p>
+            <w:r>
+              <w:rPr>
+                <w:sz w:val="15"/>
               </w:rPr>
               <w:t>125.108</w:t>
             </w:r>
@@ -2979,12 +3219,12 @@
       <w:tr>
         <w:tc>
           <w:tcPr>
-            <w:tcW w:type="dxa" w:w="960"/>
-          </w:tcPr>
-          <w:p>
-            <w:r>
-              <w:rPr>
-                <w:sz w:val="17"/>
+            <w:tcW w:type="dxa" w:w="720"/>
+          </w:tcPr>
+          <w:p>
+            <w:r>
+              <w:rPr>
+                <w:sz w:val="15"/>
               </w:rPr>
               <w:t>Decision tree</w:t>
             </w:r>
@@ -2992,12 +3232,12 @@
         </w:tc>
         <w:tc>
           <w:tcPr>
-            <w:tcW w:type="dxa" w:w="960"/>
-          </w:tcPr>
-          <w:p>
-            <w:r>
-              <w:rPr>
-                <w:sz w:val="17"/>
+            <w:tcW w:type="dxa" w:w="720"/>
+          </w:tcPr>
+          <w:p>
+            <w:r>
+              <w:rPr>
+                <w:sz w:val="15"/>
               </w:rPr>
               <w:t>3</w:t>
             </w:r>
@@ -3005,12 +3245,116 @@
         </w:tc>
         <w:tc>
           <w:tcPr>
-            <w:tcW w:type="dxa" w:w="960"/>
-          </w:tcPr>
-          <w:p>
-            <w:r>
-              <w:rPr>
-                <w:sz w:val="17"/>
+            <w:tcW w:type="dxa" w:w="720"/>
+          </w:tcPr>
+          <w:p>
+            <w:r>
+              <w:rPr>
+                <w:sz w:val="15"/>
+              </w:rPr>
+              <w:t>0.280</w:t>
+            </w:r>
+          </w:p>
+        </w:tc>
+        <w:tc>
+          <w:tcPr>
+            <w:tcW w:type="dxa" w:w="720"/>
+          </w:tcPr>
+          <w:p>
+            <w:r>
+              <w:rPr>
+                <w:sz w:val="15"/>
+              </w:rPr>
+              <w:t>0.327</w:t>
+            </w:r>
+          </w:p>
+        </w:tc>
+        <w:tc>
+          <w:tcPr>
+            <w:tcW w:type="dxa" w:w="720"/>
+          </w:tcPr>
+          <w:p>
+            <w:r>
+              <w:rPr>
+                <w:sz w:val="15"/>
+              </w:rPr>
+              <w:t>0.341</w:t>
+            </w:r>
+          </w:p>
+        </w:tc>
+        <w:tc>
+          <w:tcPr>
+            <w:tcW w:type="dxa" w:w="720"/>
+          </w:tcPr>
+          <w:p>
+            <w:r>
+              <w:rPr>
+                <w:sz w:val="15"/>
+              </w:rPr>
+              <w:t>352.936</w:t>
+            </w:r>
+          </w:p>
+        </w:tc>
+        <w:tc>
+          <w:tcPr>
+            <w:tcW w:type="dxa" w:w="720"/>
+          </w:tcPr>
+          <w:p>
+            <w:r>
+              <w:rPr>
+                <w:sz w:val="15"/>
+              </w:rPr>
+              <w:t>0.289</w:t>
+            </w:r>
+          </w:p>
+        </w:tc>
+        <w:tc>
+          <w:tcPr>
+            <w:tcW w:type="dxa" w:w="720"/>
+          </w:tcPr>
+          <w:p>
+            <w:r>
+              <w:rPr>
+                <w:sz w:val="15"/>
+              </w:rPr>
+              <w:t>0.266</w:t>
+            </w:r>
+          </w:p>
+        </w:tc>
+        <w:tc>
+          <w:tcPr>
+            <w:tcW w:type="dxa" w:w="720"/>
+          </w:tcPr>
+          <w:p>
+            <w:r>
+              <w:rPr>
+                <w:sz w:val="15"/>
+              </w:rPr>
+              <w:t>0.136</w:t>
+            </w:r>
+          </w:p>
+        </w:tc>
+        <w:tc>
+          <w:tcPr>
+            <w:tcW w:type="dxa" w:w="720"/>
+          </w:tcPr>
+          <w:p>
+            <w:r>
+              <w:rPr>
+                <w:sz w:val="15"/>
+              </w:rPr>
+              <w:t>366.558</w:t>
+            </w:r>
+          </w:p>
+        </w:tc>
+        <w:tc>
+          <w:tcPr>
+            <w:tcW w:type="dxa" w:w="720"/>
+          </w:tcPr>
+          <w:p>
+            <w:r>
+              <w:rPr>
+                <w:sz w:val="15"/>
               </w:rPr>
               <w:t>0.300</w:t>
             </w:r>
@@ -3018,77 +3362,12 @@
         </w:tc>
         <w:tc>
           <w:tcPr>
-            <w:tcW w:type="dxa" w:w="960"/>
-          </w:tcPr>
-          <w:p>
-            <w:r>
-              <w:rPr>
-                <w:sz w:val="17"/>
-              </w:rPr>
-              <w:t>0.272</w:t>
-            </w:r>
-          </w:p>
-        </w:tc>
-        <w:tc>
-          <w:tcPr>
-            <w:tcW w:type="dxa" w:w="960"/>
-          </w:tcPr>
-          <w:p>
-            <w:r>
-              <w:rPr>
-                <w:sz w:val="17"/>
-              </w:rPr>
-              <w:t>0.270</w:t>
-            </w:r>
-          </w:p>
-        </w:tc>
-        <w:tc>
-          <w:tcPr>
-            <w:tcW w:type="dxa" w:w="960"/>
-          </w:tcPr>
-          <w:p>
-            <w:r>
-              <w:rPr>
-                <w:sz w:val="17"/>
-              </w:rPr>
-              <w:t>0.895</w:t>
-            </w:r>
-          </w:p>
-        </w:tc>
-        <w:tc>
-          <w:tcPr>
-            <w:tcW w:type="dxa" w:w="960"/>
-          </w:tcPr>
-          <w:p>
-            <w:r>
-              <w:rPr>
-                <w:sz w:val="17"/>
-              </w:rPr>
-              <w:t>0.271</w:t>
-            </w:r>
-          </w:p>
-        </w:tc>
-        <w:tc>
-          <w:tcPr>
-            <w:tcW w:type="dxa" w:w="960"/>
-          </w:tcPr>
-          <w:p>
-            <w:r>
-              <w:rPr>
-                <w:sz w:val="17"/>
-              </w:rPr>
-              <w:t>0.126</w:t>
-            </w:r>
-          </w:p>
-        </w:tc>
-        <w:tc>
-          <w:tcPr>
-            <w:tcW w:type="dxa" w:w="960"/>
-          </w:tcPr>
-          <w:p>
-            <w:r>
-              <w:rPr>
-                <w:sz w:val="17"/>
+            <w:tcW w:type="dxa" w:w="720"/>
+          </w:tcPr>
+          <w:p>
+            <w:r>
+              <w:rPr>
+                <w:sz w:val="15"/>
               </w:rPr>
               <w:t>365.113</w:t>
             </w:r>
@@ -3098,12 +3377,12 @@
       <w:tr>
         <w:tc>
           <w:tcPr>
-            <w:tcW w:type="dxa" w:w="960"/>
-          </w:tcPr>
-          <w:p>
-            <w:r>
-              <w:rPr>
-                <w:sz w:val="17"/>
+            <w:tcW w:type="dxa" w:w="720"/>
+          </w:tcPr>
+          <w:p>
+            <w:r>
+              <w:rPr>
+                <w:sz w:val="15"/>
               </w:rPr>
               <w:t>Decision tree</w:t>
             </w:r>
@@ -3111,12 +3390,12 @@
         </w:tc>
         <w:tc>
           <w:tcPr>
-            <w:tcW w:type="dxa" w:w="960"/>
-          </w:tcPr>
-          <w:p>
-            <w:r>
-              <w:rPr>
-                <w:sz w:val="17"/>
+            <w:tcW w:type="dxa" w:w="720"/>
+          </w:tcPr>
+          <w:p>
+            <w:r>
+              <w:rPr>
+                <w:sz w:val="15"/>
               </w:rPr>
               <w:t>5</w:t>
             </w:r>
@@ -3124,12 +3403,12 @@
         </w:tc>
         <w:tc>
           <w:tcPr>
-            <w:tcW w:type="dxa" w:w="960"/>
-          </w:tcPr>
-          <w:p>
-            <w:r>
-              <w:rPr>
-                <w:sz w:val="17"/>
+            <w:tcW w:type="dxa" w:w="720"/>
+          </w:tcPr>
+          <w:p>
+            <w:r>
+              <w:rPr>
+                <w:sz w:val="15"/>
               </w:rPr>
               <w:t>0.160</w:t>
             </w:r>
@@ -3137,12 +3416,51 @@
         </w:tc>
         <w:tc>
           <w:tcPr>
-            <w:tcW w:type="dxa" w:w="960"/>
-          </w:tcPr>
-          <w:p>
-            <w:r>
-              <w:rPr>
-                <w:sz w:val="17"/>
+            <w:tcW w:type="dxa" w:w="720"/>
+          </w:tcPr>
+          <w:p>
+            <w:r>
+              <w:rPr>
+                <w:sz w:val="15"/>
+              </w:rPr>
+              <w:t>0.628</w:t>
+            </w:r>
+          </w:p>
+        </w:tc>
+        <w:tc>
+          <w:tcPr>
+            <w:tcW w:type="dxa" w:w="720"/>
+          </w:tcPr>
+          <w:p>
+            <w:r>
+              <w:rPr>
+                <w:sz w:val="15"/>
+              </w:rPr>
+              <w:t>0.276</w:t>
+            </w:r>
+          </w:p>
+        </w:tc>
+        <w:tc>
+          <w:tcPr>
+            <w:tcW w:type="dxa" w:w="720"/>
+          </w:tcPr>
+          <w:p>
+            <w:r>
+              <w:rPr>
+                <w:sz w:val="15"/>
+              </w:rPr>
+              <w:t>466.984</w:t>
+            </w:r>
+          </w:p>
+        </w:tc>
+        <w:tc>
+          <w:tcPr>
+            <w:tcW w:type="dxa" w:w="720"/>
+          </w:tcPr>
+          <w:p>
+            <w:r>
+              <w:rPr>
+                <w:sz w:val="15"/>
               </w:rPr>
               <w:t>0.621</w:t>
             </w:r>
@@ -3150,12 +3468,12 @@
         </w:tc>
         <w:tc>
           <w:tcPr>
-            <w:tcW w:type="dxa" w:w="960"/>
-          </w:tcPr>
-          <w:p>
-            <w:r>
-              <w:rPr>
-                <w:sz w:val="17"/>
+            <w:tcW w:type="dxa" w:w="720"/>
+          </w:tcPr>
+          <w:p>
+            <w:r>
+              <w:rPr>
+                <w:sz w:val="15"/>
               </w:rPr>
               <w:t>0.237</w:t>
             </w:r>
@@ -3163,38 +3481,12 @@
         </w:tc>
         <w:tc>
           <w:tcPr>
-            <w:tcW w:type="dxa" w:w="960"/>
-          </w:tcPr>
-          <w:p>
-            <w:r>
-              <w:rPr>
-                <w:sz w:val="17"/>
-              </w:rPr>
-              <w:t>0.714</w:t>
-            </w:r>
-          </w:p>
-        </w:tc>
-        <w:tc>
-          <w:tcPr>
-            <w:tcW w:type="dxa" w:w="960"/>
-          </w:tcPr>
-          <w:p>
-            <w:r>
-              <w:rPr>
-                <w:sz w:val="17"/>
-              </w:rPr>
-              <w:t>0.343</w:t>
-            </w:r>
-          </w:p>
-        </w:tc>
-        <w:tc>
-          <w:tcPr>
-            <w:tcW w:type="dxa" w:w="960"/>
-          </w:tcPr>
-          <w:p>
-            <w:r>
-              <w:rPr>
-                <w:sz w:val="17"/>
+            <w:tcW w:type="dxa" w:w="720"/>
+          </w:tcPr>
+          <w:p>
+            <w:r>
+              <w:rPr>
+                <w:sz w:val="15"/>
               </w:rPr>
               <w:t>0.328</w:t>
             </w:r>
@@ -3202,12 +3494,38 @@
         </w:tc>
         <w:tc>
           <w:tcPr>
-            <w:tcW w:type="dxa" w:w="960"/>
-          </w:tcPr>
-          <w:p>
-            <w:r>
-              <w:rPr>
-                <w:sz w:val="17"/>
+            <w:tcW w:type="dxa" w:w="720"/>
+          </w:tcPr>
+          <w:p>
+            <w:r>
+              <w:rPr>
+                <w:sz w:val="15"/>
+              </w:rPr>
+              <w:t>487.329</w:t>
+            </w:r>
+          </w:p>
+        </w:tc>
+        <w:tc>
+          <w:tcPr>
+            <w:tcW w:type="dxa" w:w="720"/>
+          </w:tcPr>
+          <w:p>
+            <w:r>
+              <w:rPr>
+                <w:sz w:val="15"/>
+              </w:rPr>
+              <w:t>0.160</w:t>
+            </w:r>
+          </w:p>
+        </w:tc>
+        <w:tc>
+          <w:tcPr>
+            <w:tcW w:type="dxa" w:w="720"/>
+          </w:tcPr>
+          <w:p>
+            <w:r>
+              <w:rPr>
+                <w:sz w:val="15"/>
               </w:rPr>
               <w:t>487.329</w:t>
             </w:r>
@@ -3217,12 +3535,12 @@
       <w:tr>
         <w:tc>
           <w:tcPr>
-            <w:tcW w:type="dxa" w:w="960"/>
-          </w:tcPr>
-          <w:p>
-            <w:r>
-              <w:rPr>
-                <w:sz w:val="17"/>
+            <w:tcW w:type="dxa" w:w="720"/>
+          </w:tcPr>
+          <w:p>
+            <w:r>
+              <w:rPr>
+                <w:sz w:val="15"/>
               </w:rPr>
               <w:t>Decision tree</w:t>
             </w:r>
@@ -3230,12 +3548,12 @@
         </w:tc>
         <w:tc>
           <w:tcPr>
-            <w:tcW w:type="dxa" w:w="960"/>
-          </w:tcPr>
-          <w:p>
-            <w:r>
-              <w:rPr>
-                <w:sz w:val="17"/>
+            <w:tcW w:type="dxa" w:w="720"/>
+          </w:tcPr>
+          <w:p>
+            <w:r>
+              <w:rPr>
+                <w:sz w:val="15"/>
               </w:rPr>
               <w:t>10</w:t>
             </w:r>
@@ -3243,12 +3561,116 @@
         </w:tc>
         <w:tc>
           <w:tcPr>
-            <w:tcW w:type="dxa" w:w="960"/>
-          </w:tcPr>
-          <w:p>
-            <w:r>
-              <w:rPr>
-                <w:sz w:val="17"/>
+            <w:tcW w:type="dxa" w:w="720"/>
+          </w:tcPr>
+          <w:p>
+            <w:r>
+              <w:rPr>
+                <w:sz w:val="15"/>
+              </w:rPr>
+              <w:t>0.070</w:t>
+            </w:r>
+          </w:p>
+        </w:tc>
+        <w:tc>
+          <w:tcPr>
+            <w:tcW w:type="dxa" w:w="720"/>
+          </w:tcPr>
+          <w:p>
+            <w:r>
+              <w:rPr>
+                <w:sz w:val="15"/>
+              </w:rPr>
+              <w:t>0.834</w:t>
+            </w:r>
+          </w:p>
+        </w:tc>
+        <w:tc>
+          <w:tcPr>
+            <w:tcW w:type="dxa" w:w="720"/>
+          </w:tcPr>
+          <w:p>
+            <w:r>
+              <w:rPr>
+                <w:sz w:val="15"/>
+              </w:rPr>
+              <w:t>0.213</w:t>
+            </w:r>
+          </w:p>
+        </w:tc>
+        <w:tc>
+          <w:tcPr>
+            <w:tcW w:type="dxa" w:w="720"/>
+          </w:tcPr>
+          <w:p>
+            <w:r>
+              <w:rPr>
+                <w:sz w:val="15"/>
+              </w:rPr>
+              <w:t>631.881</w:t>
+            </w:r>
+          </w:p>
+        </w:tc>
+        <w:tc>
+          <w:tcPr>
+            <w:tcW w:type="dxa" w:w="720"/>
+          </w:tcPr>
+          <w:p>
+            <w:r>
+              <w:rPr>
+                <w:sz w:val="15"/>
+              </w:rPr>
+              <w:t>0.828</w:t>
+            </w:r>
+          </w:p>
+        </w:tc>
+        <w:tc>
+          <w:tcPr>
+            <w:tcW w:type="dxa" w:w="720"/>
+          </w:tcPr>
+          <w:p>
+            <w:r>
+              <w:rPr>
+                <w:sz w:val="15"/>
+              </w:rPr>
+              <w:t>0.184</w:t>
+            </w:r>
+          </w:p>
+        </w:tc>
+        <w:tc>
+          <w:tcPr>
+            <w:tcW w:type="dxa" w:w="720"/>
+          </w:tcPr>
+          <w:p>
+            <w:r>
+              <w:rPr>
+                <w:sz w:val="15"/>
+              </w:rPr>
+              <w:t>0.562</w:t>
+            </w:r>
+          </w:p>
+        </w:tc>
+        <w:tc>
+          <w:tcPr>
+            <w:tcW w:type="dxa" w:w="720"/>
+          </w:tcPr>
+          <w:p>
+            <w:r>
+              <w:rPr>
+                <w:sz w:val="15"/>
+              </w:rPr>
+              <w:t>673.545</w:t>
+            </w:r>
+          </w:p>
+        </w:tc>
+        <w:tc>
+          <w:tcPr>
+            <w:tcW w:type="dxa" w:w="720"/>
+          </w:tcPr>
+          <w:p>
+            <w:r>
+              <w:rPr>
+                <w:sz w:val="15"/>
               </w:rPr>
               <w:t>0.090</w:t>
             </w:r>
@@ -3256,77 +3678,12 @@
         </w:tc>
         <w:tc>
           <w:tcPr>
-            <w:tcW w:type="dxa" w:w="960"/>
-          </w:tcPr>
-          <w:p>
-            <w:r>
-              <w:rPr>
-                <w:sz w:val="17"/>
-              </w:rPr>
-              <w:t>0.790</w:t>
-            </w:r>
-          </w:p>
-        </w:tc>
-        <w:tc>
-          <w:tcPr>
-            <w:tcW w:type="dxa" w:w="960"/>
-          </w:tcPr>
-          <w:p>
-            <w:r>
-              <w:rPr>
-                <w:sz w:val="17"/>
-              </w:rPr>
-              <w:t>0.195</w:t>
-            </w:r>
-          </w:p>
-        </w:tc>
-        <w:tc>
-          <w:tcPr>
-            <w:tcW w:type="dxa" w:w="960"/>
-          </w:tcPr>
-          <w:p>
-            <w:r>
-              <w:rPr>
-                <w:sz w:val="17"/>
-              </w:rPr>
-              <w:t>0.535</w:t>
-            </w:r>
-          </w:p>
-        </w:tc>
-        <w:tc>
-          <w:tcPr>
-            <w:tcW w:type="dxa" w:w="960"/>
-          </w:tcPr>
-          <w:p>
-            <w:r>
-              <w:rPr>
-                <w:sz w:val="17"/>
-              </w:rPr>
-              <w:t>0.313</w:t>
-            </w:r>
-          </w:p>
-        </w:tc>
-        <w:tc>
-          <w:tcPr>
-            <w:tcW w:type="dxa" w:w="960"/>
-          </w:tcPr>
-          <w:p>
-            <w:r>
-              <w:rPr>
-                <w:sz w:val="17"/>
-              </w:rPr>
-              <w:t>0.506</w:t>
-            </w:r>
-          </w:p>
-        </w:tc>
-        <w:tc>
-          <w:tcPr>
-            <w:tcW w:type="dxa" w:w="960"/>
-          </w:tcPr>
-          <w:p>
-            <w:r>
-              <w:rPr>
-                <w:sz w:val="17"/>
+            <w:tcW w:type="dxa" w:w="720"/>
+          </w:tcPr>
+          <w:p>
+            <w:r>
+              <w:rPr>
+                <w:sz w:val="15"/>
               </w:rPr>
               <w:t>669.855</w:t>
             </w:r>
@@ -3383,7 +3740,7 @@
           <w:i/>
           <w:sz w:val="18"/>
         </w:rPr>
-        <w:t>Figure 4. Recall/precision and expected cost versus threshold (cost ratio 5:1).</w:t>
+        <w:t>Figure 4. Recall/precision and expected cost versus threshold (cost ratio 5:1). Solid curves are training out-of-fold predictions (used for selection); dashed curves are the hold-out (reported only); dash-dot lines mark the chosen thresholds.</w:t>
       </w:r>
     </w:p>
     <w:p>
@@ -4019,7 +4376,7 @@
               <w:rPr>
                 <w:sz w:val="16"/>
               </w:rPr>
-              <w:t>0.570</w:t>
+              <w:t>0.540</w:t>
             </w:r>
           </w:p>
         </w:tc>
@@ -4032,7 +4389,7 @@
               <w:rPr>
                 <w:sz w:val="16"/>
               </w:rPr>
-              <w:t>2,096</w:t>
+              <w:t>2,310</w:t>
             </w:r>
           </w:p>
         </w:tc>
@@ -4045,7 +4402,7 @@
               <w:rPr>
                 <w:sz w:val="16"/>
               </w:rPr>
-              <w:t>1,972</w:t>
+              <w:t>1,758</w:t>
             </w:r>
           </w:p>
         </w:tc>
@@ -4058,7 +4415,7 @@
               <w:rPr>
                 <w:sz w:val="16"/>
               </w:rPr>
-              <w:t>7,876</w:t>
+              <w:t>9,168</w:t>
             </w:r>
           </w:p>
         </w:tc>
@@ -4071,7 +4428,7 @@
               <w:rPr>
                 <w:sz w:val="16"/>
               </w:rPr>
-              <w:t>20,572</w:t>
+              <w:t>19,280</w:t>
             </w:r>
           </w:p>
         </w:tc>
@@ -4084,7 +4441,7 @@
               <w:rPr>
                 <w:sz w:val="16"/>
               </w:rPr>
-              <w:t>0.515</w:t>
+              <w:t>0.568</w:t>
             </w:r>
           </w:p>
         </w:tc>
@@ -4097,7 +4454,7 @@
               <w:rPr>
                 <w:sz w:val="16"/>
               </w:rPr>
-              <w:t>0.210</w:t>
+              <w:t>0.201</w:t>
             </w:r>
           </w:p>
         </w:tc>
@@ -4110,7 +4467,7 @@
               <w:rPr>
                 <w:sz w:val="16"/>
               </w:rPr>
-              <w:t>0.723</w:t>
+              <w:t>0.678</w:t>
             </w:r>
           </w:p>
         </w:tc>
@@ -4123,7 +4480,7 @@
               <w:rPr>
                 <w:sz w:val="16"/>
               </w:rPr>
-              <w:t>306.680</w:t>
+              <w:t>352.995</w:t>
             </w:r>
           </w:p>
         </w:tc>
@@ -4136,7 +4493,7 @@
               <w:rPr>
                 <w:sz w:val="16"/>
               </w:rPr>
-              <w:t>64.461</w:t>
+              <w:t>71.042</w:t>
             </w:r>
           </w:p>
         </w:tc>
@@ -4149,7 +4506,7 @@
               <w:rPr>
                 <w:sz w:val="16"/>
               </w:rPr>
-              <w:t>60.647</w:t>
+              <w:t>54.066</w:t>
             </w:r>
           </w:p>
         </w:tc>
@@ -4162,7 +4519,7 @@
               <w:rPr>
                 <w:sz w:val="16"/>
               </w:rPr>
-              <w:t>545.455</w:t>
+              <w:t>552.282</w:t>
             </w:r>
           </w:p>
         </w:tc>
@@ -4601,7 +4958,7 @@
         <w:pStyle w:val="ListBullet"/>
       </w:pPr>
       <w:r>
-        <w:t>At r = 5 the optimum moves to a low threshold. Recommended deployment: the decision tree at threshold 0.16 - per 1,000 children screened it flags 328, catches 78 of the 125 out-of-school children and misses 47 (recall 0.62, precision 0.24), the lowest expected cost of all policies. The default 0.5 threshold on the same tree would catch only 5 per 1,000.</w:t>
+        <w:t>At r = 5 the optimum moves to a low threshold. Recommended deployment: the decision tree at threshold 0.16 - per 1,000 children screened it flags 328, catches 78 of the 125 out-of-school children and misses 47 (recall 0.62, precision 0.24), the lowest hold-out expected cost of all policies. The default 0.5 threshold on the same tree would catch only 5 per 1,000.</w:t>
       </w:r>
     </w:p>
     <w:p>
@@ -4609,7 +4966,7 @@
         <w:pStyle w:val="ListBullet"/>
       </w:pPr>
       <w:r>
-        <w:t>Logistic regression at threshold 0.57 is a close second (recall 0.52, precision 0.21, 307 flagged per 1,000) and is preferable where officials must explain why a child was flagged.</w:t>
+        <w:t>Logistic regression at threshold 0.54 is a close second (recall 0.57, precision 0.20, 353 flagged per 1,000) and is preferable where officials must explain why a child was flagged.</w:t>
       </w:r>
     </w:p>
     <w:p>
@@ -4617,7 +4974,15 @@
         <w:pStyle w:val="ListBullet"/>
       </w:pPr>
       <w:r>
-        <w:t>At r = 10 both models flag over half of all children to catch ~78%; whether that is acceptable is a budget decision for the programme, which the cost ratio makes explicit.</w:t>
+        <w:t>At r = 10 both models flag over half of all children to catch 75%-83%; whether that is acceptable is a budget decision for the programme, which the cost ratio makes explicit.</w:t>
+      </w:r>
+    </w:p>
+    <w:p>
+      <w:pPr>
+        <w:pStyle w:val="ListBullet"/>
+      </w:pPr>
+      <w:r>
+        <w:t>Honesty check. Had the threshold been picked on the hold-out itself, the logistic optimum would have been 0.57 with cost 545 per 1,000 against 552 at the training-selected 0.54; for the tree the two coincide at 0.16. The flattery from selecting on the test set is small here (about 1.3% of cost for the logistic model) but it is not zero, which is why all numbers at the recommended threshold - Tables 5-7, Figures 5-6 - use the training-selected value.</w:t>
       </w:r>
     </w:p>
     <w:p>
@@ -4634,7 +4999,7 @@
           <w:b/>
           <w:sz w:val="19"/>
         </w:rPr>
-        <w:t>Table 6. Mean feature values by outcome, logistic regression at threshold 0.57</w:t>
+        <w:t>Table 6. Mean feature values by outcome, logistic regression at threshold 0.54</w:t>
       </w:r>
     </w:p>
     <w:tbl>
@@ -4760,7 +5125,7 @@
               <w:rPr>
                 <w:sz w:val="17"/>
               </w:rPr>
-              <w:t>8.635</w:t>
+              <w:t>8.710</w:t>
             </w:r>
           </w:p>
         </w:tc>
@@ -4773,7 +5138,7 @@
               <w:rPr>
                 <w:sz w:val="17"/>
               </w:rPr>
-              <w:t>9.715</w:t>
+              <w:t>9.747</w:t>
             </w:r>
           </w:p>
         </w:tc>
@@ -4786,7 +5151,7 @@
               <w:rPr>
                 <w:sz w:val="17"/>
               </w:rPr>
-              <w:t>8.715</w:t>
+              <w:t>8.748</w:t>
             </w:r>
           </w:p>
         </w:tc>
@@ -4799,7 +5164,7 @@
               <w:rPr>
                 <w:sz w:val="17"/>
               </w:rPr>
-              <w:t>9.699</w:t>
+              <w:t>9.749</w:t>
             </w:r>
           </w:p>
         </w:tc>
@@ -4812,7 +5177,7 @@
               <w:rPr>
                 <w:sz w:val="17"/>
               </w:rPr>
-              <w:t>1.080</w:t>
+              <w:t>1.038</w:t>
             </w:r>
           </w:p>
         </w:tc>
@@ -4840,7 +5205,7 @@
               <w:rPr>
                 <w:sz w:val="17"/>
               </w:rPr>
-              <w:t>0.458</w:t>
+              <w:t>0.448</w:t>
             </w:r>
           </w:p>
         </w:tc>
@@ -4853,7 +5218,7 @@
               <w:rPr>
                 <w:sz w:val="17"/>
               </w:rPr>
-              <w:t>0.377</w:t>
+              <w:t>0.379</w:t>
             </w:r>
           </w:p>
         </w:tc>
@@ -4866,7 +5231,7 @@
               <w:rPr>
                 <w:sz w:val="17"/>
               </w:rPr>
-              <w:t>0.395</w:t>
+              <w:t>0.384</w:t>
             </w:r>
           </w:p>
         </w:tc>
@@ -4879,7 +5244,7 @@
               <w:rPr>
                 <w:sz w:val="17"/>
               </w:rPr>
-              <w:t>0.338</w:t>
+              <w:t>0.340</w:t>
             </w:r>
           </w:p>
         </w:tc>
@@ -4892,7 +5257,7 @@
               <w:rPr>
                 <w:sz w:val="17"/>
               </w:rPr>
-              <w:t>-0.081</w:t>
+              <w:t>-0.069</w:t>
             </w:r>
           </w:p>
         </w:tc>
@@ -4920,7 +5285,7 @@
               <w:rPr>
                 <w:sz w:val="17"/>
               </w:rPr>
-              <w:t>0.141</w:t>
+              <w:t>0.154</w:t>
             </w:r>
           </w:p>
         </w:tc>
@@ -4933,7 +5298,7 @@
               <w:rPr>
                 <w:sz w:val="17"/>
               </w:rPr>
-              <w:t>0.426</w:t>
+              <w:t>0.444</w:t>
             </w:r>
           </w:p>
         </w:tc>
@@ -4946,7 +5311,7 @@
               <w:rPr>
                 <w:sz w:val="17"/>
               </w:rPr>
-              <w:t>0.153</w:t>
+              <w:t>0.164</w:t>
             </w:r>
           </w:p>
         </w:tc>
@@ -4959,7 +5324,7 @@
               <w:rPr>
                 <w:sz w:val="17"/>
               </w:rPr>
-              <w:t>0.380</w:t>
+              <w:t>0.390</w:t>
             </w:r>
           </w:p>
         </w:tc>
@@ -4972,7 +5337,7 @@
               <w:rPr>
                 <w:sz w:val="17"/>
               </w:rPr>
-              <w:t>0.286</w:t>
+              <w:t>0.290</w:t>
             </w:r>
           </w:p>
         </w:tc>
@@ -5000,7 +5365,7 @@
               <w:rPr>
                 <w:sz w:val="17"/>
               </w:rPr>
-              <w:t>0.073</w:t>
+              <w:t>0.078</w:t>
             </w:r>
           </w:p>
         </w:tc>
@@ -5013,7 +5378,7 @@
               <w:rPr>
                 <w:sz w:val="17"/>
               </w:rPr>
-              <w:t>0.180</w:t>
+              <w:t>0.185</w:t>
             </w:r>
           </w:p>
         </w:tc>
@@ -5026,7 +5391,7 @@
               <w:rPr>
                 <w:sz w:val="17"/>
               </w:rPr>
-              <w:t>0.064</w:t>
+              <w:t>0.067</w:t>
             </w:r>
           </w:p>
         </w:tc>
@@ -5039,7 +5404,7 @@
               <w:rPr>
                 <w:sz w:val="17"/>
               </w:rPr>
-              <w:t>0.137</w:t>
+              <w:t>0.140</w:t>
             </w:r>
           </w:p>
         </w:tc>
@@ -5052,7 +5417,7 @@
               <w:rPr>
                 <w:sz w:val="17"/>
               </w:rPr>
-              <w:t>0.107</w:t>
+              <w:t>0.108</w:t>
             </w:r>
           </w:p>
         </w:tc>
@@ -5080,7 +5445,7 @@
               <w:rPr>
                 <w:sz w:val="17"/>
               </w:rPr>
-              <w:t>0.300</w:t>
+              <w:t>0.313</w:t>
             </w:r>
           </w:p>
         </w:tc>
@@ -5093,7 +5458,7 @@
               <w:rPr>
                 <w:sz w:val="17"/>
               </w:rPr>
-              <w:t>0.538</w:t>
+              <w:t>0.549</w:t>
             </w:r>
           </w:p>
         </w:tc>
@@ -5106,7 +5471,7 @@
               <w:rPr>
                 <w:sz w:val="17"/>
               </w:rPr>
-              <w:t>0.389</w:t>
+              <w:t>0.419</w:t>
             </w:r>
           </w:p>
         </w:tc>
@@ -5119,7 +5484,7 @@
               <w:rPr>
                 <w:sz w:val="17"/>
               </w:rPr>
-              <w:t>0.656</w:t>
+              <w:t>0.660</w:t>
             </w:r>
           </w:p>
         </w:tc>
@@ -5160,7 +5525,7 @@
               <w:rPr>
                 <w:sz w:val="17"/>
               </w:rPr>
-              <w:t>0.123</w:t>
+              <w:t>0.126</w:t>
             </w:r>
           </w:p>
         </w:tc>
@@ -5173,7 +5538,7 @@
               <w:rPr>
                 <w:sz w:val="17"/>
               </w:rPr>
-              <w:t>0.075</w:t>
+              <w:t>0.065</w:t>
             </w:r>
           </w:p>
         </w:tc>
@@ -5186,7 +5551,7 @@
               <w:rPr>
                 <w:sz w:val="17"/>
               </w:rPr>
-              <w:t>0.141</w:t>
+              <w:t>0.144</w:t>
             </w:r>
           </w:p>
         </w:tc>
@@ -5199,7 +5564,7 @@
               <w:rPr>
                 <w:sz w:val="17"/>
               </w:rPr>
-              <w:t>0.103</w:t>
+              <w:t>0.099</w:t>
             </w:r>
           </w:p>
         </w:tc>
@@ -5212,7 +5577,7 @@
               <w:rPr>
                 <w:sz w:val="17"/>
               </w:rPr>
-              <w:t>-0.048</w:t>
+              <w:t>-0.062</w:t>
             </w:r>
           </w:p>
         </w:tc>
@@ -5240,7 +5605,7 @@
               <w:rPr>
                 <w:sz w:val="17"/>
               </w:rPr>
-              <w:t>1.729</w:t>
+              <w:t>1.788</w:t>
             </w:r>
           </w:p>
         </w:tc>
@@ -5253,7 +5618,7 @@
               <w:rPr>
                 <w:sz w:val="17"/>
               </w:rPr>
-              <w:t>2.973</w:t>
+              <w:t>3.046</w:t>
             </w:r>
           </w:p>
         </w:tc>
@@ -5266,7 +5631,7 @@
               <w:rPr>
                 <w:sz w:val="17"/>
               </w:rPr>
-              <w:t>2.063</w:t>
+              <w:t>2.149</w:t>
             </w:r>
           </w:p>
         </w:tc>
@@ -5279,7 +5644,7 @@
               <w:rPr>
                 <w:sz w:val="17"/>
               </w:rPr>
-              <w:t>3.655</w:t>
+              <w:t>3.721</w:t>
             </w:r>
           </w:p>
         </w:tc>
@@ -5292,7 +5657,7 @@
               <w:rPr>
                 <w:sz w:val="17"/>
               </w:rPr>
-              <w:t>1.244</w:t>
+              <w:t>1.258</w:t>
             </w:r>
           </w:p>
         </w:tc>
@@ -5320,7 +5685,7 @@
               <w:rPr>
                 <w:sz w:val="17"/>
               </w:rPr>
-              <w:t>1.063</w:t>
+              <w:t>1.123</w:t>
             </w:r>
           </w:p>
         </w:tc>
@@ -5333,7 +5698,7 @@
               <w:rPr>
                 <w:sz w:val="17"/>
               </w:rPr>
-              <w:t>2.262</w:t>
+              <w:t>2.330</w:t>
             </w:r>
           </w:p>
         </w:tc>
@@ -5346,7 +5711,7 @@
               <w:rPr>
                 <w:sz w:val="17"/>
               </w:rPr>
-              <w:t>1.203</w:t>
+              <w:t>1.259</w:t>
             </w:r>
           </w:p>
         </w:tc>
@@ -5359,7 +5724,7 @@
               <w:rPr>
                 <w:sz w:val="17"/>
               </w:rPr>
-              <w:t>3.106</w:t>
+              <w:t>3.207</w:t>
             </w:r>
           </w:p>
         </w:tc>
@@ -5372,7 +5737,7 @@
               <w:rPr>
                 <w:sz w:val="17"/>
               </w:rPr>
-              <w:t>1.199</w:t>
+              <w:t>1.208</w:t>
             </w:r>
           </w:p>
         </w:tc>
@@ -5400,7 +5765,7 @@
               <w:rPr>
                 <w:sz w:val="17"/>
               </w:rPr>
-              <w:t>1.237</w:t>
+              <w:t>1.260</w:t>
             </w:r>
           </w:p>
         </w:tc>
@@ -5413,7 +5778,7 @@
               <w:rPr>
                 <w:sz w:val="17"/>
               </w:rPr>
-              <w:t>2.118</w:t>
+              <w:t>2.195</w:t>
             </w:r>
           </w:p>
         </w:tc>
@@ -5426,7 +5791,7 @@
               <w:rPr>
                 <w:sz w:val="17"/>
               </w:rPr>
-              <w:t>1.236</w:t>
+              <w:t>1.272</w:t>
             </w:r>
           </w:p>
         </w:tc>
@@ -5439,7 +5804,7 @@
               <w:rPr>
                 <w:sz w:val="17"/>
               </w:rPr>
-              <w:t>2.352</w:t>
+              <w:t>2.409</w:t>
             </w:r>
           </w:p>
         </w:tc>
@@ -5452,7 +5817,7 @@
               <w:rPr>
                 <w:sz w:val="17"/>
               </w:rPr>
-              <w:t>0.881</w:t>
+              <w:t>0.934</w:t>
             </w:r>
           </w:p>
         </w:tc>
@@ -5480,7 +5845,7 @@
               <w:rPr>
                 <w:sz w:val="17"/>
               </w:rPr>
-              <w:t>0.697</w:t>
+              <w:t>0.684</w:t>
             </w:r>
           </w:p>
         </w:tc>
@@ -5493,7 +5858,7 @@
               <w:rPr>
                 <w:sz w:val="17"/>
               </w:rPr>
-              <w:t>0.402</w:t>
+              <w:t>0.383</w:t>
             </w:r>
           </w:p>
         </w:tc>
@@ -5506,7 +5871,7 @@
               <w:rPr>
                 <w:sz w:val="17"/>
               </w:rPr>
-              <w:t>0.687</w:t>
+              <w:t>0.668</w:t>
             </w:r>
           </w:p>
         </w:tc>
@@ -5519,7 +5884,7 @@
               <w:rPr>
                 <w:sz w:val="17"/>
               </w:rPr>
-              <w:t>0.334</w:t>
+              <w:t>0.320</w:t>
             </w:r>
           </w:p>
         </w:tc>
@@ -5532,7 +5897,7 @@
               <w:rPr>
                 <w:sz w:val="17"/>
               </w:rPr>
-              <w:t>-0.295</w:t>
+              <w:t>-0.301</w:t>
             </w:r>
           </w:p>
         </w:tc>
@@ -5768,7 +6133,7 @@
               <w:rPr>
                 <w:sz w:val="17"/>
               </w:rPr>
-              <w:t>0.480</w:t>
+              <w:t>0.539</w:t>
             </w:r>
           </w:p>
         </w:tc>
@@ -5781,7 +6146,7 @@
               <w:rPr>
                 <w:sz w:val="17"/>
               </w:rPr>
-              <w:t>0.520</w:t>
+              <w:t>0.461</w:t>
             </w:r>
           </w:p>
         </w:tc>
@@ -5794,7 +6159,7 @@
               <w:rPr>
                 <w:sz w:val="17"/>
               </w:rPr>
-              <w:t>0.193</w:t>
+              <w:t>0.184</w:t>
             </w:r>
           </w:p>
         </w:tc>
@@ -5887,7 +6252,7 @@
               <w:rPr>
                 <w:sz w:val="17"/>
               </w:rPr>
-              <w:t>0.564</w:t>
+              <w:t>0.608</w:t>
             </w:r>
           </w:p>
         </w:tc>
@@ -5900,7 +6265,7 @@
               <w:rPr>
                 <w:sz w:val="17"/>
               </w:rPr>
-              <w:t>0.436</w:t>
+              <w:t>0.392</w:t>
             </w:r>
           </w:p>
         </w:tc>
@@ -5913,7 +6278,7 @@
               <w:rPr>
                 <w:sz w:val="17"/>
               </w:rPr>
-              <w:t>0.236</w:t>
+              <w:t>0.227</w:t>
             </w:r>
           </w:p>
         </w:tc>
@@ -6006,7 +6371,7 @@
               <w:rPr>
                 <w:sz w:val="17"/>
               </w:rPr>
-              <w:t>0.614</w:t>
+              <w:t>0.666</w:t>
             </w:r>
           </w:p>
         </w:tc>
@@ -6019,7 +6384,7 @@
               <w:rPr>
                 <w:sz w:val="17"/>
               </w:rPr>
-              <w:t>0.386</w:t>
+              <w:t>0.334</w:t>
             </w:r>
           </w:p>
         </w:tc>
@@ -6032,7 +6397,7 @@
               <w:rPr>
                 <w:sz w:val="17"/>
               </w:rPr>
-              <w:t>0.213</w:t>
+              <w:t>0.203</w:t>
             </w:r>
           </w:p>
         </w:tc>
@@ -6125,7 +6490,7 @@
               <w:rPr>
                 <w:sz w:val="17"/>
               </w:rPr>
-              <w:t>0.260</w:t>
+              <w:t>0.313</w:t>
             </w:r>
           </w:p>
         </w:tc>
@@ -6138,7 +6503,7 @@
               <w:rPr>
                 <w:sz w:val="17"/>
               </w:rPr>
-              <w:t>0.740</w:t>
+              <w:t>0.687</w:t>
             </w:r>
           </w:p>
         </w:tc>
@@ -6151,7 +6516,7 @@
               <w:rPr>
                 <w:sz w:val="17"/>
               </w:rPr>
-              <w:t>0.196</w:t>
+              <w:t>0.191</w:t>
             </w:r>
           </w:p>
         </w:tc>
@@ -6244,7 +6609,7 @@
               <w:rPr>
                 <w:sz w:val="17"/>
               </w:rPr>
-              <w:t>0.502</w:t>
+              <w:t>0.551</w:t>
             </w:r>
           </w:p>
         </w:tc>
@@ -6257,7 +6622,7 @@
               <w:rPr>
                 <w:sz w:val="17"/>
               </w:rPr>
-              <w:t>0.498</w:t>
+              <w:t>0.449</w:t>
             </w:r>
           </w:p>
         </w:tc>
@@ -6270,7 +6635,7 @@
               <w:rPr>
                 <w:sz w:val="17"/>
               </w:rPr>
-              <w:t>0.214</w:t>
+              <w:t>0.205</w:t>
             </w:r>
           </w:p>
         </w:tc>
@@ -6363,7 +6728,7 @@
               <w:rPr>
                 <w:sz w:val="17"/>
               </w:rPr>
-              <w:t>0.635</w:t>
+              <w:t>0.719</w:t>
             </w:r>
           </w:p>
         </w:tc>
@@ -6376,7 +6741,7 @@
               <w:rPr>
                 <w:sz w:val="17"/>
               </w:rPr>
-              <w:t>0.365</w:t>
+              <w:t>0.281</w:t>
             </w:r>
           </w:p>
         </w:tc>
@@ -6389,7 +6754,7 @@
               <w:rPr>
                 <w:sz w:val="17"/>
               </w:rPr>
-              <w:t>0.188</w:t>
+              <w:t>0.181</w:t>
             </w:r>
           </w:p>
         </w:tc>
@@ -6482,7 +6847,7 @@
               <w:rPr>
                 <w:sz w:val="17"/>
               </w:rPr>
-              <w:t>0.372</w:t>
+              <w:t>0.428</w:t>
             </w:r>
           </w:p>
         </w:tc>
@@ -6495,7 +6860,7 @@
               <w:rPr>
                 <w:sz w:val="17"/>
               </w:rPr>
-              <w:t>0.628</w:t>
+              <w:t>0.572</w:t>
             </w:r>
           </w:p>
         </w:tc>
@@ -6508,7 +6873,7 @@
               <w:rPr>
                 <w:sz w:val="17"/>
               </w:rPr>
-              <w:t>0.170</w:t>
+              <w:t>0.158</w:t>
             </w:r>
           </w:p>
         </w:tc>
@@ -6601,7 +6966,7 @@
               <w:rPr>
                 <w:sz w:val="17"/>
               </w:rPr>
-              <w:t>0.617</w:t>
+              <w:t>0.667</w:t>
             </w:r>
           </w:p>
         </w:tc>
@@ -6614,7 +6979,7 @@
               <w:rPr>
                 <w:sz w:val="17"/>
               </w:rPr>
-              <w:t>0.383</w:t>
+              <w:t>0.333</w:t>
             </w:r>
           </w:p>
         </w:tc>
@@ -6627,7 +6992,7 @@
               <w:rPr>
                 <w:sz w:val="17"/>
               </w:rPr>
-              <w:t>0.234</w:t>
+              <w:t>0.230</w:t>
             </w:r>
           </w:p>
         </w:tc>
@@ -6720,7 +7085,7 @@
               <w:rPr>
                 <w:sz w:val="17"/>
               </w:rPr>
-              <w:t>0.243</w:t>
+              <w:t>0.291</w:t>
             </w:r>
           </w:p>
         </w:tc>
@@ -6733,7 +7098,7 @@
               <w:rPr>
                 <w:sz w:val="17"/>
               </w:rPr>
-              <w:t>0.757</w:t>
+              <w:t>0.709</w:t>
             </w:r>
           </w:p>
         </w:tc>
@@ -6746,7 +7111,7 @@
               <w:rPr>
                 <w:sz w:val="17"/>
               </w:rPr>
-              <w:t>0.495</w:t>
+              <w:t>0.461</w:t>
             </w:r>
           </w:p>
         </w:tc>
@@ -6839,7 +7204,7 @@
               <w:rPr>
                 <w:sz w:val="17"/>
               </w:rPr>
-              <w:t>0.517</w:t>
+              <w:t>0.576</w:t>
             </w:r>
           </w:p>
         </w:tc>
@@ -6852,7 +7217,7 @@
               <w:rPr>
                 <w:sz w:val="17"/>
               </w:rPr>
-              <w:t>0.483</w:t>
+              <w:t>0.424</w:t>
             </w:r>
           </w:p>
         </w:tc>
@@ -6865,7 +7230,7 @@
               <w:rPr>
                 <w:sz w:val="17"/>
               </w:rPr>
-              <w:t>0.265</w:t>
+              <w:t>0.252</w:t>
             </w:r>
           </w:p>
         </w:tc>
@@ -6958,7 +7323,7 @@
               <w:rPr>
                 <w:sz w:val="17"/>
               </w:rPr>
-              <w:t>0.898</w:t>
+              <w:t>0.923</w:t>
             </w:r>
           </w:p>
         </w:tc>
@@ -6971,7 +7336,7 @@
               <w:rPr>
                 <w:sz w:val="17"/>
               </w:rPr>
-              <w:t>0.102</w:t>
+              <w:t>0.077</w:t>
             </w:r>
           </w:p>
         </w:tc>
@@ -6984,7 +7349,7 @@
               <w:rPr>
                 <w:sz w:val="17"/>
               </w:rPr>
-              <w:t>0.203</w:t>
+              <w:t>0.201</w:t>
             </w:r>
           </w:p>
         </w:tc>
@@ -7077,7 +7442,7 @@
               <w:rPr>
                 <w:sz w:val="17"/>
               </w:rPr>
-              <w:t>0.340</w:t>
+              <w:t>0.416</w:t>
             </w:r>
           </w:p>
         </w:tc>
@@ -7090,7 +7455,7 @@
               <w:rPr>
                 <w:sz w:val="17"/>
               </w:rPr>
-              <w:t>0.660</w:t>
+              <w:t>0.584</w:t>
             </w:r>
           </w:p>
         </w:tc>
@@ -7103,7 +7468,7 @@
               <w:rPr>
                 <w:sz w:val="17"/>
               </w:rPr>
-              <w:t>0.139</w:t>
+              <w:t>0.130</w:t>
             </w:r>
           </w:p>
         </w:tc>
@@ -7176,7 +7541,7 @@
     </w:p>
     <w:p>
       <w:r>
-        <w:t>The children the model misses look like enrolled children on paper: they are older, far more often urban (43% of false negatives versus 14% of true positives), more often B-form registered, and live in households with more assets, more digital use and better housing. The model has learned 'poor rural household implies out of school' and under-detects out-of-school children in better-off or urban households - plausibly dropouts rather than never-enrolled children, a distinction the current features cannot see. Recall is 0.90 in Balochistan but 0.24 in Sindh and 0.34 in Punjab; 0.26 for urban versus 0.61 for rural children. Islamabad Capital Territory is a single district that fell entirely on the training side of the grouped split, so it has no hold-out estimate; with 52 positives in the whole dataset it is too small for reliable subgroup conclusions.</w:t>
+        <w:t>The children the model misses look like enrolled children on paper: they are older, far more often urban (44% of false negatives versus 15% of true positives), more often B-form registered, and live in households with more assets, more digital use and better housing. The model has learned 'poor rural household implies out of school' and under-detects out-of-school children in better-off or urban households - plausibly dropouts rather than never-enrolled children, a distinction the current features cannot see. Recall is 0.92 in Balochistan but 0.29 in Sindh and 0.42 in Punjab; 0.31 for urban versus 0.67 for rural children. Islamabad Capital Territory is a single district that fell entirely on the training side of the grouped split, so it has no hold-out estimate; with 52 positives in the whole dataset it is too small for reliable subgroup conclusions.</w:t>
       </w:r>
     </w:p>
     <w:p>
@@ -10070,7 +10435,7 @@
         <w:pStyle w:val="ListBullet"/>
       </w:pPr>
       <w:r>
-        <w:t>Controls: Balochistan residence raises the odds 1.79x even after the household variables; age has a small negative coefficient within the 5-16 window; the ICT dummy is not significant (807 children).</w:t>
+        <w:t>Controls: Balochistan residence raises the odds 1.79x even after the household variables; age has a small negative coefficient within the 5-16 window; the ICT dummy is not significant (807 children). Note that Balochistan has the largest positive standardised coefficient in the logistic model yet close to zero permutation importance on the hold-out (Table 9), and Sindh's permutation importance is slightly negative. The province dummies overlap heavily with housing quality and digital access (kachha, disconnected households are concentrated in Balochistan), so shuffling a province flag costs little once the household variables remain; the coefficient measures the province's conditional association, the permutation drop its unique contribution to ranking children in new districts. The two views disagree because the information is shared, not because one is wrong.</w:t>
       </w:r>
     </w:p>
     <w:p>
@@ -10082,11 +10447,8 @@
       </w:r>
     </w:p>
     <w:p>
-      <w:pPr>
-        <w:pStyle w:val="ListBullet"/>
-      </w:pPr>
       <w:r>
-        <w:t>Target by housing and connectivity, not just an asset count. Housing quality and digital access are the strongest household predictors; outreach lists built from a simple asset score will miss children in kachha, disconnected homes.</w:t>
+        <w:t>A caveat before the recommendations. ASER is a single cross-sectional household survey, and every driver above is an association conditional on the other twelve features, not an estimated causal effect. The B-form result is the clearest example: children without a registration are more likely to be out of school, but households that are more engaged with public services may obtain both the document and a school place for reasons unrelated to the document itself, in which case issuing B-forms alone would not move enrolment. The same reasoning applies to housing, digital access and disability. The takeaways below therefore identify where and for whom out-of-school risk concentrates - which is what a targeting model can legitimately inform - and name candidate levers whose causal effect would need to be established (for instance through a piloted or staggered roll-out) before being relied on as policy.</w:t>
       </w:r>
     </w:p>
     <w:p>
@@ -10094,7 +10456,15 @@
         <w:pStyle w:val="ListBullet"/>
       </w:pPr>
       <w:r>
-        <w:t>Birth registration is an actionable lever. Unregistered children have about 1.3x the odds of being out of school; linking NADRA B-form drives to enrolment campaigns targets a population the model identifies as high-risk.</w:t>
+        <w:t>Target by housing and connectivity, not just an asset count. Housing quality and digital access are the strongest household predictors of out-of-school status; outreach lists built from a simple asset score will miss children in kachha, disconnected homes.</w:t>
+      </w:r>
+    </w:p>
+    <w:p>
+      <w:pPr>
+        <w:pStyle w:val="ListBullet"/>
+      </w:pPr>
+      <w:r>
+        <w:t>Birth registration is a candidate lever and a targeting marker. Unregistered children have about 1.3x the odds of being out of school; at minimum, NADRA B-form records identify a population the model flags as high-risk, and a joint registration-plus-enrolment drive is a testable intervention.</w:t>
       </w:r>
     </w:p>
     <w:p>
@@ -10126,7 +10496,7 @@
         <w:pStyle w:val="ListBullet"/>
       </w:pPr>
       <w:r>
-        <w:t>Set the operating threshold explicitly. At a 5:1 cost ratio the recommended policy flags about one child in three and catches about 60% of out-of-school children; the default 0.5 threshold is not a defensible choice for outreach.</w:t>
+        <w:t>Set the operating threshold explicitly and choose it on training data. At a 5:1 cost ratio the recommended policy flags about 33% of children and catches 62% of out-of-school children on unseen districts; the default 0.5 threshold is not a defensible choice for outreach.</w:t>
       </w:r>
     </w:p>
     <w:p>
@@ -10172,6 +10542,22 @@
       </w:pPr>
       <w:r>
         <w:t>Potential demographic bias: recall differs sharply by area, province and B-form status. Girls and disabled children are currently caught more often than their counterparts because they carry higher predicted risk, which is itself a fairness question.</w:t>
+      </w:r>
+    </w:p>
+    <w:p>
+      <w:pPr>
+        <w:pStyle w:val="ListBullet"/>
+      </w:pPr>
+      <w:r>
+        <w:t>Associational evidence only: the drivers are conditional associations in one cross-sectional survey; none of the policy levers has an estimated causal effect (section 7).</w:t>
+      </w:r>
+    </w:p>
+    <w:p>
+      <w:pPr>
+        <w:pStyle w:val="ListBullet"/>
+      </w:pPr>
+      <w:r>
+        <w:t>The H5 paired t-test rests on five folds; the district-cluster bootstrap of the hold-out gain (section 3.1) is the sturdier statement, and both agree.</w:t>
       </w:r>
     </w:p>
     <w:p>

</xml_diff>

<commit_message>
Report: plain-language rewrite with inline term explanations and a glossary
</commit_message>
<xml_diff>
--- a/report/Milestone03_Report.docx
+++ b/report/Milestone03_Report.docx
@@ -12,7 +12,12 @@
     </w:p>
     <w:p>
       <w:r>
-        <w:t>Predicting out-of-school status among children aged 5-16 in Pakistan (ASER 2025) - manuscript Section IV draft: Methods (modelling), Results (baseline) and preliminary Discussion.</w:t>
+        <w:t>Predicting which children aged 5-16 in Pakistan are out of school, using the ASER 2025 household survey. Manuscript Section IV draft: modelling methods, baseline results and preliminary discussion.</w:t>
+      </w:r>
+    </w:p>
+    <w:p>
+      <w:r>
+        <w:t>How to read this section. Each technical term is explained in brackets the first time it appears, and a short glossary at the end collects them. Every number quoted here is produced by the accompanying code and can be traced to a table in outputs/tables.</w:t>
       </w:r>
     </w:p>
     <w:p>
@@ -20,12 +25,17 @@
         <w:pStyle w:val="Heading1"/>
       </w:pPr>
       <w:r>
-        <w:t>1. Modelling objective and data</w:t>
+        <w:t>1. What we are predicting and with what data</w:t>
       </w:r>
     </w:p>
     <w:p>
       <w:r>
-        <w:t>The target is out_of_school (1 = never enrolled or dropped out, 0 = currently enrolled). The analysis file built in Milestone 2 holds 161,803 children from 138 districts, of whom 21,288 (13.2%) are out of school (9.3% when ASER sampling weights are applied). The 13 predictors are age, sex, area, the sex x area interaction, B-form registration, any functional disability, a household asset count (0-8), a digital-use count (0-5), housing structure (1-3) and four province dummies with Punjab as reference. Columns were used exactly as prepared in Milestone 2 (feature_manifest.json); the id, district and weight columns are never used as predictors. The data contain no missing values, so no imputation step was needed.</w:t>
+        <w:t>The outcome we predict - the target variable (the column the model learns to guess) - is out_of_school: 1 if a child has never enrolled or has dropped out, 0 if the child is currently enrolled. The analysis file prepared in Milestone 2 contains 161,803 children from 138 districts. Of these, 21,288 (13.2%) are out of school. This is a case of class imbalance (one outcome is much rarer than the other), which shapes how the models must be judged: a model that simply says 'enrolled' for everyone would be right 86.8% of the time while finding no out-of-school child at all. When ASER's sampling weights are applied (numbers attached to each child so the sample represents the national population of children), the out-of-school share is 9.3%.</w:t>
+      </w:r>
+    </w:p>
+    <w:p>
+      <w:r>
+        <w:t>The model uses 13 predictors (the input columns, also called features): the child's age, sex and whether the household is urban; a sex-by-area interaction term (a column equal to 1 only for urban girls, which lets the effect of being a girl differ between rural and urban areas); whether the child has a B-form (the NADRA birth registration document); whether the child has any functional disability; a household asset count from 0 to 8; a digital-use count from 0 to 5; housing structure on a 1-to-3 scale from kachha to pacca; and four province indicators. Province was one-hot encoded (each province becomes its own 0/1 column) with Punjab as the reference category (the province all others are compared against). The child id, the district and the sampling weight are never used as predictors. The data contain no missing values, so no imputation (filling in gaps with estimated values) was needed.</w:t>
       </w:r>
     </w:p>
     <w:p>
@@ -33,7 +43,7 @@
         <w:pStyle w:val="Heading1"/>
       </w:pPr>
       <w:r>
-        <w:t>2. Baseline architectures and justification</w:t>
+        <w:t>2. The three baseline models and why they were chosen</w:t>
       </w:r>
     </w:p>
     <w:p>
@@ -41,7 +51,7 @@
         <w:pStyle w:val="ListBullet"/>
       </w:pPr>
       <w:r>
-        <w:t>Naive benchmark - majority-class classifier (predicts 'enrolled' for every child). It fixes the performance floor and shows why accuracy is misleading at 13.2% prevalence: it scores 87.5% accuracy with zero recall.</w:t>
+        <w:t>Majority-class baseline (a model that always predicts the most common outcome, here 'enrolled'). It sets the floor that any real model must beat and makes the point above concrete: it scores 87.5% accuracy (the share of all children classified correctly) and yet has zero recall (the share of truly out-of-school children it finds).</w:t>
       </w:r>
     </w:p>
     <w:p>
@@ -49,7 +59,7 @@
         <w:pStyle w:val="ListBullet"/>
       </w:pPr>
       <w:r>
-        <w:t>Logistic regression (standardised inputs, L2 penalty). Hypotheses H1-H4 concern the direction and size of individual effects, which logistic coefficients answer directly as odds ratios with confidence intervals. All predictors are binary or short ordinal scales, so a model linear in the log-odds is an appropriate first fit. Tuned: regularisation strength C and class weighting.</w:t>
+        <w:t>Logistic regression (a statistical model that estimates the probability of an outcome as a weighted sum of the predictors). It was chosen because hypotheses H1-H4 from Milestone 2 ask about the direction and size of individual effects, and logistic regression answers those directly through odds ratios (how many times higher or lower the odds of being out of school are for a one-unit change in a predictor, holding the others fixed) with confidence intervals (the range in which the true value very probably lies). The inputs are standardised (rescaled so each has the same spread) and the model uses an L2 penalty (a term that shrinks the weights towards zero so the model does not over-react to noise). Two settings were tuned: the regularisation strength C (how strong that shrinkage is) and class weighting (whether out-of-school children count more during training to offset their rarity).</w:t>
       </w:r>
     </w:p>
     <w:p>
@@ -57,7 +67,7 @@
         <w:pStyle w:val="ListBullet"/>
       </w:pPr>
       <w:r>
-        <w:t>Decision tree (CART, Gini). Captures non-linear thresholds in the asset and digital counts and interactions such as the gender x area effect (H4) without hand specification, remains interpretable through its splits and Gini importances, and is cheap on 161k rows. Tuned: maximum depth, minimum leaf size and class weighting.</w:t>
+        <w:t>Decision tree (a model that splits the children into groups with a sequence of yes/no questions such as 'is housing kachha?'). It was chosen because it captures non-linear patterns (effects that change in size along a scale) and interactions (effects that depend on other variables, such as the gender gap depending on area) without having to specify them in advance, it is easy to read, and it is quick to train on 161,000 rows. Three settings were tuned: maximum depth (how many questions deep the tree may go), minimum leaf size (the smallest group a final answer may rest on) and class weighting.</w:t>
       </w:r>
     </w:p>
     <w:p>
@@ -65,12 +75,17 @@
         <w:pStyle w:val="Heading1"/>
       </w:pPr>
       <w:r>
-        <w:t>3. Experimental setup and cross-validation</w:t>
+        <w:t>3. How the models were trained and tested fairly</w:t>
       </w:r>
     </w:p>
     <w:p>
       <w:r>
-        <w:t>Children are clustered in districts and enrolment rates differ sharply between districts, so a random split would let the model see children from the same district on both sides and over-state performance. We therefore partition with StratifiedGroupKFold grouped by district and stratified on the target. One fold of a 5-fold grouped split is held out as the test set (32,516 children, 29 districts, 20.1% of rows, prevalence 12.5%); the remaining 129,287 children in 109 districts are used for tuning with a second 5-fold grouped stratified split (inner CV). No district appears on both sides of any split (asserted in code). Hyperparameters were selected with GridSearchCV on the inner folds, refitting on ROC-AUC; recall, precision, F1, PR-AUC and accuracy were recorded per fold to show variance. Standardisation for the logistic model is fitted inside each fold.</w:t>
+        <w:t>Children in the survey are clustered in districts, and enrolment rates differ sharply from one district to another. If children from the same district appeared in both the training data (what the model learns from) and the test data (what it is judged on), the model could partly memorise district patterns and look better than it would on genuinely new places. This is a form of data leakage (information from the test data influencing the model). To prevent it we used StratifiedGroupKFold, a splitting method that keeps every district wholly on one side of the split (the 'group' part) while keeping the share of out-of-school children similar on both sides (the 'stratified' part).</w:t>
+      </w:r>
+    </w:p>
+    <w:p>
+      <w:r>
+        <w:t>One fold (one of five equal portions) of such a split was set aside as the hold-out test set (data the model never sees until final evaluation): 32,516 children in 29 districts, 20.1% of the rows, with an out-of-school share of 12.5%. The remaining 129,287 children in 109 districts formed the training set. Within the training set we ran cross-validation (repeatedly training on four fifths of the districts and checking on the remaining fifth, five times, so every training child is checked on exactly once) using the same district-grouped, stratified method. The code asserts that no district appears on both sides of any split.</w:t>
       </w:r>
     </w:p>
     <w:p>
@@ -79,7 +94,7 @@
           <w:b/>
           <w:sz w:val="19"/>
         </w:rPr>
-        <w:t>Table 1. Grouped stratified hold-out split</w:t>
+        <w:t>Table 1. The district-grouped hold-out split</w:t>
       </w:r>
     </w:p>
     <w:tbl>
@@ -346,11 +361,16 @@
     <w:p/>
     <w:p>
       <w:r>
+        <w:t>Hyperparameters (settings chosen by the analyst rather than learned from the data, such as C or tree depth) were selected with a grid search (trying every combination from a pre-set list) inside the cross-validation, choosing the combination with the best ROC-AUC (a 0-to-1 score of how well the model ranks out-of-school children above enrolled ones across all possible cut-offs; 0.5 is no better than chance, 1.0 is perfect). Recall, precision, F1 and accuracy were recorded for every fold as well, so that the spread of performance between groups of districts is visible. The standardisation step is fitted inside each fold, so it too never sees the checking data.</w:t>
+      </w:r>
+    </w:p>
+    <w:p>
+      <w:r>
         <w:rPr>
           <w:b/>
           <w:sz w:val="19"/>
         </w:rPr>
-        <w:t>Table 2. Inner cross-validation results of the tuned configurations (mean over 5 district-grouped folds; recall, F1 and accuracy are at the default 0.5 threshold, ROC-AUC and PR-AUC are threshold-free)</w:t>
+        <w:t>Table 2. Cross-validation results for the best settings of each model (mean over 5 district-grouped folds). Recall, F1 and accuracy are measured at the default 0.5 cut-off; ROC-AUC and PR-AUC do not depend on a cut-off.</w:t>
       </w:r>
     </w:p>
     <w:tbl>
@@ -394,7 +414,7 @@
                 <w:b/>
                 <w:sz w:val="17"/>
               </w:rPr>
-              <w:t>Best parameters</w:t>
+              <w:t>Best settings</w:t>
             </w:r>
           </w:p>
         </w:tc>
@@ -422,7 +442,7 @@
                 <w:b/>
                 <w:sz w:val="17"/>
               </w:rPr>
-              <w:t>SD</w:t>
+              <w:t>Spread (SD)</w:t>
             </w:r>
           </w:p>
         </w:tc>
@@ -705,7 +725,7 @@
               <w:rPr>
                 <w:sz w:val="17"/>
               </w:rPr>
-              <w:t>Logistic regression (age, female, urban)</w:t>
+              <w:t>Logistic regression (age, sex, area only)</w:t>
             </w:r>
           </w:p>
         </w:tc>
@@ -805,7 +825,7 @@
     <w:p/>
     <w:p>
       <w:r>
-        <w:t>Hyperparameter exploration. The logistic grid covered C in {0.001, 0.01, 0.1, 1, 10} x class_weight in {none, balanced}; the best point was C = 0.001 with balanced weights (CV ROC-AUC 0.736 +/- 0.047). AUC was flat across C, while balancing matters for recall at the default threshold. The tree grid covered max_depth in {3, 5, 7, 10, 15, none} x min_samples_leaf in {1, 50, 200, 1000} x class_weight; the best point was depth 10, minimum leaf 200, no class weights (CV ROC-AUC 0.744 +/- 0.051; fitted tree depth 10, 221 leaves). Unconstrained trees over-fit district idiosyncrasies and lose AUC on unseen districts. Because refitting is on ROC-AUC, a threshold-free criterion, the selected tree carries no class weighting and at the default 0.5 cut-off flags almost nobody (recall 4.3% on the hold-out, Table 3): almost no leaf reaches a 50% out-of-school share. That is not a defect of the tree; it is why the operating threshold is set separately, and without looking at the hold-out, in section 5. Full grids: outputs/tables/t02-t04.</w:t>
+        <w:t>What the tuning showed. For logistic regression the strongest shrinkage (C = 0.001) with balanced class weights was best, with a cross-validated ROC-AUC of 0.736 plus or minus 0.047 (the standard deviation, a measure of how much the score varied from fold to fold). ROC-AUC barely changed across values of C, because with 129,000 training rows the weights are already well determined; class weighting mattered mainly for recall at the default cut-off. For the decision tree a depth of 10 with at least 200 children per leaf and no class weighting was best (ROC-AUC 0.744 plus or minus 0.051; the fitted tree has 221 leaves). Deeper, unconstrained trees memorised district quirks and scored worse on unseen districts. One consequence needs stating now: because the selection criterion was ROC-AUC, which ignores the cut-off, the chosen tree carries no class weighting, and at the default cut-off of 0.5 it flags almost nobody (recall 4.3% on the hold-out, Table 3) because almost no leaf contains a majority of out-of-school children. This is not a flaw in the tree. It is the reason the operating cut-off is chosen separately, and on training data only, in section 5. The full grids are in tables t02-t04.</w:t>
       </w:r>
     </w:p>
     <w:p>
@@ -813,12 +833,17 @@
         <w:pStyle w:val="Heading2"/>
       </w:pPr>
       <w:r>
-        <w:t>3.1 Hypothesis H5 - value of the household features</w:t>
+        <w:t>3.1 Hypothesis H5 - do the household features add predictive value?</w:t>
       </w:r>
     </w:p>
     <w:p>
       <w:r>
-        <w:t>On identical inner folds, a logistic model using only age, sex and area reached ROC-AUC 0.586 (+/- 0.042) against 0.736 (+/- 0.047) for the 13-feature model: a gain of +0.150 AUC in every fold (paired t = 4.56, p = 0.010). On the hold-out districts the AUCs were 0.547 and 0.674. Five folds are a thin basis for a t-test, so the hold-out gain was also bootstrapped by resampling the 29 held-out districts with replacement (1,000 draws): gain +0.127 AUC, 95% interval [+0.078, +0.173], positive in 100% of draws. H0 for H5 is rejected: who is out of school is explained far better by household circumstances than by demographics alone.</w:t>
+        <w:t>Hypothesis H5 asks whether adding poverty, B-form, disability and the control variables improves prediction over a bare demographic model using only age, sex and area. On identical cross-validation folds the demographic model reached a ROC-AUC of 0.586 (plus or minus 0.042) and the full 13-feature model 0.736 (plus or minus 0.047): a gain of +0.150 that appeared in every fold. A paired t-test (a test of whether the average fold-by-fold difference could plausibly be zero) gives p = 0.010 (the probability of seeing a gain this large if there were truly none). On the hold-out districts the two ROC-AUCs were 0.547 and 0.674.</w:t>
+      </w:r>
+    </w:p>
+    <w:p>
+      <w:r>
+        <w:t>Five folds are a thin basis for a p-value, so we also used a bootstrap (re-computing the result many times on random re-samples of the data to see how much it moves). Because districts, not children, are the natural units, we re-sampled the 29 held-out districts with replacement 1,000 times (a cluster bootstrap). The hold-out gain is +0.127 ROC-AUC with a 95% interval of [+0.078, +0.173] and was positive in 100% of re-samples. We therefore reject the null hypothesis for H5 (the assumption of no improvement): who is out of school is explained far better by household circumstances than by age, sex and area alone.</w:t>
       </w:r>
     </w:p>
     <w:p>
@@ -869,7 +894,7 @@
           <w:i/>
           <w:sz w:val="18"/>
         </w:rPr>
-        <w:t>Figure 1. Per-fold ROC-AUC of the demographic and full logistic models (district-grouped CV).</w:t>
+        <w:t>Figure 1. ROC-AUC of the demographic and full logistic models in each of the five district-grouped folds.</w:t>
       </w:r>
     </w:p>
     <w:p>
@@ -877,7 +902,12 @@
         <w:pStyle w:val="Heading1"/>
       </w:pPr>
       <w:r>
-        <w:t>4. Evaluation on the held-out districts</w:t>
+        <w:t>4. Results on the held-out districts</w:t>
+      </w:r>
+    </w:p>
+    <w:p>
+      <w:r>
+        <w:t>Table 3 reports the standard classification metrics on the hold-out children, with every model using the default cut-off of 0.5 (a child is flagged when the model's estimated probability of being out of school is at least 0.5). Precision is the share of flagged children who really are out of school. Recall, also called sensitivity, is the share of truly out-of-school children who were flagged. Specificity is the share of enrolled children correctly left unflagged. F1 is a single score that balances precision and recall. PR-AUC (precision-recall area) is like ROC-AUC but focuses on the rare class, so it is more demanding when the outcome is uncommon; chance level equals the out-of-school share. 'Flagged' is the share of all children the model would send for outreach. Each metric is shown unweighted and then with the ASER sampling weights applied.</w:t>
       </w:r>
     </w:p>
     <w:p>
@@ -886,7 +916,7 @@
           <w:b/>
           <w:sz w:val="19"/>
         </w:rPr>
-        <w:t>Table 3. Hold-out metrics at the default 0.5 threshold (unweighted and ASER-weighted)</w:t>
+        <w:t>Table 3. Hold-out performance at the default 0.5 cut-off, unweighted and survey-weighted</w:t>
       </w:r>
     </w:p>
     <w:tbl>
@@ -1072,7 +1102,7 @@
               <w:rPr>
                 <w:sz w:val="17"/>
               </w:rPr>
-              <w:t>False</w:t>
+              <w:t>No</w:t>
             </w:r>
           </w:p>
         </w:tc>
@@ -1204,7 +1234,7 @@
               <w:rPr>
                 <w:sz w:val="17"/>
               </w:rPr>
-              <w:t>True</w:t>
+              <w:t>Yes</w:t>
             </w:r>
           </w:p>
         </w:tc>
@@ -1323,7 +1353,7 @@
               <w:rPr>
                 <w:sz w:val="17"/>
               </w:rPr>
-              <w:t>Logistic regression (age, female, urban)</w:t>
+              <w:t>Logistic regression (age, sex, area only)</w:t>
             </w:r>
           </w:p>
         </w:tc>
@@ -1336,7 +1366,7 @@
               <w:rPr>
                 <w:sz w:val="17"/>
               </w:rPr>
-              <w:t>False</w:t>
+              <w:t>No</w:t>
             </w:r>
           </w:p>
         </w:tc>
@@ -1455,7 +1485,7 @@
               <w:rPr>
                 <w:sz w:val="17"/>
               </w:rPr>
-              <w:t>Logistic regression (age, female, urban)</w:t>
+              <w:t>Logistic regression (age, sex, area only)</w:t>
             </w:r>
           </w:p>
         </w:tc>
@@ -1468,7 +1498,7 @@
               <w:rPr>
                 <w:sz w:val="17"/>
               </w:rPr>
-              <w:t>True</w:t>
+              <w:t>Yes</w:t>
             </w:r>
           </w:p>
         </w:tc>
@@ -1600,7 +1630,7 @@
               <w:rPr>
                 <w:sz w:val="17"/>
               </w:rPr>
-              <w:t>False</w:t>
+              <w:t>No</w:t>
             </w:r>
           </w:p>
         </w:tc>
@@ -1732,7 +1762,7 @@
               <w:rPr>
                 <w:sz w:val="17"/>
               </w:rPr>
-              <w:t>True</w:t>
+              <w:t>Yes</w:t>
             </w:r>
           </w:p>
         </w:tc>
@@ -1864,7 +1894,7 @@
               <w:rPr>
                 <w:sz w:val="17"/>
               </w:rPr>
-              <w:t>False</w:t>
+              <w:t>No</w:t>
             </w:r>
           </w:p>
         </w:tc>
@@ -1996,7 +2026,7 @@
               <w:rPr>
                 <w:sz w:val="17"/>
               </w:rPr>
-              <w:t>True</w:t>
+              <w:t>Yes</w:t>
             </w:r>
           </w:p>
         </w:tc>
@@ -2109,7 +2139,12 @@
     <w:p/>
     <w:p>
       <w:r>
-        <w:t>The majority-class benchmark reaches 87.5% accuracy and finds no out-of-school child. The balanced logistic regression trades accuracy (62.0%) for recall (63.4%) at the default cut-off (ROC-AUC 0.674, PR-AUC 0.214). The decision tree ranks children better (ROC-AUC 0.711, PR-AUC 0.236) but, tuned without class weights, almost no leaf exceeds a 50% out-of-school share, so its default-threshold recall is only 4.3%. The threshold, not the learner, decides who is flagged. Applying the ASER sampling weights changes the picture in different directions for different models: ROC-AUC rises from 0.674 to 0.713 for the full logistic model and from 0.711 to 0.749 for the tree, but falls from 0.547 to 0.512 for the demographic-only model. The weights up-weight households that the sample under-represents - predominantly poorer, rural ones - where the household features carry most of their signal and where age, sex and area alone separate least; population-level claims should therefore quote the weighted figures. Hold-out AUCs sit 0.03-0.06 below the CV means: the held-out districts are a harder group, within the fold-to-fold spread observed in CV.</w:t>
+        <w:t>The majority-class baseline reaches 87.5% accuracy and finds nobody. The balanced logistic regression gives up accuracy (62.0%) to reach a recall of 63.4% at the default cut-off, with ROC-AUC 0.674 and PR-AUC 0.214. The decision tree ranks children better (ROC-AUC 0.711, PR-AUC 0.236) but, as explained in section 3, its default-cut-off recall is only 4.3%. The lesson is that the cut-off, not the choice of model, decides who gets flagged.</w:t>
+      </w:r>
+    </w:p>
+    <w:p>
+      <w:r>
+        <w:t>Applying the sampling weights moves the results in different directions for different models. ROC-AUC rises from 0.674 to 0.713 for the full logistic model and from 0.711 to 0.749 for the tree, but falls from 0.547 to 0.512 for the demographic-only model. The weights give more influence to households the sample under-represents, which are mostly poorer and rural. That is exactly where the household features carry most of their information and where age, sex and area alone separate children least. Statements about the national population should therefore quote the weighted figures. Hold-out ROC-AUCs are 0.03-0.06 below the cross-validation averages: the held-out districts happen to be a harder group, but the gap is within the fold-to-fold spread seen in Table 2.</w:t>
       </w:r>
     </w:p>
     <w:p>
@@ -2160,7 +2195,7 @@
           <w:i/>
           <w:sz w:val="18"/>
         </w:rPr>
-        <w:t>Figure 2. ROC and precision-recall curves on the held-out districts.</w:t>
+        <w:t>Figure 2. ROC curves (left) and precision-recall curves (right) on the held-out districts.</w:t>
       </w:r>
     </w:p>
     <w:p>
@@ -2211,7 +2246,7 @@
           <w:i/>
           <w:sz w:val="18"/>
         </w:rPr>
-        <w:t>Figure 3. Confusion matrices at the default 0.5 threshold (counts; row % of each true class).</w:t>
+        <w:t>Figure 3. Confusion matrices at the default 0.5 cut-off. Each cell shows a count and the share of its row.</w:t>
       </w:r>
     </w:p>
     <w:p>
@@ -2219,12 +2254,22 @@
         <w:pStyle w:val="Heading1"/>
       </w:pPr>
       <w:r>
-        <w:t>5. Asymmetric error-cost analysis</w:t>
+        <w:t>5. The two kinds of error and what they cost</w:t>
       </w:r>
     </w:p>
     <w:p>
       <w:r>
-        <w:t>A false negative (model says 'in school', child is out of school) means a child who needs an enrolment or outreach intervention is never visited - the costly error for an education-access programme. A false positive (model says 'out of school', child is enrolled) spends an outreach visit or a stipend slot on a child who did not need it - wasteful but recoverable. We quantify this by pricing a false negative at r false positives (r = 1, 3, 5, 10), sweeping the threshold from 0.05 to 0.95 and computing the expected cost per 1,000 children screened. The operating threshold is a model setting, so it is chosen without touching the hold-out: each tuned pipeline is re-fitted on the five district-grouped training folds, out-of-fold probabilities are collected for every training child, the cost curve is swept on those, and the cost-minimising threshold is then applied once to the hold-out districts. Table 4 reports both the training out-of-fold metrics that drove the choice and the hold-out metrics at that threshold; its last two columns show what the hold-out's own optimum would have been, to make visible how much selecting the threshold on the test set would have flattered the result.</w:t>
+        <w:t>A confusion matrix (a two-by-two table of what the model predicted against what was true) separates two kinds of mistake. A false negative is a child the model marks as 'in school' who is actually out of school: a child who needs an enrolment or outreach visit and never gets one. For an education-access programme this is the costly error. A false positive is a child the model marks as 'out of school' who is actually enrolled: an outreach visit or a stipend slot is spent where it was not needed. This is wasteful but recoverable.</w:t>
+      </w:r>
+    </w:p>
+    <w:p>
+      <w:r>
+        <w:t>To make the trade-off explicit we price a false negative at r false positives, for r equal to 1, 3, 5 and 10, and compute the expected cost per 1,000 children screened (false positives plus r times false negatives, scaled to 1,000 children). We then sweep the cut-off from 0.05 to 0.95 and find the value that minimises this cost for each r.</w:t>
+      </w:r>
+    </w:p>
+    <w:p>
+      <w:r>
+        <w:t>The cut-off is itself a model setting, so it must not be chosen by looking at the hold-out; doing so and then reporting hold-out performance at that value would be circular. Instead, each tuned model was re-fitted on the five district-grouped training folds to produce out-of-fold predictions (a prediction for every training child made by a model that did not see that child), the cost curve was swept on those, and the chosen cut-off was then applied once to the hold-out. Table 4 shows both the training out-of-fold figures that drove each choice and the hold-out figures at that cut-off. Its last two columns show the 'oracle' cut-off (the one that would have minimised cost on the hold-out itself, which we could only know by peeking), so the reader can see how much such peeking would have flattered the result.</w:t>
       </w:r>
     </w:p>
     <w:p>
@@ -2233,7 +2278,7 @@
           <w:b/>
           <w:sz w:val="19"/>
         </w:rPr>
-        <w:t>Table 4. Cost-minimising threshold per cost ratio: chosen on training out-of-fold predictions, then evaluated once on the hold-out</w:t>
+        <w:t>Table 4. Cost-minimising cut-off for each cost ratio, chosen on training out-of-fold predictions and then evaluated once on the hold-out</w:t>
       </w:r>
     </w:p>
     <w:tbl>
@@ -2295,7 +2340,7 @@
                 <w:b/>
                 <w:sz w:val="15"/>
               </w:rPr>
-              <w:t>Threshold (chosen on train OOF)</w:t>
+              <w:t>Cut-off (chosen on training)</w:t>
             </w:r>
           </w:p>
         </w:tc>
@@ -2309,7 +2354,7 @@
                 <w:b/>
                 <w:sz w:val="15"/>
               </w:rPr>
-              <w:t>OOF recall</w:t>
+              <w:t>Train recall</w:t>
             </w:r>
           </w:p>
         </w:tc>
@@ -2323,7 +2368,7 @@
                 <w:b/>
                 <w:sz w:val="15"/>
               </w:rPr>
-              <w:t>OOF precision</w:t>
+              <w:t>Train precision</w:t>
             </w:r>
           </w:p>
         </w:tc>
@@ -2337,7 +2382,7 @@
                 <w:b/>
                 <w:sz w:val="15"/>
               </w:rPr>
-              <w:t>OOF cost/1,000</w:t>
+              <w:t>Train cost/1,000</w:t>
             </w:r>
           </w:p>
         </w:tc>
@@ -2407,7 +2452,7 @@
                 <w:b/>
                 <w:sz w:val="15"/>
               </w:rPr>
-              <w:t>Hold-out oracle thr.</w:t>
+              <w:t>Oracle cut-off</w:t>
             </w:r>
           </w:p>
         </w:tc>
@@ -3740,7 +3785,7 @@
           <w:i/>
           <w:sz w:val="18"/>
         </w:rPr>
-        <w:t>Figure 4. Recall/precision and expected cost versus threshold (cost ratio 5:1). Solid curves are training out-of-fold predictions (used for selection); dashed curves are the hold-out (reported only); dash-dot lines mark the chosen thresholds.</w:t>
+        <w:t>Figure 4. Recall, precision and expected cost against the cut-off (cost ratio 5:1). Solid lines are training out-of-fold predictions, used to choose the cut-off; dashed lines are the hold-out, shown for comparison only; dash-dot lines mark the chosen cut-offs.</w:t>
       </w:r>
     </w:p>
     <w:p>
@@ -3749,7 +3794,7 @@
           <w:b/>
           <w:sz w:val="19"/>
         </w:rPr>
-        <w:t>Table 5. Default versus recommended operating point</w:t>
+        <w:t>Table 5. Default cut-off versus the recommended cut-off, with the result expressed per 1,000 children screened</w:t>
       </w:r>
     </w:p>
     <w:tbl>
@@ -3799,7 +3844,7 @@
                 <w:b/>
                 <w:sz w:val="16"/>
               </w:rPr>
-              <w:t>Threshold</w:t>
+              <w:t>Cut-off</w:t>
             </w:r>
           </w:p>
         </w:tc>
@@ -3813,7 +3858,7 @@
                 <w:b/>
                 <w:sz w:val="16"/>
               </w:rPr>
-              <w:t>t</w:t>
+              <w:t>Value</w:t>
             </w:r>
           </w:p>
         </w:tc>
@@ -3827,7 +3872,7 @@
                 <w:b/>
                 <w:sz w:val="16"/>
               </w:rPr>
-              <w:t>TP</w:t>
+              <w:t>Found (TP)</w:t>
             </w:r>
           </w:p>
         </w:tc>
@@ -3841,7 +3886,7 @@
                 <w:b/>
                 <w:sz w:val="16"/>
               </w:rPr>
-              <w:t>FN</w:t>
+              <w:t>Missed (FN)</w:t>
             </w:r>
           </w:p>
         </w:tc>
@@ -3855,7 +3900,7 @@
                 <w:b/>
                 <w:sz w:val="16"/>
               </w:rPr>
-              <w:t>FP</w:t>
+              <w:t>False alarms (FP)</w:t>
             </w:r>
           </w:p>
         </w:tc>
@@ -3869,7 +3914,7 @@
                 <w:b/>
                 <w:sz w:val="16"/>
               </w:rPr>
-              <w:t>TN</w:t>
+              <w:t>Correctly cleared (TN)</w:t>
             </w:r>
           </w:p>
         </w:tc>
@@ -3939,7 +3984,7 @@
                 <w:b/>
                 <w:sz w:val="16"/>
               </w:rPr>
-              <w:t>Caught/1,000</w:t>
+              <w:t>Found/1,000</w:t>
             </w:r>
           </w:p>
         </w:tc>
@@ -4942,7 +4987,7 @@
           <w:i/>
           <w:sz w:val="18"/>
         </w:rPr>
-        <w:t>Figure 5. Confusion matrices at the recommended thresholds (cost ratio 5:1).</w:t>
+        <w:t>Figure 5. Confusion matrices at the recommended cut-offs (cost ratio 5:1).</w:t>
       </w:r>
     </w:p>
     <w:p>
@@ -4950,7 +4995,7 @@
         <w:pStyle w:val="ListBullet"/>
       </w:pPr>
       <w:r>
-        <w:t>With r = 1 the cheapest policy is to flag nobody: neither model is sharp enough to beat the base rate when a false alarm costs as much as a missed child. The cost framing makes this explicit rather than hiding it behind accuracy.</w:t>
+        <w:t>When a false alarm costs as much as a missed child (r = 1), the cheapest policy is to flag nobody. Neither model is sharp enough to beat the base rate on those terms. The cost framing exposes this honestly instead of hiding it behind an accuracy score.</w:t>
       </w:r>
     </w:p>
     <w:p>
@@ -4958,7 +5003,7 @@
         <w:pStyle w:val="ListBullet"/>
       </w:pPr>
       <w:r>
-        <w:t>At r = 5 the optimum moves to a low threshold. Recommended deployment: the decision tree at threshold 0.16 - per 1,000 children screened it flags 328, catches 78 of the 125 out-of-school children and misses 47 (recall 0.62, precision 0.24), the lowest hold-out expected cost of all policies. The default 0.5 threshold on the same tree would catch only 5 per 1,000.</w:t>
+        <w:t>Once a missed child is weighted 5 times a wasted visit, the best cut-off drops sharply. Our recommendation is the decision tree at a cut-off of 0.16. On the held-out districts, for every 1,000 children screened it flags 328, finds 78 of the 125 who are out of school and misses 47 (recall 0.62, precision 0.24). This is the lowest hold-out cost of any policy examined. The same tree at the default 0.5 cut-off would find only 5 per 1,000.</w:t>
       </w:r>
     </w:p>
     <w:p>
@@ -4966,7 +5011,7 @@
         <w:pStyle w:val="ListBullet"/>
       </w:pPr>
       <w:r>
-        <w:t>Logistic regression at threshold 0.54 is a close second (recall 0.57, precision 0.20, 353 flagged per 1,000) and is preferable where officials must explain why a child was flagged.</w:t>
+        <w:t>Logistic regression at a cut-off of 0.54 is a close second (recall 0.57, precision 0.20, 353 flagged per 1,000). It is the better choice wherever officials must be able to explain, child by child, why someone was flagged, because its reasoning is a fixed list of weighted factors.</w:t>
       </w:r>
     </w:p>
     <w:p>
@@ -4974,7 +5019,7 @@
         <w:pStyle w:val="ListBullet"/>
       </w:pPr>
       <w:r>
-        <w:t>At r = 10 both models flag over half of all children to catch 75%-83%; whether that is acceptable is a budget decision for the programme, which the cost ratio makes explicit.</w:t>
+        <w:t>At r = 10 both models flag more than half of all children in order to find 75%-83% of those out of school. Whether that is affordable is a budget decision for the programme; the cost ratio simply makes the decision explicit.</w:t>
       </w:r>
     </w:p>
     <w:p>
@@ -4982,7 +5027,7 @@
         <w:pStyle w:val="ListBullet"/>
       </w:pPr>
       <w:r>
-        <w:t>Honesty check. Had the threshold been picked on the hold-out itself, the logistic optimum would have been 0.57 with cost 545 per 1,000 against 552 at the training-selected 0.54; for the tree the two coincide at 0.16. The flattery from selecting on the test set is small here (about 1.3% of cost for the logistic model) but it is not zero, which is why all numbers at the recommended threshold - Tables 5-7, Figures 5-6 - use the training-selected value.</w:t>
+        <w:t>Honesty check. Had we chosen the cut-off on the hold-out itself, the logistic regression optimum would have been 0.57 with a cost of 545 per 1,000, against 552 at the training-chosen 0.54; for the tree the two coincide at 0.16. The flattery avoided is small here, about 1.3% of cost for logistic regression, but it is not zero, which is why every figure at the recommended cut-off in Tables 5-7 and Figures 5-6 uses the training-chosen value.</w:t>
       </w:r>
     </w:p>
     <w:p>
@@ -4990,7 +5035,12 @@
         <w:pStyle w:val="Heading2"/>
       </w:pPr>
       <w:r>
-        <w:t>5.1 Misclassified edge cases</w:t>
+        <w:t>5.1 Which children does the model get wrong?</w:t>
+      </w:r>
+    </w:p>
+    <w:p>
+      <w:r>
+        <w:t>Table 6 compares the average characteristics of the children the logistic regression found (true positives), missed (false negatives), wrongly flagged (false positives) and correctly cleared (true negatives) at its recommended cut-off of 0.54. Table 7 breaks performance down by subgroup. FNR is the false-negative rate, the share of out-of-school children in that group who were missed; it equals one minus recall.</w:t>
       </w:r>
     </w:p>
     <w:p>
@@ -4999,7 +5049,7 @@
           <w:b/>
           <w:sz w:val="19"/>
         </w:rPr>
-        <w:t>Table 6. Mean feature values by outcome, logistic regression at threshold 0.54</w:t>
+        <w:t>Table 6. Average characteristics by outcome, logistic regression at cut-off 0.54</w:t>
       </w:r>
     </w:p>
     <w:tbl>
@@ -5027,7 +5077,7 @@
                 <w:b/>
                 <w:sz w:val="17"/>
               </w:rPr>
-              <w:t>Feature (mean)</w:t>
+              <w:t>Feature (group average)</w:t>
             </w:r>
           </w:p>
         </w:tc>
@@ -5041,7 +5091,7 @@
                 <w:b/>
                 <w:sz w:val="17"/>
               </w:rPr>
-              <w:t>True positives</w:t>
+              <w:t>Found (TP)</w:t>
             </w:r>
           </w:p>
         </w:tc>
@@ -5055,7 +5105,7 @@
                 <w:b/>
                 <w:sz w:val="17"/>
               </w:rPr>
-              <w:t>False negatives</w:t>
+              <w:t>Missed (FN)</w:t>
             </w:r>
           </w:p>
         </w:tc>
@@ -5069,7 +5119,7 @@
                 <w:b/>
                 <w:sz w:val="17"/>
               </w:rPr>
-              <w:t>False positives</w:t>
+              <w:t>False alarms (FP)</w:t>
             </w:r>
           </w:p>
         </w:tc>
@@ -5083,7 +5133,7 @@
                 <w:b/>
                 <w:sz w:val="17"/>
               </w:rPr>
-              <w:t>True negatives</w:t>
+              <w:t>Correctly cleared (TN)</w:t>
             </w:r>
           </w:p>
         </w:tc>
@@ -5097,7 +5147,7 @@
                 <w:b/>
                 <w:sz w:val="17"/>
               </w:rPr>
-              <w:t>FN - TP</w:t>
+              <w:t>Missed minus found</w:t>
             </w:r>
           </w:p>
         </w:tc>
@@ -5910,7 +5960,7 @@
           <w:b/>
           <w:sz w:val="19"/>
         </w:rPr>
-        <w:t>Table 7. Logistic-regression performance by subgroup on the held-out districts</w:t>
+        <w:t>Table 7. Logistic regression performance by subgroup on the held-out districts</w:t>
       </w:r>
     </w:p>
     <w:tbl>
@@ -5969,7 +6019,7 @@
                 <w:b/>
                 <w:sz w:val="17"/>
               </w:rPr>
-              <w:t>n (test)</w:t>
+              <w:t>Children (test)</w:t>
             </w:r>
           </w:p>
         </w:tc>
@@ -5983,7 +6033,7 @@
                 <w:b/>
                 <w:sz w:val="17"/>
               </w:rPr>
-              <w:t>Positives</w:t>
+              <w:t>Out of school</w:t>
             </w:r>
           </w:p>
         </w:tc>
@@ -5997,7 +6047,7 @@
                 <w:b/>
                 <w:sz w:val="17"/>
               </w:rPr>
-              <w:t>Prevalence</w:t>
+              <w:t>Share out of school</w:t>
             </w:r>
           </w:p>
         </w:tc>
@@ -7536,12 +7586,17 @@
           <w:i/>
           <w:sz w:val="18"/>
         </w:rPr>
-        <w:t>Figure 6. Recall by subgroup (logistic regression, recommended threshold).</w:t>
+        <w:t>Figure 6. Recall by subgroup, logistic regression at the recommended cut-off.</w:t>
       </w:r>
     </w:p>
     <w:p>
       <w:r>
-        <w:t>The children the model misses look like enrolled children on paper: they are older, far more often urban (44% of false negatives versus 15% of true positives), more often B-form registered, and live in households with more assets, more digital use and better housing. The model has learned 'poor rural household implies out of school' and under-detects out-of-school children in better-off or urban households - plausibly dropouts rather than never-enrolled children, a distinction the current features cannot see. Recall is 0.92 in Balochistan but 0.29 in Sindh and 0.42 in Punjab; 0.31 for urban versus 0.67 for rural children. Islamabad Capital Territory is a single district that fell entirely on the training side of the grouped split, so it has no hold-out estimate; with 52 positives in the whole dataset it is too small for reliable subgroup conclusions.</w:t>
+        <w:t>The children the model misses look like enrolled children on paper. They are older, far more often urban (44% of missed children versus 15% of those found), more often B-form registered, and live in households with more assets, more digital use and better housing. In effect the model has learned the rule 'poor rural household means out of school' and under-detects out-of-school children in better-off or urban households. These are plausibly children who dropped out rather than never enrolled, a distinction the current features cannot see.</w:t>
+      </w:r>
+    </w:p>
+    <w:p>
+      <w:r>
+        <w:t>Recall is 0.92 in Balochistan but only 0.29 in Sindh and 0.42 in Punjab, and 0.31 for urban children against 0.67 for rural children. Islamabad Capital Territory is a single district and fell entirely on the training side of the grouped split, so it has no hold-out result; with only 52 out-of-school children in the whole dataset it is in any case too small for reliable subgroup conclusions.</w:t>
       </w:r>
     </w:p>
     <w:p>
@@ -7549,7 +7604,12 @@
         <w:pStyle w:val="Heading1"/>
       </w:pPr>
       <w:r>
-        <w:t>6. Feature importance and the Milestone 2 hypotheses</w:t>
+        <w:t>6. Which factors drive the predictions, and what that says about the hypotheses</w:t>
+      </w:r>
+    </w:p>
+    <w:p>
+      <w:r>
+        <w:t>We look at importance from three angles, because each answers a slightly different question. Odds ratios from the logistic regression (Table 8) describe the association of each factor with being out of school once the other twelve are held fixed; an odds ratio above 1 raises the odds, below 1 lowers them, and a confidence interval that excludes 1 means the effect is unlikely to be chance. The p-value is the probability of an association at least this strong if there were truly none. The standardised coefficient (the effect of a one-standard-deviation change, which puts factors on different scales onto a common footing) ranks factors by size. Gini importance from the tree (Table 9) measures how much each factor was used to separate the groups. Permutation importance (how much the hold-out ROC-AUC falls when a factor's values are shuffled, destroying its information) measures each factor's unique contribution to ranking children in new districts. The logistic model's McFadden pseudo-R-squared (a 0-to-1 measure of how much better the model fits than a model with no predictors) is 0.118, which is modest.</w:t>
       </w:r>
     </w:p>
     <w:p>
@@ -7558,7 +7618,7 @@
           <w:b/>
           <w:sz w:val="19"/>
         </w:rPr>
-        <w:t>Table 8. Logistic regression odds ratios (raw units, training districts; McFadden pseudo-R2 = 0.118)</w:t>
+        <w:t>Table 8. Logistic regression odds ratios, estimated on the training districts</w:t>
       </w:r>
     </w:p>
     <w:tbl>
@@ -7586,7 +7646,7 @@
                 <w:b/>
                 <w:sz w:val="17"/>
               </w:rPr>
-              <w:t>Feature</w:t>
+              <w:t>Factor</w:t>
             </w:r>
           </w:p>
         </w:tc>
@@ -7614,7 +7674,7 @@
                 <w:b/>
                 <w:sz w:val="17"/>
               </w:rPr>
-              <w:t>CI low</w:t>
+              <w:t>95% CI low</w:t>
             </w:r>
           </w:p>
         </w:tc>
@@ -7628,7 +7688,7 @@
                 <w:b/>
                 <w:sz w:val="17"/>
               </w:rPr>
-              <w:t>CI high</w:t>
+              <w:t>95% CI high</w:t>
             </w:r>
           </w:p>
         </w:tc>
@@ -7656,7 +7716,7 @@
                 <w:b/>
                 <w:sz w:val="17"/>
               </w:rPr>
-              <w:t>Std. coef</w:t>
+              <w:t>Standardised coefficient</w:t>
             </w:r>
           </w:p>
         </w:tc>
@@ -8735,7 +8795,7 @@
                 <w:b/>
                 <w:sz w:val="17"/>
               </w:rPr>
-              <w:t>Feature</w:t>
+              <w:t>Factor</w:t>
             </w:r>
           </w:p>
         </w:tc>
@@ -8763,7 +8823,7 @@
                 <w:b/>
                 <w:sz w:val="17"/>
               </w:rPr>
-              <w:t>Permutation AUC drop (LR)</w:t>
+              <w:t>Permutation ROC-AUC drop (logistic)</w:t>
             </w:r>
           </w:p>
         </w:tc>
@@ -8777,7 +8837,7 @@
                 <w:b/>
                 <w:sz w:val="17"/>
               </w:rPr>
-              <w:t>Permutation AUC drop (tree)</w:t>
+              <w:t>Permutation ROC-AUC drop (tree)</w:t>
             </w:r>
           </w:p>
         </w:tc>
@@ -9534,7 +9594,7 @@
           <w:i/>
           <w:sz w:val="18"/>
         </w:rPr>
-        <w:t>Figure 7. Odds ratios with 95% confidence intervals.</w:t>
+        <w:t>Figure 7. Odds ratios with 95% confidence intervals. Points to the right of 1 raise the odds of being out of school.</w:t>
       </w:r>
     </w:p>
     <w:p>
@@ -9585,7 +9645,7 @@
           <w:i/>
           <w:sz w:val="18"/>
         </w:rPr>
-        <w:t>Figure 8. Standardised coefficients, Gini importance and permutation importance.</w:t>
+        <w:t>Figure 8. Standardised coefficients, Gini importance and permutation importance side by side.</w:t>
       </w:r>
     </w:p>
     <w:p>
@@ -9636,7 +9696,7 @@
           <w:i/>
           <w:sz w:val="18"/>
         </w:rPr>
-        <w:t>Figure 9. Predicted out-of-school probability by gender and area (H4).</w:t>
+        <w:t>Figure 9. Predicted probability of being out of school for boys and girls in rural and urban areas (H4).</w:t>
       </w:r>
     </w:p>
     <w:p>
@@ -9645,7 +9705,7 @@
           <w:b/>
           <w:sz w:val="19"/>
         </w:rPr>
-        <w:t>Table 10. Evidence for the five hypotheses</w:t>
+        <w:t>Table 10. Evidence for the five Milestone 2 hypotheses (null rejected at the 5% level)</w:t>
       </w:r>
     </w:p>
     <w:tbl>
@@ -9704,7 +9764,7 @@
                 <w:b/>
                 <w:sz w:val="17"/>
               </w:rPr>
-              <w:t>H1 expects</w:t>
+              <w:t>What H1 expects</w:t>
             </w:r>
           </w:p>
         </w:tc>
@@ -9788,7 +9848,7 @@
                 <w:b/>
                 <w:sz w:val="17"/>
               </w:rPr>
-              <w:t>H0 rejected</w:t>
+              <w:t>Null rejected</w:t>
             </w:r>
           </w:p>
         </w:tc>
@@ -9907,7 +9967,7 @@
               <w:rPr>
                 <w:sz w:val="17"/>
               </w:rPr>
-              <w:t>True</w:t>
+              <w:t>Yes</w:t>
             </w:r>
           </w:p>
         </w:tc>
@@ -10026,7 +10086,7 @@
               <w:rPr>
                 <w:sz w:val="17"/>
               </w:rPr>
-              <w:t>True</w:t>
+              <w:t>Yes</w:t>
             </w:r>
           </w:p>
         </w:tc>
@@ -10145,7 +10205,7 @@
               <w:rPr>
                 <w:sz w:val="17"/>
               </w:rPr>
-              <w:t>True</w:t>
+              <w:t>Yes</w:t>
             </w:r>
           </w:p>
         </w:tc>
@@ -10264,7 +10324,7 @@
               <w:rPr>
                 <w:sz w:val="17"/>
               </w:rPr>
-              <w:t>True</w:t>
+              <w:t>Yes</w:t>
             </w:r>
           </w:p>
         </w:tc>
@@ -10383,7 +10443,7 @@
               <w:rPr>
                 <w:sz w:val="17"/>
               </w:rPr>
-              <w:t>True</w:t>
+              <w:t>Yes</w:t>
             </w:r>
           </w:p>
         </w:tc>
@@ -10395,7 +10455,7 @@
         <w:pStyle w:val="ListBullet"/>
       </w:pPr>
       <w:r>
-        <w:t>H1 Poverty (assets_n): OR 0.964 per additional asset, CI excluding 1; Gini rank 4. The direction is as hypothesised, but the per-asset effect is small - housing structure (OR 0.56 per step kachha to pacca) and digital access (OR 0.82 per service) are the dominant poverty signals in both learners. H0 rejected; the asset count is a weaker poverty proxy than housing.</w:t>
+        <w:t>H1 Poverty (asset count). The odds ratio is 0.964 per additional asset and its interval excludes 1, so the direction is as hypothesised, but the effect per asset is small; the count ranks 4th in Gini importance. Housing structure (odds ratio 0.56 per step from kachha to pacca) and digital access (odds ratio 0.82 per service) are the dominant poverty signals in both models. The null is rejected, with the qualification that the asset count is a weaker measure of poverty than housing.</w:t>
       </w:r>
     </w:p>
     <w:p>
@@ -10403,7 +10463,7 @@
         <w:pStyle w:val="ListBullet"/>
       </w:pPr>
       <w:r>
-        <w:t>H2 Legal identity (bform): OR 0.753 for registered children, i.e. 1.33x higher odds without a B-form, significant and consistent across coefficient, Gini and permutation views. H0 rejected.</w:t>
+        <w:t>H2 Legal identity (B-form). Registered children have an odds ratio of 0.753, which means unregistered children have about 1.33 times the odds of being out of school. The result is significant and consistent across all three importance views. The null is rejected.</w:t>
       </w:r>
     </w:p>
     <w:p>
@@ -10411,7 +10471,7 @@
         <w:pStyle w:val="ListBullet"/>
       </w:pPr>
       <w:r>
-        <w:t>H3 Disability (any_disability): OR 1.88, the largest single risk factor after Balochistan residence. H0 rejected.</w:t>
+        <w:t>H3 Disability. Children with a functional difficulty have an odds ratio of 1.88, the largest single risk factor after living in Balochistan. The null is rejected.</w:t>
       </w:r>
     </w:p>
     <w:p>
@@ -10419,7 +10479,7 @@
         <w:pStyle w:val="ListBullet"/>
       </w:pPr>
       <w:r>
-        <w:t>H4 Gender x area (female_x_urban): interaction OR 0.769, CI excluding 1. Girls face higher odds everywhere, but the predicted girl-boy gap is 8.8 percentage points in rural areas against 3.3 in urban areas: the gender penalty is a rural phenomenon. The tree barely uses the interaction term because it recreates it through sequential splits. H0 rejected.</w:t>
+        <w:t>H4 Gender by area. The interaction term has an odds ratio of 0.769 with an interval excluding 1. Girls face higher odds everywhere, but the predicted girl-boy gap is 8.8 percentage points in rural areas and only 3.3 in urban areas (Figure 9): the gender penalty is mainly a rural phenomenon. The tree hardly uses the interaction column because it reproduces the same pattern through successive splits. The null is rejected.</w:t>
       </w:r>
     </w:p>
     <w:p>
@@ -10427,7 +10487,7 @@
         <w:pStyle w:val="ListBullet"/>
       </w:pPr>
       <w:r>
-        <w:t>H5 Feature value: +0.150 AUC in cross-validation (every fold, p = 0.010) and +0.127 on hold-out. H0 rejected.</w:t>
+        <w:t>H5 Feature value. The full model gains +0.150 ROC-AUC in cross-validation, in every fold, and +0.127 on the hold-out with a bootstrap interval that excludes zero. The null is rejected.</w:t>
       </w:r>
     </w:p>
     <w:p>
@@ -10435,7 +10495,15 @@
         <w:pStyle w:val="ListBullet"/>
       </w:pPr>
       <w:r>
-        <w:t>Controls: Balochistan residence raises the odds 1.79x even after the household variables; age has a small negative coefficient within the 5-16 window; the ICT dummy is not significant (807 children). Note that Balochistan has the largest positive standardised coefficient in the logistic model yet close to zero permutation importance on the hold-out (Table 9), and Sindh's permutation importance is slightly negative. The province dummies overlap heavily with housing quality and digital access (kachha, disconnected households are concentrated in Balochistan), so shuffling a province flag costs little once the household variables remain; the coefficient measures the province's conditional association, the permutation drop its unique contribution to ranking children in new districts. The two views disagree because the information is shared, not because one is wrong.</w:t>
+        <w:t>Control variables. Living in Balochistan multiplies the odds by 1.79 even after the household factors are accounted for; age has a small negative coefficient within the 5-16 window; the Islamabad indicator is not significant (807 children).</w:t>
+      </w:r>
+    </w:p>
+    <w:p>
+      <w:pPr>
+        <w:pStyle w:val="ListBullet"/>
+      </w:pPr>
+      <w:r>
+        <w:t>Why two importance measures disagree about Balochistan. Balochistan has the largest positive standardised coefficient in the logistic model yet almost no permutation importance on the hold-out, and Sindh's permutation importance is slightly negative. The province indicators overlap heavily with housing quality and digital access, a situation called collinearity (two or more predictors carrying much the same information): kachha, disconnected households are concentrated in Balochistan. Shuffling a province flag therefore costs little while the household variables remain. The coefficient measures the province's association given everything else; the permutation drop measures what is lost when only that factor is removed. They disagree because the information is shared, not because either is wrong.</w:t>
       </w:r>
     </w:p>
     <w:p>
@@ -10443,12 +10511,12 @@
         <w:pStyle w:val="Heading1"/>
       </w:pPr>
       <w:r>
-        <w:t>7. Initial policy takeaways</w:t>
+        <w:t>7. What this means for policy, with an important caveat</w:t>
       </w:r>
     </w:p>
     <w:p>
       <w:r>
-        <w:t>A caveat before the recommendations. ASER is a single cross-sectional household survey, and every driver above is an association conditional on the other twelve features, not an estimated causal effect. The B-form result is the clearest example: children without a registration are more likely to be out of school, but households that are more engaged with public services may obtain both the document and a school place for reasons unrelated to the document itself, in which case issuing B-forms alone would not move enrolment. The same reasoning applies to housing, digital access and disability. The takeaways below therefore identify where and for whom out-of-school risk concentrates - which is what a targeting model can legitimately inform - and name candidate levers whose causal effect would need to be established (for instance through a piloted or staggered roll-out) before being relied on as policy.</w:t>
+        <w:t>A caveat before the recommendations. ASER is a single cross-sectional survey (a snapshot of many households at one point in time, with no follow-up). Every factor above is therefore an association (two things tending to occur together), not an estimated causal effect (proof that changing one thing would change the other). The B-form result is the clearest example. Children without a registration are more likely to be out of school, but households that are more engaged with public services may obtain both the document and a school place for reasons unrelated to the document itself. If so, issuing B-forms on their own would not raise enrolment. The same reasoning applies to housing, digital access and disability. The points below therefore describe where and for whom out-of-school risk concentrates, which is what a targeting model can legitimately inform, and name candidate levers whose causal effect would have to be established, for example through a piloted or staggered roll-out, before being relied on as policy.</w:t>
       </w:r>
     </w:p>
     <w:p>
@@ -10456,7 +10524,7 @@
         <w:pStyle w:val="ListBullet"/>
       </w:pPr>
       <w:r>
-        <w:t>Target by housing and connectivity, not just an asset count. Housing quality and digital access are the strongest household predictors of out-of-school status; outreach lists built from a simple asset score will miss children in kachha, disconnected homes.</w:t>
+        <w:t>Target by housing and connectivity, not only by an asset count. Housing quality and digital access are the strongest household predictors of being out of school. Outreach lists built from a simple asset score would miss children in kachha, disconnected homes.</w:t>
       </w:r>
     </w:p>
     <w:p>
@@ -10464,7 +10532,7 @@
         <w:pStyle w:val="ListBullet"/>
       </w:pPr>
       <w:r>
-        <w:t>Birth registration is a candidate lever and a targeting marker. Unregistered children have about 1.3x the odds of being out of school; at minimum, NADRA B-form records identify a population the model flags as high-risk, and a joint registration-plus-enrolment drive is a testable intervention.</w:t>
+        <w:t>Birth registration is a candidate lever and a practical targeting marker. Unregistered children have about 1.3 times the odds of being out of school. At minimum, NADRA records identify a population the model flags as high-risk; a combined registration-and-enrolment drive is a testable intervention rather than a proven one.</w:t>
       </w:r>
     </w:p>
     <w:p>
@@ -10472,7 +10540,7 @@
         <w:pStyle w:val="ListBullet"/>
       </w:pPr>
       <w:r>
-        <w:t>Disability inclusion is a first-order gap (SDG 4.5). Children with a functional difficulty have about 1.9x the odds; screening and inclusive-school capacity belong in any enrolment drive.</w:t>
+        <w:t>Disability inclusion is a first-order gap (SDG 4.5). Children with a functional difficulty have about 1.9 times the odds of being out of school. Screening and inclusive-school capacity belong in any enrolment drive.</w:t>
       </w:r>
     </w:p>
     <w:p>
@@ -10480,7 +10548,7 @@
         <w:pStyle w:val="ListBullet"/>
       </w:pPr>
       <w:r>
-        <w:t>The gender gap is rural. Girl-focused interventions should be prioritised in rural areas, where the predicted penalty is almost three times the urban one.</w:t>
+        <w:t>The gender gap is rural. Girl-focused measures should be prioritised in rural areas, where the predicted penalty is almost three times the urban one.</w:t>
       </w:r>
     </w:p>
     <w:p>
@@ -10488,7 +10556,7 @@
         <w:pStyle w:val="ListBullet"/>
       </w:pPr>
       <w:r>
-        <w:t>Balochistan needs a province-level response: residence there nearly doubles the odds after household factors are accounted for.</w:t>
+        <w:t>Balochistan needs a province-level response. Living there nearly doubles the odds even after household factors are accounted for.</w:t>
       </w:r>
     </w:p>
     <w:p>
@@ -10496,7 +10564,7 @@
         <w:pStyle w:val="ListBullet"/>
       </w:pPr>
       <w:r>
-        <w:t>Set the operating threshold explicitly and choose it on training data. At a 5:1 cost ratio the recommended policy flags about 33% of children and catches 62% of out-of-school children on unseen districts; the default 0.5 threshold is not a defensible choice for outreach.</w:t>
+        <w:t>Set the operating cut-off deliberately, and choose it on training data. At a 5:1 cost ratio the recommended policy flags about 33% of children and finds 62% of those out of school in districts the model has never seen. The default cut-off of 0.5 is not a defensible choice for outreach.</w:t>
       </w:r>
     </w:p>
     <w:p>
@@ -10504,7 +10572,7 @@
         <w:pStyle w:val="Heading1"/>
       </w:pPr>
       <w:r>
-        <w:t>8. Limitations and roadmap for Milestone 04</w:t>
+        <w:t>8. Limitations and the plan for Milestone 04</w:t>
       </w:r>
     </w:p>
     <w:p>
@@ -10517,7 +10585,7 @@
         <w:pStyle w:val="ListBullet"/>
       </w:pPr>
       <w:r>
-        <w:t>Modest discrimination / underfitting: hold-out ROC-AUC 0.67-0.71 and pseudo-R2 0.12. Thirteen household features cannot separate the harder cases (urban or better-off dropouts); the missing signal is likely school-side (distance, supply, cost) and child history.</w:t>
+        <w:t>Modest discrimination (the ability to tell the two groups apart): hold-out ROC-AUC of 0.67-0.71 and a pseudo-R-squared of 0.12. This is a sign of underfitting (the model is too simple for the pattern). Thirteen household features cannot separate the harder cases, especially urban or better-off dropouts; the missing information is probably on the school side (distance, supply, cost) and in the child's history.</w:t>
       </w:r>
     </w:p>
     <w:p>
@@ -10525,7 +10593,7 @@
         <w:pStyle w:val="ListBullet"/>
       </w:pPr>
       <w:r>
-        <w:t>Class imbalance is handled with class weights and threshold tuning, not resampling; precision stays near 0.2 at useful recall levels.</w:t>
+        <w:t>Class imbalance is handled with class weights and the choice of cut-off, not by resampling (artificially balancing the training data). Precision stays near 0.2 at useful levels of recall, so roughly four in five flagged children would turn out to be enrolled.</w:t>
       </w:r>
     </w:p>
     <w:p>
@@ -10533,7 +10601,7 @@
         <w:pStyle w:val="ListBullet"/>
       </w:pPr>
       <w:r>
-        <w:t>District heterogeneity: CV standard deviation of about 0.05 AUC between district groups; the hold-out fold is harder than the CV average.</w:t>
+        <w:t>District heterogeneity: performance varies by about 0.05 ROC-AUC between groups of districts, and the held-out districts were harder than the cross-validation average.</w:t>
       </w:r>
     </w:p>
     <w:p>
@@ -10541,7 +10609,7 @@
         <w:pStyle w:val="ListBullet"/>
       </w:pPr>
       <w:r>
-        <w:t>Potential demographic bias: recall differs sharply by area, province and B-form status. Girls and disabled children are currently caught more often than their counterparts because they carry higher predicted risk, which is itself a fairness question.</w:t>
+        <w:t>Potential demographic bias: recall differs sharply by area, province and B-form status. Girls and children with disabilities are currently found more often than their counterparts because the model assigns them higher risk, which is itself a fairness question to examine rather than assume is benign.</w:t>
       </w:r>
     </w:p>
     <w:p>
@@ -10549,7 +10617,7 @@
         <w:pStyle w:val="ListBullet"/>
       </w:pPr>
       <w:r>
-        <w:t>Associational evidence only: the drivers are conditional associations in one cross-sectional survey; none of the policy levers has an estimated causal effect (section 7).</w:t>
+        <w:t>Associational evidence only: the drivers are conditional associations from one survey, and no policy lever has an estimated causal effect (section 7).</w:t>
       </w:r>
     </w:p>
     <w:p>
@@ -10557,7 +10625,7 @@
         <w:pStyle w:val="ListBullet"/>
       </w:pPr>
       <w:r>
-        <w:t>The H5 paired t-test rests on five folds; the district-cluster bootstrap of the hold-out gain (section 3.1) is the sturdier statement, and both agree.</w:t>
+        <w:t>Thin inference for H5: the paired t-test rests on five folds. The district-cluster bootstrap of the hold-out gain is the sturdier statement, and the two agree.</w:t>
       </w:r>
     </w:p>
     <w:p>
@@ -10570,7 +10638,7 @@
         <w:pStyle w:val="ListBullet"/>
       </w:pPr>
       <w:r>
-        <w:t>Fairness audit using the subgroup frame in subgroup_counts.csv: recall, precision and false-negative rate for girls vs boys, rural vs urban, with vs without disability, and by province, with bootstrap confidence intervals; test whether per-group thresholds or reweighting close the urban and Punjab/Sindh recall gaps. Islamabad Capital Territory (n = 807, 52 positives) is too small for reliable group conclusions and will be reported but not acted on.</w:t>
+        <w:t>A fairness audit (a systematic check of whether the model's errors fall unevenly on particular groups) using the subgroup frame in subgroup_counts.csv: recall, precision and false-negative rate for girls versus boys, rural versus urban, with versus without a disability, and by province, each with bootstrap confidence intervals. We will test whether group-specific cut-offs or reweighting close the urban and Punjab/Sindh recall gaps. Islamabad Capital Territory (807 children, 52 out of school) is too small for reliable group conclusions and will be reported but not acted on.</w:t>
       </w:r>
     </w:p>
     <w:p>
@@ -10578,7 +10646,7 @@
         <w:pStyle w:val="ListBullet"/>
       </w:pPr>
       <w:r>
-        <w:t>Advanced modelling: gradient boosting and random forest under the same district-grouped CV; probability calibration; interaction terms suggested by the tree; a cost-sensitive objective aligned with the FN:FP ratio.</w:t>
+        <w:t>Stronger models under the same district-grouped cross-validation: random forests and gradient boosting (ensembles that combine many trees and usually predict better than a single tree); calibration (checking that a predicted 30% really means about 30%); interaction terms suggested by the tree; and a cost-sensitive objective (training the model to minimise the weighted error cost directly rather than fixing it afterwards with a cut-off).</w:t>
       </w:r>
     </w:p>
     <w:p>
@@ -10586,7 +10654,7 @@
         <w:pStyle w:val="ListBullet"/>
       </w:pPr>
       <w:r>
-        <w:t>Ethical evaluation: harms of mis-targeting (stigma from false flags, exclusion from missed children), use of survey weights for population-level claims, and a deployment note on who sets the cost ratio.</w:t>
+        <w:t>An ethical evaluation covering the harms of mis-targeting (stigma from a false flag, exclusion from a missed child), the use of survey weights for any population-level claim, and a deployment note on who should set the cost ratio and how.</w:t>
       </w:r>
     </w:p>
     <w:p>
@@ -10599,9 +10667,1095 @@
     </w:p>
     <w:p>
       <w:r>
-        <w:t>Code: milestone3/src (config, data, cv, models, evaluate, importance, plots, run_all, make_report) and the executed notebook Milestone03_BaselineModels.ipynb. `python src/run_all.py` regenerates every table (outputs/tables) and figure (outputs/figures) from aser2025_training.csv with random state 42; `python src/make_report.py` rebuilds this document.</w:t>
+        <w:t>Code: milestone3/src (config, data, cv, models, evaluate, importance, plots, run_all, make_report) and the executed notebook Milestone03_BaselineModels.ipynb. Running src/run_all.py regenerates every table (outputs/tables) and figure (outputs/figures) from data/aser2025_training.csv with a fixed random seed of 42, so all results are exactly repeatable; src/make_report.py rebuilds this document from those outputs.</w:t>
       </w:r>
     </w:p>
+    <w:p>
+      <w:pPr>
+        <w:pStyle w:val="Heading1"/>
+      </w:pPr>
+      <w:r>
+        <w:t>Glossary of terms used in this section</w:t>
+      </w:r>
+    </w:p>
+    <w:tbl>
+      <w:tblPr>
+        <w:tblStyle w:val="LightGrid-Accent1"/>
+        <w:tblW w:type="auto" w:w="0"/>
+        <w:tblLook w:firstColumn="1" w:firstRow="1" w:lastColumn="0" w:lastRow="0" w:noHBand="0" w:noVBand="1" w:val="04A0"/>
+      </w:tblPr>
+      <w:tblGrid>
+        <w:gridCol w:w="4320"/>
+        <w:gridCol w:w="4320"/>
+      </w:tblGrid>
+      <w:tr>
+        <w:tc>
+          <w:tcPr>
+            <w:tcW w:type="dxa" w:w="4320"/>
+          </w:tcPr>
+          <w:p>
+            <w:r>
+              <w:rPr>
+                <w:b/>
+                <w:sz w:val="17"/>
+              </w:rPr>
+              <w:t>Term</w:t>
+            </w:r>
+          </w:p>
+        </w:tc>
+        <w:tc>
+          <w:tcPr>
+            <w:tcW w:type="dxa" w:w="4320"/>
+          </w:tcPr>
+          <w:p>
+            <w:r>
+              <w:rPr>
+                <w:b/>
+                <w:sz w:val="17"/>
+              </w:rPr>
+              <w:t>Meaning</w:t>
+            </w:r>
+          </w:p>
+        </w:tc>
+      </w:tr>
+      <w:tr>
+        <w:tc>
+          <w:tcPr>
+            <w:tcW w:type="dxa" w:w="4320"/>
+          </w:tcPr>
+          <w:p>
+            <w:r>
+              <w:rPr>
+                <w:sz w:val="17"/>
+              </w:rPr>
+              <w:t>Target variable</w:t>
+            </w:r>
+          </w:p>
+        </w:tc>
+        <w:tc>
+          <w:tcPr>
+            <w:tcW w:type="dxa" w:w="4320"/>
+          </w:tcPr>
+          <w:p>
+            <w:r>
+              <w:rPr>
+                <w:sz w:val="17"/>
+              </w:rPr>
+              <w:t>The outcome column the model learns to predict; here out_of_school.</w:t>
+            </w:r>
+          </w:p>
+        </w:tc>
+      </w:tr>
+      <w:tr>
+        <w:tc>
+          <w:tcPr>
+            <w:tcW w:type="dxa" w:w="4320"/>
+          </w:tcPr>
+          <w:p>
+            <w:r>
+              <w:rPr>
+                <w:sz w:val="17"/>
+              </w:rPr>
+              <w:t>Predictor / feature</w:t>
+            </w:r>
+          </w:p>
+        </w:tc>
+        <w:tc>
+          <w:tcPr>
+            <w:tcW w:type="dxa" w:w="4320"/>
+          </w:tcPr>
+          <w:p>
+            <w:r>
+              <w:rPr>
+                <w:sz w:val="17"/>
+              </w:rPr>
+              <w:t>An input column the model uses to make its prediction.</w:t>
+            </w:r>
+          </w:p>
+        </w:tc>
+      </w:tr>
+      <w:tr>
+        <w:tc>
+          <w:tcPr>
+            <w:tcW w:type="dxa" w:w="4320"/>
+          </w:tcPr>
+          <w:p>
+            <w:r>
+              <w:rPr>
+                <w:sz w:val="17"/>
+              </w:rPr>
+              <w:t>Class imbalance</w:t>
+            </w:r>
+          </w:p>
+        </w:tc>
+        <w:tc>
+          <w:tcPr>
+            <w:tcW w:type="dxa" w:w="4320"/>
+          </w:tcPr>
+          <w:p>
+            <w:r>
+              <w:rPr>
+                <w:sz w:val="17"/>
+              </w:rPr>
+              <w:t>One outcome is much rarer than the other (13% out of school versus 87% enrolled).</w:t>
+            </w:r>
+          </w:p>
+        </w:tc>
+      </w:tr>
+      <w:tr>
+        <w:tc>
+          <w:tcPr>
+            <w:tcW w:type="dxa" w:w="4320"/>
+          </w:tcPr>
+          <w:p>
+            <w:r>
+              <w:rPr>
+                <w:sz w:val="17"/>
+              </w:rPr>
+              <w:t>Sampling weight</w:t>
+            </w:r>
+          </w:p>
+        </w:tc>
+        <w:tc>
+          <w:tcPr>
+            <w:tcW w:type="dxa" w:w="4320"/>
+          </w:tcPr>
+          <w:p>
+            <w:r>
+              <w:rPr>
+                <w:sz w:val="17"/>
+              </w:rPr>
+              <w:t>A number attached to each surveyed child so the sample represents the national population.</w:t>
+            </w:r>
+          </w:p>
+        </w:tc>
+      </w:tr>
+      <w:tr>
+        <w:tc>
+          <w:tcPr>
+            <w:tcW w:type="dxa" w:w="4320"/>
+          </w:tcPr>
+          <w:p>
+            <w:r>
+              <w:rPr>
+                <w:sz w:val="17"/>
+              </w:rPr>
+              <w:t>One-hot encoding / reference category</w:t>
+            </w:r>
+          </w:p>
+        </w:tc>
+        <w:tc>
+          <w:tcPr>
+            <w:tcW w:type="dxa" w:w="4320"/>
+          </w:tcPr>
+          <w:p>
+            <w:r>
+              <w:rPr>
+                <w:sz w:val="17"/>
+              </w:rPr>
+              <w:t>Turning a category such as province into separate 0/1 columns; the left-out category is the comparison baseline.</w:t>
+            </w:r>
+          </w:p>
+        </w:tc>
+      </w:tr>
+      <w:tr>
+        <w:tc>
+          <w:tcPr>
+            <w:tcW w:type="dxa" w:w="4320"/>
+          </w:tcPr>
+          <w:p>
+            <w:r>
+              <w:rPr>
+                <w:sz w:val="17"/>
+              </w:rPr>
+              <w:t>Training set / hold-out (test) set</w:t>
+            </w:r>
+          </w:p>
+        </w:tc>
+        <w:tc>
+          <w:tcPr>
+            <w:tcW w:type="dxa" w:w="4320"/>
+          </w:tcPr>
+          <w:p>
+            <w:r>
+              <w:rPr>
+                <w:sz w:val="17"/>
+              </w:rPr>
+              <w:t>Data the model learns from / data kept aside and used once for the final evaluation.</w:t>
+            </w:r>
+          </w:p>
+        </w:tc>
+      </w:tr>
+      <w:tr>
+        <w:tc>
+          <w:tcPr>
+            <w:tcW w:type="dxa" w:w="4320"/>
+          </w:tcPr>
+          <w:p>
+            <w:r>
+              <w:rPr>
+                <w:sz w:val="17"/>
+              </w:rPr>
+              <w:t>Cross-validation / fold</w:t>
+            </w:r>
+          </w:p>
+        </w:tc>
+        <w:tc>
+          <w:tcPr>
+            <w:tcW w:type="dxa" w:w="4320"/>
+          </w:tcPr>
+          <w:p>
+            <w:r>
+              <w:rPr>
+                <w:sz w:val="17"/>
+              </w:rPr>
+              <w:t>Repeatedly training on part of the data and checking on the rest; each portion checked is a fold.</w:t>
+            </w:r>
+          </w:p>
+        </w:tc>
+      </w:tr>
+      <w:tr>
+        <w:tc>
+          <w:tcPr>
+            <w:tcW w:type="dxa" w:w="4320"/>
+          </w:tcPr>
+          <w:p>
+            <w:r>
+              <w:rPr>
+                <w:sz w:val="17"/>
+              </w:rPr>
+              <w:t>Stratified / grouped split</w:t>
+            </w:r>
+          </w:p>
+        </w:tc>
+        <w:tc>
+          <w:tcPr>
+            <w:tcW w:type="dxa" w:w="4320"/>
+          </w:tcPr>
+          <w:p>
+            <w:r>
+              <w:rPr>
+                <w:sz w:val="17"/>
+              </w:rPr>
+              <w:t>A split that keeps the outcome share similar on both sides / keeps whole districts on one side.</w:t>
+            </w:r>
+          </w:p>
+        </w:tc>
+      </w:tr>
+      <w:tr>
+        <w:tc>
+          <w:tcPr>
+            <w:tcW w:type="dxa" w:w="4320"/>
+          </w:tcPr>
+          <w:p>
+            <w:r>
+              <w:rPr>
+                <w:sz w:val="17"/>
+              </w:rPr>
+              <w:t>Data leakage</w:t>
+            </w:r>
+          </w:p>
+        </w:tc>
+        <w:tc>
+          <w:tcPr>
+            <w:tcW w:type="dxa" w:w="4320"/>
+          </w:tcPr>
+          <w:p>
+            <w:r>
+              <w:rPr>
+                <w:sz w:val="17"/>
+              </w:rPr>
+              <w:t>Information from the test data influencing the model, which inflates measured performance.</w:t>
+            </w:r>
+          </w:p>
+        </w:tc>
+      </w:tr>
+      <w:tr>
+        <w:tc>
+          <w:tcPr>
+            <w:tcW w:type="dxa" w:w="4320"/>
+          </w:tcPr>
+          <w:p>
+            <w:r>
+              <w:rPr>
+                <w:sz w:val="17"/>
+              </w:rPr>
+              <w:t>Hyperparameter / grid search</w:t>
+            </w:r>
+          </w:p>
+        </w:tc>
+        <w:tc>
+          <w:tcPr>
+            <w:tcW w:type="dxa" w:w="4320"/>
+          </w:tcPr>
+          <w:p>
+            <w:r>
+              <w:rPr>
+                <w:sz w:val="17"/>
+              </w:rPr>
+              <w:t>A setting chosen by the analyst rather than learned / trying every combination from a list.</w:t>
+            </w:r>
+          </w:p>
+        </w:tc>
+      </w:tr>
+      <w:tr>
+        <w:tc>
+          <w:tcPr>
+            <w:tcW w:type="dxa" w:w="4320"/>
+          </w:tcPr>
+          <w:p>
+            <w:r>
+              <w:rPr>
+                <w:sz w:val="17"/>
+              </w:rPr>
+              <w:t>Out-of-fold prediction</w:t>
+            </w:r>
+          </w:p>
+        </w:tc>
+        <w:tc>
+          <w:tcPr>
+            <w:tcW w:type="dxa" w:w="4320"/>
+          </w:tcPr>
+          <w:p>
+            <w:r>
+              <w:rPr>
+                <w:sz w:val="17"/>
+              </w:rPr>
+              <w:t>A prediction for a training child made by a model that did not see that child.</w:t>
+            </w:r>
+          </w:p>
+        </w:tc>
+      </w:tr>
+      <w:tr>
+        <w:tc>
+          <w:tcPr>
+            <w:tcW w:type="dxa" w:w="4320"/>
+          </w:tcPr>
+          <w:p>
+            <w:r>
+              <w:rPr>
+                <w:sz w:val="17"/>
+              </w:rPr>
+              <w:t>Cut-off (threshold)</w:t>
+            </w:r>
+          </w:p>
+        </w:tc>
+        <w:tc>
+          <w:tcPr>
+            <w:tcW w:type="dxa" w:w="4320"/>
+          </w:tcPr>
+          <w:p>
+            <w:r>
+              <w:rPr>
+                <w:sz w:val="17"/>
+              </w:rPr>
+              <w:t>The probability above which a child is flagged as out of school.</w:t>
+            </w:r>
+          </w:p>
+        </w:tc>
+      </w:tr>
+      <w:tr>
+        <w:tc>
+          <w:tcPr>
+            <w:tcW w:type="dxa" w:w="4320"/>
+          </w:tcPr>
+          <w:p>
+            <w:r>
+              <w:rPr>
+                <w:sz w:val="17"/>
+              </w:rPr>
+              <w:t>Accuracy</w:t>
+            </w:r>
+          </w:p>
+        </w:tc>
+        <w:tc>
+          <w:tcPr>
+            <w:tcW w:type="dxa" w:w="4320"/>
+          </w:tcPr>
+          <w:p>
+            <w:r>
+              <w:rPr>
+                <w:sz w:val="17"/>
+              </w:rPr>
+              <w:t>Share of all children classified correctly.</w:t>
+            </w:r>
+          </w:p>
+        </w:tc>
+      </w:tr>
+      <w:tr>
+        <w:tc>
+          <w:tcPr>
+            <w:tcW w:type="dxa" w:w="4320"/>
+          </w:tcPr>
+          <w:p>
+            <w:r>
+              <w:rPr>
+                <w:sz w:val="17"/>
+              </w:rPr>
+              <w:t>Precision</w:t>
+            </w:r>
+          </w:p>
+        </w:tc>
+        <w:tc>
+          <w:tcPr>
+            <w:tcW w:type="dxa" w:w="4320"/>
+          </w:tcPr>
+          <w:p>
+            <w:r>
+              <w:rPr>
+                <w:sz w:val="17"/>
+              </w:rPr>
+              <w:t>Share of flagged children who really are out of school.</w:t>
+            </w:r>
+          </w:p>
+        </w:tc>
+      </w:tr>
+      <w:tr>
+        <w:tc>
+          <w:tcPr>
+            <w:tcW w:type="dxa" w:w="4320"/>
+          </w:tcPr>
+          <w:p>
+            <w:r>
+              <w:rPr>
+                <w:sz w:val="17"/>
+              </w:rPr>
+              <w:t>Recall (sensitivity)</w:t>
+            </w:r>
+          </w:p>
+        </w:tc>
+        <w:tc>
+          <w:tcPr>
+            <w:tcW w:type="dxa" w:w="4320"/>
+          </w:tcPr>
+          <w:p>
+            <w:r>
+              <w:rPr>
+                <w:sz w:val="17"/>
+              </w:rPr>
+              <w:t>Share of truly out-of-school children the model flags.</w:t>
+            </w:r>
+          </w:p>
+        </w:tc>
+      </w:tr>
+      <w:tr>
+        <w:tc>
+          <w:tcPr>
+            <w:tcW w:type="dxa" w:w="4320"/>
+          </w:tcPr>
+          <w:p>
+            <w:r>
+              <w:rPr>
+                <w:sz w:val="17"/>
+              </w:rPr>
+              <w:t>Specificity</w:t>
+            </w:r>
+          </w:p>
+        </w:tc>
+        <w:tc>
+          <w:tcPr>
+            <w:tcW w:type="dxa" w:w="4320"/>
+          </w:tcPr>
+          <w:p>
+            <w:r>
+              <w:rPr>
+                <w:sz w:val="17"/>
+              </w:rPr>
+              <w:t>Share of enrolled children correctly left unflagged.</w:t>
+            </w:r>
+          </w:p>
+        </w:tc>
+      </w:tr>
+      <w:tr>
+        <w:tc>
+          <w:tcPr>
+            <w:tcW w:type="dxa" w:w="4320"/>
+          </w:tcPr>
+          <w:p>
+            <w:r>
+              <w:rPr>
+                <w:sz w:val="17"/>
+              </w:rPr>
+              <w:t>F1</w:t>
+            </w:r>
+          </w:p>
+        </w:tc>
+        <w:tc>
+          <w:tcPr>
+            <w:tcW w:type="dxa" w:w="4320"/>
+          </w:tcPr>
+          <w:p>
+            <w:r>
+              <w:rPr>
+                <w:sz w:val="17"/>
+              </w:rPr>
+              <w:t>A single score that balances precision and recall.</w:t>
+            </w:r>
+          </w:p>
+        </w:tc>
+      </w:tr>
+      <w:tr>
+        <w:tc>
+          <w:tcPr>
+            <w:tcW w:type="dxa" w:w="4320"/>
+          </w:tcPr>
+          <w:p>
+            <w:r>
+              <w:rPr>
+                <w:sz w:val="17"/>
+              </w:rPr>
+              <w:t>ROC-AUC</w:t>
+            </w:r>
+          </w:p>
+        </w:tc>
+        <w:tc>
+          <w:tcPr>
+            <w:tcW w:type="dxa" w:w="4320"/>
+          </w:tcPr>
+          <w:p>
+            <w:r>
+              <w:rPr>
+                <w:sz w:val="17"/>
+              </w:rPr>
+              <w:t>A 0-to-1 score of how well the model ranks out-of-school children above enrolled ones; 0.5 is chance.</w:t>
+            </w:r>
+          </w:p>
+        </w:tc>
+      </w:tr>
+      <w:tr>
+        <w:tc>
+          <w:tcPr>
+            <w:tcW w:type="dxa" w:w="4320"/>
+          </w:tcPr>
+          <w:p>
+            <w:r>
+              <w:rPr>
+                <w:sz w:val="17"/>
+              </w:rPr>
+              <w:t>PR-AUC</w:t>
+            </w:r>
+          </w:p>
+        </w:tc>
+        <w:tc>
+          <w:tcPr>
+            <w:tcW w:type="dxa" w:w="4320"/>
+          </w:tcPr>
+          <w:p>
+            <w:r>
+              <w:rPr>
+                <w:sz w:val="17"/>
+              </w:rPr>
+              <w:t>Like ROC-AUC but focused on the rare class; chance equals the out-of-school share.</w:t>
+            </w:r>
+          </w:p>
+        </w:tc>
+      </w:tr>
+      <w:tr>
+        <w:tc>
+          <w:tcPr>
+            <w:tcW w:type="dxa" w:w="4320"/>
+          </w:tcPr>
+          <w:p>
+            <w:r>
+              <w:rPr>
+                <w:sz w:val="17"/>
+              </w:rPr>
+              <w:t>Confusion matrix</w:t>
+            </w:r>
+          </w:p>
+        </w:tc>
+        <w:tc>
+          <w:tcPr>
+            <w:tcW w:type="dxa" w:w="4320"/>
+          </w:tcPr>
+          <w:p>
+            <w:r>
+              <w:rPr>
+                <w:sz w:val="17"/>
+              </w:rPr>
+              <w:t>A two-by-two table of predicted versus actual outcomes.</w:t>
+            </w:r>
+          </w:p>
+        </w:tc>
+      </w:tr>
+      <w:tr>
+        <w:tc>
+          <w:tcPr>
+            <w:tcW w:type="dxa" w:w="4320"/>
+          </w:tcPr>
+          <w:p>
+            <w:r>
+              <w:rPr>
+                <w:sz w:val="17"/>
+              </w:rPr>
+              <w:t>False negative / false positive</w:t>
+            </w:r>
+          </w:p>
+        </w:tc>
+        <w:tc>
+          <w:tcPr>
+            <w:tcW w:type="dxa" w:w="4320"/>
+          </w:tcPr>
+          <w:p>
+            <w:r>
+              <w:rPr>
+                <w:sz w:val="17"/>
+              </w:rPr>
+              <w:t>A missed out-of-school child / an enrolled child wrongly flagged.</w:t>
+            </w:r>
+          </w:p>
+        </w:tc>
+      </w:tr>
+      <w:tr>
+        <w:tc>
+          <w:tcPr>
+            <w:tcW w:type="dxa" w:w="4320"/>
+          </w:tcPr>
+          <w:p>
+            <w:r>
+              <w:rPr>
+                <w:sz w:val="17"/>
+              </w:rPr>
+              <w:t>Expected cost per 1,000</w:t>
+            </w:r>
+          </w:p>
+        </w:tc>
+        <w:tc>
+          <w:tcPr>
+            <w:tcW w:type="dxa" w:w="4320"/>
+          </w:tcPr>
+          <w:p>
+            <w:r>
+              <w:rPr>
+                <w:sz w:val="17"/>
+              </w:rPr>
+              <w:t>False positives plus r times false negatives, scaled to 1,000 children screened.</w:t>
+            </w:r>
+          </w:p>
+        </w:tc>
+      </w:tr>
+      <w:tr>
+        <w:tc>
+          <w:tcPr>
+            <w:tcW w:type="dxa" w:w="4320"/>
+          </w:tcPr>
+          <w:p>
+            <w:r>
+              <w:rPr>
+                <w:sz w:val="17"/>
+              </w:rPr>
+              <w:t>Odds ratio</w:t>
+            </w:r>
+          </w:p>
+        </w:tc>
+        <w:tc>
+          <w:tcPr>
+            <w:tcW w:type="dxa" w:w="4320"/>
+          </w:tcPr>
+          <w:p>
+            <w:r>
+              <w:rPr>
+                <w:sz w:val="17"/>
+              </w:rPr>
+              <w:t>How many times higher (above 1) or lower (below 1) the odds of the outcome are per unit change in a factor.</w:t>
+            </w:r>
+          </w:p>
+        </w:tc>
+      </w:tr>
+      <w:tr>
+        <w:tc>
+          <w:tcPr>
+            <w:tcW w:type="dxa" w:w="4320"/>
+          </w:tcPr>
+          <w:p>
+            <w:r>
+              <w:rPr>
+                <w:sz w:val="17"/>
+              </w:rPr>
+              <w:t>Confidence interval</w:t>
+            </w:r>
+          </w:p>
+        </w:tc>
+        <w:tc>
+          <w:tcPr>
+            <w:tcW w:type="dxa" w:w="4320"/>
+          </w:tcPr>
+          <w:p>
+            <w:r>
+              <w:rPr>
+                <w:sz w:val="17"/>
+              </w:rPr>
+              <w:t>The range in which the true value very probably lies (here with 95% confidence).</w:t>
+            </w:r>
+          </w:p>
+        </w:tc>
+      </w:tr>
+      <w:tr>
+        <w:tc>
+          <w:tcPr>
+            <w:tcW w:type="dxa" w:w="4320"/>
+          </w:tcPr>
+          <w:p>
+            <w:r>
+              <w:rPr>
+                <w:sz w:val="17"/>
+              </w:rPr>
+              <w:t>p-value</w:t>
+            </w:r>
+          </w:p>
+        </w:tc>
+        <w:tc>
+          <w:tcPr>
+            <w:tcW w:type="dxa" w:w="4320"/>
+          </w:tcPr>
+          <w:p>
+            <w:r>
+              <w:rPr>
+                <w:sz w:val="17"/>
+              </w:rPr>
+              <w:t>The probability of a result at least this strong if there were truly no effect.</w:t>
+            </w:r>
+          </w:p>
+        </w:tc>
+      </w:tr>
+      <w:tr>
+        <w:tc>
+          <w:tcPr>
+            <w:tcW w:type="dxa" w:w="4320"/>
+          </w:tcPr>
+          <w:p>
+            <w:r>
+              <w:rPr>
+                <w:sz w:val="17"/>
+              </w:rPr>
+              <w:t>Standardised coefficient</w:t>
+            </w:r>
+          </w:p>
+        </w:tc>
+        <w:tc>
+          <w:tcPr>
+            <w:tcW w:type="dxa" w:w="4320"/>
+          </w:tcPr>
+          <w:p>
+            <w:r>
+              <w:rPr>
+                <w:sz w:val="17"/>
+              </w:rPr>
+              <w:t>An effect size per one-standard-deviation change, comparable across factors.</w:t>
+            </w:r>
+          </w:p>
+        </w:tc>
+      </w:tr>
+      <w:tr>
+        <w:tc>
+          <w:tcPr>
+            <w:tcW w:type="dxa" w:w="4320"/>
+          </w:tcPr>
+          <w:p>
+            <w:r>
+              <w:rPr>
+                <w:sz w:val="17"/>
+              </w:rPr>
+              <w:t>Gini importance</w:t>
+            </w:r>
+          </w:p>
+        </w:tc>
+        <w:tc>
+          <w:tcPr>
+            <w:tcW w:type="dxa" w:w="4320"/>
+          </w:tcPr>
+          <w:p>
+            <w:r>
+              <w:rPr>
+                <w:sz w:val="17"/>
+              </w:rPr>
+              <w:t>How much a factor was used by the tree to separate the groups.</w:t>
+            </w:r>
+          </w:p>
+        </w:tc>
+      </w:tr>
+      <w:tr>
+        <w:tc>
+          <w:tcPr>
+            <w:tcW w:type="dxa" w:w="4320"/>
+          </w:tcPr>
+          <w:p>
+            <w:r>
+              <w:rPr>
+                <w:sz w:val="17"/>
+              </w:rPr>
+              <w:t>Permutation importance</w:t>
+            </w:r>
+          </w:p>
+        </w:tc>
+        <w:tc>
+          <w:tcPr>
+            <w:tcW w:type="dxa" w:w="4320"/>
+          </w:tcPr>
+          <w:p>
+            <w:r>
+              <w:rPr>
+                <w:sz w:val="17"/>
+              </w:rPr>
+              <w:t>How much performance falls when a factor's values are shuffled.</w:t>
+            </w:r>
+          </w:p>
+        </w:tc>
+      </w:tr>
+      <w:tr>
+        <w:tc>
+          <w:tcPr>
+            <w:tcW w:type="dxa" w:w="4320"/>
+          </w:tcPr>
+          <w:p>
+            <w:r>
+              <w:rPr>
+                <w:sz w:val="17"/>
+              </w:rPr>
+              <w:t>Collinearity</w:t>
+            </w:r>
+          </w:p>
+        </w:tc>
+        <w:tc>
+          <w:tcPr>
+            <w:tcW w:type="dxa" w:w="4320"/>
+          </w:tcPr>
+          <w:p>
+            <w:r>
+              <w:rPr>
+                <w:sz w:val="17"/>
+              </w:rPr>
+              <w:t>Two or more predictors carrying much the same information.</w:t>
+            </w:r>
+          </w:p>
+        </w:tc>
+      </w:tr>
+      <w:tr>
+        <w:tc>
+          <w:tcPr>
+            <w:tcW w:type="dxa" w:w="4320"/>
+          </w:tcPr>
+          <w:p>
+            <w:r>
+              <w:rPr>
+                <w:sz w:val="17"/>
+              </w:rPr>
+              <w:t>Interaction term</w:t>
+            </w:r>
+          </w:p>
+        </w:tc>
+        <w:tc>
+          <w:tcPr>
+            <w:tcW w:type="dxa" w:w="4320"/>
+          </w:tcPr>
+          <w:p>
+            <w:r>
+              <w:rPr>
+                <w:sz w:val="17"/>
+              </w:rPr>
+              <w:t>A column that lets the effect of one factor depend on another (here sex by area).</w:t>
+            </w:r>
+          </w:p>
+        </w:tc>
+      </w:tr>
+      <w:tr>
+        <w:tc>
+          <w:tcPr>
+            <w:tcW w:type="dxa" w:w="4320"/>
+          </w:tcPr>
+          <w:p>
+            <w:r>
+              <w:rPr>
+                <w:sz w:val="17"/>
+              </w:rPr>
+              <w:t>Pseudo-R-squared</w:t>
+            </w:r>
+          </w:p>
+        </w:tc>
+        <w:tc>
+          <w:tcPr>
+            <w:tcW w:type="dxa" w:w="4320"/>
+          </w:tcPr>
+          <w:p>
+            <w:r>
+              <w:rPr>
+                <w:sz w:val="17"/>
+              </w:rPr>
+              <w:t>A 0-to-1 measure of how much better the model fits than one with no predictors.</w:t>
+            </w:r>
+          </w:p>
+        </w:tc>
+      </w:tr>
+      <w:tr>
+        <w:tc>
+          <w:tcPr>
+            <w:tcW w:type="dxa" w:w="4320"/>
+          </w:tcPr>
+          <w:p>
+            <w:r>
+              <w:rPr>
+                <w:sz w:val="17"/>
+              </w:rPr>
+              <w:t>Bootstrap / cluster bootstrap</w:t>
+            </w:r>
+          </w:p>
+        </w:tc>
+        <w:tc>
+          <w:tcPr>
+            <w:tcW w:type="dxa" w:w="4320"/>
+          </w:tcPr>
+          <w:p>
+            <w:r>
+              <w:rPr>
+                <w:sz w:val="17"/>
+              </w:rPr>
+              <w:t>Re-computing a result on many random re-samples / re-sampling whole districts rather than children.</w:t>
+            </w:r>
+          </w:p>
+        </w:tc>
+      </w:tr>
+      <w:tr>
+        <w:tc>
+          <w:tcPr>
+            <w:tcW w:type="dxa" w:w="4320"/>
+          </w:tcPr>
+          <w:p>
+            <w:r>
+              <w:rPr>
+                <w:sz w:val="17"/>
+              </w:rPr>
+              <w:t>Paired t-test</w:t>
+            </w:r>
+          </w:p>
+        </w:tc>
+        <w:tc>
+          <w:tcPr>
+            <w:tcW w:type="dxa" w:w="4320"/>
+          </w:tcPr>
+          <w:p>
+            <w:r>
+              <w:rPr>
+                <w:sz w:val="17"/>
+              </w:rPr>
+              <w:t>A test of whether the average fold-by-fold difference between two models could be zero.</w:t>
+            </w:r>
+          </w:p>
+        </w:tc>
+      </w:tr>
+      <w:tr>
+        <w:tc>
+          <w:tcPr>
+            <w:tcW w:type="dxa" w:w="4320"/>
+          </w:tcPr>
+          <w:p>
+            <w:r>
+              <w:rPr>
+                <w:sz w:val="17"/>
+              </w:rPr>
+              <w:t>Cross-sectional survey</w:t>
+            </w:r>
+          </w:p>
+        </w:tc>
+        <w:tc>
+          <w:tcPr>
+            <w:tcW w:type="dxa" w:w="4320"/>
+          </w:tcPr>
+          <w:p>
+            <w:r>
+              <w:rPr>
+                <w:sz w:val="17"/>
+              </w:rPr>
+              <w:t>A one-time snapshot of many households, with no follow-up over time.</w:t>
+            </w:r>
+          </w:p>
+        </w:tc>
+      </w:tr>
+      <w:tr>
+        <w:tc>
+          <w:tcPr>
+            <w:tcW w:type="dxa" w:w="4320"/>
+          </w:tcPr>
+          <w:p>
+            <w:r>
+              <w:rPr>
+                <w:sz w:val="17"/>
+              </w:rPr>
+              <w:t>Association versus causal effect</w:t>
+            </w:r>
+          </w:p>
+        </w:tc>
+        <w:tc>
+          <w:tcPr>
+            <w:tcW w:type="dxa" w:w="4320"/>
+          </w:tcPr>
+          <w:p>
+            <w:r>
+              <w:rPr>
+                <w:sz w:val="17"/>
+              </w:rPr>
+              <w:t>Two things occurring together versus proof that changing one changes the other.</w:t>
+            </w:r>
+          </w:p>
+        </w:tc>
+      </w:tr>
+      <w:tr>
+        <w:tc>
+          <w:tcPr>
+            <w:tcW w:type="dxa" w:w="4320"/>
+          </w:tcPr>
+          <w:p>
+            <w:r>
+              <w:rPr>
+                <w:sz w:val="17"/>
+              </w:rPr>
+              <w:t>Underfitting</w:t>
+            </w:r>
+          </w:p>
+        </w:tc>
+        <w:tc>
+          <w:tcPr>
+            <w:tcW w:type="dxa" w:w="4320"/>
+          </w:tcPr>
+          <w:p>
+            <w:r>
+              <w:rPr>
+                <w:sz w:val="17"/>
+              </w:rPr>
+              <w:t>A model too simple to capture the pattern in the data.</w:t>
+            </w:r>
+          </w:p>
+        </w:tc>
+      </w:tr>
+      <w:tr>
+        <w:tc>
+          <w:tcPr>
+            <w:tcW w:type="dxa" w:w="4320"/>
+          </w:tcPr>
+          <w:p>
+            <w:r>
+              <w:rPr>
+                <w:sz w:val="17"/>
+              </w:rPr>
+              <w:t>Calibration</w:t>
+            </w:r>
+          </w:p>
+        </w:tc>
+        <w:tc>
+          <w:tcPr>
+            <w:tcW w:type="dxa" w:w="4320"/>
+          </w:tcPr>
+          <w:p>
+            <w:r>
+              <w:rPr>
+                <w:sz w:val="17"/>
+              </w:rPr>
+              <w:t>Whether a predicted probability of 30% really corresponds to about 30% of such children being out of school.</w:t>
+            </w:r>
+          </w:p>
+        </w:tc>
+      </w:tr>
+    </w:tbl>
+    <w:p/>
     <w:sectPr>
       <w:pgSz w:w="12240" w:h="15840"/>
       <w:pgMar w:top="1440" w:right="1800" w:bottom="1440" w:left="1800" w:header="720" w:footer="720" w:gutter="0"/>

</xml_diff>

<commit_message>
Add random forest as third model; thresholds, importance, report, notebook and README updated
</commit_message>
<xml_diff>
--- a/report/Milestone03_Report.docx
+++ b/report/Milestone03_Report.docx
@@ -43,7 +43,7 @@
         <w:pStyle w:val="Heading1"/>
       </w:pPr>
       <w:r>
-        <w:t>2. The three baseline models and why they were chosen</w:t>
+        <w:t>2. The baseline benchmark and the three models, and why they were chosen</w:t>
       </w:r>
     </w:p>
     <w:p>
@@ -68,6 +68,14 @@
       </w:pPr>
       <w:r>
         <w:t>Decision tree (a model that splits the children into groups with a sequence of yes/no questions such as 'is housing kachha?'). It was chosen because it captures non-linear patterns (effects that change in size along a scale) and interactions (effects that depend on other variables, such as the gender gap depending on area) without having to specify them in advance, it is easy to read, and it is quick to train on 161,000 rows. Three settings were tuned: maximum depth (how many questions deep the tree may go), minimum leaf size (the smallest group a final answer may rest on) and class weighting.</w:t>
+      </w:r>
+    </w:p>
+    <w:p>
+      <w:pPr>
+        <w:pStyle w:val="ListBullet"/>
+      </w:pPr>
+      <w:r>
+        <w:t>Random forest (an ensemble, meaning a model made of many models: here 200 decision trees, each grown on a random re-sample of the children and allowed to consider only a random subset of the predictors at each split, whose votes are averaged). It was added because a single tree is unstable (small changes in the data can change its splits) and tends to stop short of the best possible ranking; averaging many de-correlated trees smooths both problems while keeping the same kind of importance measures. It is a distinct learning algorithm from the single tree - bagging (training on bootstrap re-samples) plus random feature selection - and is the natural bridge to the stronger models planned for Milestone 4. Tuned: maximum depth, minimum leaf size and class weighting; the number of trees was fixed at 200.</w:t>
       </w:r>
     </w:p>
     <w:p>
@@ -725,6 +733,112 @@
               <w:rPr>
                 <w:sz w:val="17"/>
               </w:rPr>
+              <w:t>Random forest</w:t>
+            </w:r>
+          </w:p>
+        </w:tc>
+        <w:tc>
+          <w:tcPr>
+            <w:tcW w:type="dxa" w:w="1080"/>
+          </w:tcPr>
+          <w:p>
+            <w:r>
+              <w:rPr>
+                <w:sz w:val="17"/>
+              </w:rPr>
+              <w:t>{"class_weight": null, "max_depth": 12, "min_samples_leaf": 20}</w:t>
+            </w:r>
+          </w:p>
+        </w:tc>
+        <w:tc>
+          <w:tcPr>
+            <w:tcW w:type="dxa" w:w="1080"/>
+          </w:tcPr>
+          <w:p>
+            <w:r>
+              <w:rPr>
+                <w:sz w:val="17"/>
+              </w:rPr>
+              <w:t>0.755</w:t>
+            </w:r>
+          </w:p>
+        </w:tc>
+        <w:tc>
+          <w:tcPr>
+            <w:tcW w:type="dxa" w:w="1080"/>
+          </w:tcPr>
+          <w:p>
+            <w:r>
+              <w:rPr>
+                <w:sz w:val="17"/>
+              </w:rPr>
+              <w:t>0.045</w:t>
+            </w:r>
+          </w:p>
+        </w:tc>
+        <w:tc>
+          <w:tcPr>
+            <w:tcW w:type="dxa" w:w="1080"/>
+          </w:tcPr>
+          <w:p>
+            <w:r>
+              <w:rPr>
+                <w:sz w:val="17"/>
+              </w:rPr>
+              <w:t>0.289</w:t>
+            </w:r>
+          </w:p>
+        </w:tc>
+        <w:tc>
+          <w:tcPr>
+            <w:tcW w:type="dxa" w:w="1080"/>
+          </w:tcPr>
+          <w:p>
+            <w:r>
+              <w:rPr>
+                <w:sz w:val="17"/>
+              </w:rPr>
+              <w:t>0.024</w:t>
+            </w:r>
+          </w:p>
+        </w:tc>
+        <w:tc>
+          <w:tcPr>
+            <w:tcW w:type="dxa" w:w="1080"/>
+          </w:tcPr>
+          <w:p>
+            <w:r>
+              <w:rPr>
+                <w:sz w:val="17"/>
+              </w:rPr>
+              <w:t>0.044</w:t>
+            </w:r>
+          </w:p>
+        </w:tc>
+        <w:tc>
+          <w:tcPr>
+            <w:tcW w:type="dxa" w:w="1080"/>
+          </w:tcPr>
+          <w:p>
+            <w:r>
+              <w:rPr>
+                <w:sz w:val="17"/>
+              </w:rPr>
+              <w:t>0.862</w:t>
+            </w:r>
+          </w:p>
+        </w:tc>
+      </w:tr>
+      <w:tr>
+        <w:tc>
+          <w:tcPr>
+            <w:tcW w:type="dxa" w:w="1080"/>
+          </w:tcPr>
+          <w:p>
+            <w:r>
+              <w:rPr>
+                <w:sz w:val="17"/>
+              </w:rPr>
               <w:t>Logistic regression (age, sex, area only)</w:t>
             </w:r>
           </w:p>
@@ -825,7 +939,7 @@
     <w:p/>
     <w:p>
       <w:r>
-        <w:t>What the tuning showed. For logistic regression the strongest shrinkage (C = 0.001) with balanced class weights was best, with a cross-validated ROC-AUC of 0.736 plus or minus 0.047 (the standard deviation, a measure of how much the score varied from fold to fold). ROC-AUC barely changed across values of C, because with 129,000 training rows the weights are already well determined; class weighting mattered mainly for recall at the default cut-off. For the decision tree a depth of 10 with at least 200 children per leaf and no class weighting was best (ROC-AUC 0.744 plus or minus 0.051; the fitted tree has 221 leaves). Deeper, unconstrained trees memorised district quirks and scored worse on unseen districts. One consequence needs stating now: because the selection criterion was ROC-AUC, which ignores the cut-off, the chosen tree carries no class weighting, and at the default cut-off of 0.5 it flags almost nobody (recall 4.3% on the hold-out, Table 3) because almost no leaf contains a majority of out-of-school children. This is not a flaw in the tree. It is the reason the operating cut-off is chosen separately, and on training data only, in section 5. The full grids are in tables t02-t04.</w:t>
+        <w:t>What the tuning showed. For logistic regression the strongest shrinkage (C = 0.001) with balanced class weights was best, with a cross-validated ROC-AUC of 0.736 plus or minus 0.047 (the standard deviation, a measure of how much the score varied from fold to fold). ROC-AUC barely changed across values of C, because with 129,000 training rows the weights are already well determined; class weighting mattered mainly for recall at the default cut-off. For the decision tree a depth of 10 with at least 200 children per leaf and no class weighting was best (ROC-AUC 0.744 plus or minus 0.051; the fitted tree has 221 leaves). Deeper, unconstrained trees memorised district quirks and scored worse on unseen districts. For the random forest the best settings were a maximum depth of 12, at least 20 children per leaf and no class weighting (ROC-AUC 0.755 plus or minus 0.045), the highest cross-validated score of the three. One consequence needs stating now: because the selection criterion was ROC-AUC, which ignores the cut-off, the chosen tree carries no class weighting, and at the default cut-off of 0.5 it flags almost nobody (recall 4.3% on the hold-out, Table 3) because almost no leaf contains a majority of out-of-school children. This is not a flaw in the tree. It is the reason the operating cut-off is chosen separately, and on training data only, in section 5. The same applies to the forest wherever it was tuned without class weighting. The full grids are in tables t02-t04.</w:t>
       </w:r>
     </w:p>
     <w:p>
@@ -2135,16 +2249,280 @@
           </w:p>
         </w:tc>
       </w:tr>
+      <w:tr>
+        <w:tc>
+          <w:tcPr>
+            <w:tcW w:type="dxa" w:w="864"/>
+          </w:tcPr>
+          <w:p>
+            <w:r>
+              <w:rPr>
+                <w:sz w:val="17"/>
+              </w:rPr>
+              <w:t>Random forest</w:t>
+            </w:r>
+          </w:p>
+        </w:tc>
+        <w:tc>
+          <w:tcPr>
+            <w:tcW w:type="dxa" w:w="864"/>
+          </w:tcPr>
+          <w:p>
+            <w:r>
+              <w:rPr>
+                <w:sz w:val="17"/>
+              </w:rPr>
+              <w:t>No</w:t>
+            </w:r>
+          </w:p>
+        </w:tc>
+        <w:tc>
+          <w:tcPr>
+            <w:tcW w:type="dxa" w:w="864"/>
+          </w:tcPr>
+          <w:p>
+            <w:r>
+              <w:rPr>
+                <w:sz w:val="17"/>
+              </w:rPr>
+              <w:t>0.874</w:t>
+            </w:r>
+          </w:p>
+        </w:tc>
+        <w:tc>
+          <w:tcPr>
+            <w:tcW w:type="dxa" w:w="864"/>
+          </w:tcPr>
+          <w:p>
+            <w:r>
+              <w:rPr>
+                <w:sz w:val="17"/>
+              </w:rPr>
+              <w:t>0.439</w:t>
+            </w:r>
+          </w:p>
+        </w:tc>
+        <w:tc>
+          <w:tcPr>
+            <w:tcW w:type="dxa" w:w="864"/>
+          </w:tcPr>
+          <w:p>
+            <w:r>
+              <w:rPr>
+                <w:sz w:val="17"/>
+              </w:rPr>
+              <w:t>0.036</w:t>
+            </w:r>
+          </w:p>
+        </w:tc>
+        <w:tc>
+          <w:tcPr>
+            <w:tcW w:type="dxa" w:w="864"/>
+          </w:tcPr>
+          <w:p>
+            <w:r>
+              <w:rPr>
+                <w:sz w:val="17"/>
+              </w:rPr>
+              <w:t>0.993</w:t>
+            </w:r>
+          </w:p>
+        </w:tc>
+        <w:tc>
+          <w:tcPr>
+            <w:tcW w:type="dxa" w:w="864"/>
+          </w:tcPr>
+          <w:p>
+            <w:r>
+              <w:rPr>
+                <w:sz w:val="17"/>
+              </w:rPr>
+              <w:t>0.067</w:t>
+            </w:r>
+          </w:p>
+        </w:tc>
+        <w:tc>
+          <w:tcPr>
+            <w:tcW w:type="dxa" w:w="864"/>
+          </w:tcPr>
+          <w:p>
+            <w:r>
+              <w:rPr>
+                <w:sz w:val="17"/>
+              </w:rPr>
+              <w:t>0.725</w:t>
+            </w:r>
+          </w:p>
+        </w:tc>
+        <w:tc>
+          <w:tcPr>
+            <w:tcW w:type="dxa" w:w="864"/>
+          </w:tcPr>
+          <w:p>
+            <w:r>
+              <w:rPr>
+                <w:sz w:val="17"/>
+              </w:rPr>
+              <w:t>0.254</w:t>
+            </w:r>
+          </w:p>
+        </w:tc>
+        <w:tc>
+          <w:tcPr>
+            <w:tcW w:type="dxa" w:w="864"/>
+          </w:tcPr>
+          <w:p>
+            <w:r>
+              <w:rPr>
+                <w:sz w:val="17"/>
+              </w:rPr>
+              <w:t>0.010</w:t>
+            </w:r>
+          </w:p>
+        </w:tc>
+      </w:tr>
+      <w:tr>
+        <w:tc>
+          <w:tcPr>
+            <w:tcW w:type="dxa" w:w="864"/>
+          </w:tcPr>
+          <w:p>
+            <w:r>
+              <w:rPr>
+                <w:sz w:val="17"/>
+              </w:rPr>
+              <w:t>Random forest</w:t>
+            </w:r>
+          </w:p>
+        </w:tc>
+        <w:tc>
+          <w:tcPr>
+            <w:tcW w:type="dxa" w:w="864"/>
+          </w:tcPr>
+          <w:p>
+            <w:r>
+              <w:rPr>
+                <w:sz w:val="17"/>
+              </w:rPr>
+              <w:t>Yes</w:t>
+            </w:r>
+          </w:p>
+        </w:tc>
+        <w:tc>
+          <w:tcPr>
+            <w:tcW w:type="dxa" w:w="864"/>
+          </w:tcPr>
+          <w:p>
+            <w:r>
+              <w:rPr>
+                <w:sz w:val="17"/>
+              </w:rPr>
+              <w:t>0.851</w:t>
+            </w:r>
+          </w:p>
+        </w:tc>
+        <w:tc>
+          <w:tcPr>
+            <w:tcW w:type="dxa" w:w="864"/>
+          </w:tcPr>
+          <w:p>
+            <w:r>
+              <w:rPr>
+                <w:sz w:val="17"/>
+              </w:rPr>
+              <w:t>0.470</w:t>
+            </w:r>
+          </w:p>
+        </w:tc>
+        <w:tc>
+          <w:tcPr>
+            <w:tcW w:type="dxa" w:w="864"/>
+          </w:tcPr>
+          <w:p>
+            <w:r>
+              <w:rPr>
+                <w:sz w:val="17"/>
+              </w:rPr>
+              <w:t>0.031</w:t>
+            </w:r>
+          </w:p>
+        </w:tc>
+        <w:tc>
+          <w:tcPr>
+            <w:tcW w:type="dxa" w:w="864"/>
+          </w:tcPr>
+          <w:p>
+            <w:r>
+              <w:rPr>
+                <w:sz w:val="17"/>
+              </w:rPr>
+              <w:t>0.994</w:t>
+            </w:r>
+          </w:p>
+        </w:tc>
+        <w:tc>
+          <w:tcPr>
+            <w:tcW w:type="dxa" w:w="864"/>
+          </w:tcPr>
+          <w:p>
+            <w:r>
+              <w:rPr>
+                <w:sz w:val="17"/>
+              </w:rPr>
+              <w:t>0.058</w:t>
+            </w:r>
+          </w:p>
+        </w:tc>
+        <w:tc>
+          <w:tcPr>
+            <w:tcW w:type="dxa" w:w="864"/>
+          </w:tcPr>
+          <w:p>
+            <w:r>
+              <w:rPr>
+                <w:sz w:val="17"/>
+              </w:rPr>
+              <w:t>0.755</w:t>
+            </w:r>
+          </w:p>
+        </w:tc>
+        <w:tc>
+          <w:tcPr>
+            <w:tcW w:type="dxa" w:w="864"/>
+          </w:tcPr>
+          <w:p>
+            <w:r>
+              <w:rPr>
+                <w:sz w:val="17"/>
+              </w:rPr>
+              <w:t>0.320</w:t>
+            </w:r>
+          </w:p>
+        </w:tc>
+        <w:tc>
+          <w:tcPr>
+            <w:tcW w:type="dxa" w:w="864"/>
+          </w:tcPr>
+          <w:p>
+            <w:r>
+              <w:rPr>
+                <w:sz w:val="17"/>
+              </w:rPr>
+              <w:t>0.010</w:t>
+            </w:r>
+          </w:p>
+        </w:tc>
+      </w:tr>
     </w:tbl>
     <w:p/>
     <w:p>
       <w:r>
-        <w:t>The majority-class baseline reaches 87.5% accuracy and finds nobody. The balanced logistic regression gives up accuracy (62.0%) to reach a recall of 63.4% at the default cut-off, with ROC-AUC 0.674 and PR-AUC 0.214. The decision tree ranks children better (ROC-AUC 0.711, PR-AUC 0.236) but, as explained in section 3, its default-cut-off recall is only 4.3%. The lesson is that the cut-off, not the choice of model, decides who gets flagged.</w:t>
+        <w:t>The majority-class baseline reaches 87.5% accuracy and finds nobody. The balanced logistic regression gives up accuracy (62.0%) to reach a recall of 63.4% at the default cut-off, with ROC-AUC 0.674 and PR-AUC 0.214. The decision tree ranks children better (ROC-AUC 0.711, PR-AUC 0.236) but, as explained in section 3, its default-cut-off recall is only 4.3%. The random forest ranks children best of all (ROC-AUC 0.725, PR-AUC 0.254) with a default-cut-off recall of 3.6%. The lesson is that the cut-off, not the choice of model, decides who gets flagged.</w:t>
       </w:r>
     </w:p>
     <w:p>
       <w:r>
-        <w:t>Applying the sampling weights moves the results in different directions for different models. ROC-AUC rises from 0.674 to 0.713 for the full logistic model and from 0.711 to 0.749 for the tree, but falls from 0.547 to 0.512 for the demographic-only model. The weights give more influence to households the sample under-represents, which are mostly poorer and rural. That is exactly where the household features carry most of their information and where age, sex and area alone separate children least. Statements about the national population should therefore quote the weighted figures. Hold-out ROC-AUCs are 0.03-0.06 below the cross-validation averages: the held-out districts happen to be a harder group, but the gap is within the fold-to-fold spread seen in Table 2.</w:t>
+        <w:t>Applying the sampling weights moves the results in different directions for different models. ROC-AUC rises from 0.674 to 0.713 for the full logistic model and from 0.711 to 0.749 for the tree and from 0.725 to 0.755 for the forest, but falls from 0.547 to 0.512 for the demographic-only model. The weights give more influence to households the sample under-represents, which are mostly poorer and rural. That is exactly where the household features carry most of their information and where age, sex and area alone separate children least. Statements about the national population should therefore quote the weighted figures. Hold-out ROC-AUCs are 0.03-0.06 below the cross-validation averages: the held-out districts happen to be a harder group, but the gap is within the fold-to-fold spread seen in Table 2.</w:t>
       </w:r>
     </w:p>
     <w:p>
@@ -2205,7 +2583,7 @@
       <w:r>
         <w:drawing>
           <wp:inline xmlns:a="http://schemas.openxmlformats.org/drawingml/2006/main" xmlns:pic="http://schemas.openxmlformats.org/drawingml/2006/picture">
-            <wp:extent cx="5760720" cy="1753059"/>
+            <wp:extent cx="5760720" cy="1309732"/>
             <wp:docPr id="3" name="Picture 3"/>
             <wp:cNvGraphicFramePr>
               <a:graphicFrameLocks noChangeAspect="1"/>
@@ -2226,7 +2604,7 @@
                   <pic:spPr>
                     <a:xfrm>
                       <a:off x="0" y="0"/>
-                      <a:ext cx="5760720" cy="1753059"/>
+                      <a:ext cx="5760720" cy="1309732"/>
                     </a:xfrm>
                     <a:prstGeom prst="rect"/>
                   </pic:spPr>
@@ -3731,6 +4109,638 @@
                 <w:sz w:val="15"/>
               </w:rPr>
               <w:t>669.855</w:t>
+            </w:r>
+          </w:p>
+        </w:tc>
+      </w:tr>
+      <w:tr>
+        <w:tc>
+          <w:tcPr>
+            <w:tcW w:type="dxa" w:w="720"/>
+          </w:tcPr>
+          <w:p>
+            <w:r>
+              <w:rPr>
+                <w:sz w:val="15"/>
+              </w:rPr>
+              <w:t>Random forest</w:t>
+            </w:r>
+          </w:p>
+        </w:tc>
+        <w:tc>
+          <w:tcPr>
+            <w:tcW w:type="dxa" w:w="720"/>
+          </w:tcPr>
+          <w:p>
+            <w:r>
+              <w:rPr>
+                <w:sz w:val="15"/>
+              </w:rPr>
+              <w:t>1</w:t>
+            </w:r>
+          </w:p>
+        </w:tc>
+        <w:tc>
+          <w:tcPr>
+            <w:tcW w:type="dxa" w:w="720"/>
+          </w:tcPr>
+          <w:p>
+            <w:r>
+              <w:rPr>
+                <w:sz w:val="15"/>
+              </w:rPr>
+              <w:t>0.870</w:t>
+            </w:r>
+          </w:p>
+        </w:tc>
+        <w:tc>
+          <w:tcPr>
+            <w:tcW w:type="dxa" w:w="720"/>
+          </w:tcPr>
+          <w:p>
+            <w:r>
+              <w:rPr>
+                <w:sz w:val="15"/>
+              </w:rPr>
+              <w:t>0.000</w:t>
+            </w:r>
+          </w:p>
+        </w:tc>
+        <w:tc>
+          <w:tcPr>
+            <w:tcW w:type="dxa" w:w="720"/>
+          </w:tcPr>
+          <w:p>
+            <w:r>
+              <w:rPr>
+                <w:sz w:val="15"/>
+              </w:rPr>
+              <w:t>0.600</w:t>
+            </w:r>
+          </w:p>
+        </w:tc>
+        <w:tc>
+          <w:tcPr>
+            <w:tcW w:type="dxa" w:w="720"/>
+          </w:tcPr>
+          <w:p>
+            <w:r>
+              <w:rPr>
+                <w:sz w:val="15"/>
+              </w:rPr>
+              <w:t>133.184</w:t>
+            </w:r>
+          </w:p>
+        </w:tc>
+        <w:tc>
+          <w:tcPr>
+            <w:tcW w:type="dxa" w:w="720"/>
+          </w:tcPr>
+          <w:p>
+            <w:r>
+              <w:rPr>
+                <w:sz w:val="15"/>
+              </w:rPr>
+              <w:t>0.000</w:t>
+            </w:r>
+          </w:p>
+        </w:tc>
+        <w:tc>
+          <w:tcPr>
+            <w:tcW w:type="dxa" w:w="720"/>
+          </w:tcPr>
+          <w:p>
+            <w:r>
+              <w:rPr>
+                <w:sz w:val="15"/>
+              </w:rPr>
+              <w:t>-</w:t>
+            </w:r>
+          </w:p>
+        </w:tc>
+        <w:tc>
+          <w:tcPr>
+            <w:tcW w:type="dxa" w:w="720"/>
+          </w:tcPr>
+          <w:p>
+            <w:r>
+              <w:rPr>
+                <w:sz w:val="15"/>
+              </w:rPr>
+              <w:t>0.000</w:t>
+            </w:r>
+          </w:p>
+        </w:tc>
+        <w:tc>
+          <w:tcPr>
+            <w:tcW w:type="dxa" w:w="720"/>
+          </w:tcPr>
+          <w:p>
+            <w:r>
+              <w:rPr>
+                <w:sz w:val="15"/>
+              </w:rPr>
+              <w:t>125.108</w:t>
+            </w:r>
+          </w:p>
+        </w:tc>
+        <w:tc>
+          <w:tcPr>
+            <w:tcW w:type="dxa" w:w="720"/>
+          </w:tcPr>
+          <w:p>
+            <w:r>
+              <w:rPr>
+                <w:sz w:val="15"/>
+              </w:rPr>
+              <w:t>0.730</w:t>
+            </w:r>
+          </w:p>
+        </w:tc>
+        <w:tc>
+          <w:tcPr>
+            <w:tcW w:type="dxa" w:w="720"/>
+          </w:tcPr>
+          <w:p>
+            <w:r>
+              <w:rPr>
+                <w:sz w:val="15"/>
+              </w:rPr>
+              <w:t>125.108</w:t>
+            </w:r>
+          </w:p>
+        </w:tc>
+      </w:tr>
+      <w:tr>
+        <w:tc>
+          <w:tcPr>
+            <w:tcW w:type="dxa" w:w="720"/>
+          </w:tcPr>
+          <w:p>
+            <w:r>
+              <w:rPr>
+                <w:sz w:val="15"/>
+              </w:rPr>
+              <w:t>Random forest</w:t>
+            </w:r>
+          </w:p>
+        </w:tc>
+        <w:tc>
+          <w:tcPr>
+            <w:tcW w:type="dxa" w:w="720"/>
+          </w:tcPr>
+          <w:p>
+            <w:r>
+              <w:rPr>
+                <w:sz w:val="15"/>
+              </w:rPr>
+              <w:t>3</w:t>
+            </w:r>
+          </w:p>
+        </w:tc>
+        <w:tc>
+          <w:tcPr>
+            <w:tcW w:type="dxa" w:w="720"/>
+          </w:tcPr>
+          <w:p>
+            <w:r>
+              <w:rPr>
+                <w:sz w:val="15"/>
+              </w:rPr>
+              <w:t>0.180</w:t>
+            </w:r>
+          </w:p>
+        </w:tc>
+        <w:tc>
+          <w:tcPr>
+            <w:tcW w:type="dxa" w:w="720"/>
+          </w:tcPr>
+          <w:p>
+            <w:r>
+              <w:rPr>
+                <w:sz w:val="15"/>
+              </w:rPr>
+              <w:t>0.572</w:t>
+            </w:r>
+          </w:p>
+        </w:tc>
+        <w:tc>
+          <w:tcPr>
+            <w:tcW w:type="dxa" w:w="720"/>
+          </w:tcPr>
+          <w:p>
+            <w:r>
+              <w:rPr>
+                <w:sz w:val="15"/>
+              </w:rPr>
+              <w:t>0.293</w:t>
+            </w:r>
+          </w:p>
+        </w:tc>
+        <w:tc>
+          <w:tcPr>
+            <w:tcW w:type="dxa" w:w="720"/>
+          </w:tcPr>
+          <w:p>
+            <w:r>
+              <w:rPr>
+                <w:sz w:val="15"/>
+              </w:rPr>
+              <w:t>354.838</w:t>
+            </w:r>
+          </w:p>
+        </w:tc>
+        <w:tc>
+          <w:tcPr>
+            <w:tcW w:type="dxa" w:w="720"/>
+          </w:tcPr>
+          <w:p>
+            <w:r>
+              <w:rPr>
+                <w:sz w:val="15"/>
+              </w:rPr>
+              <w:t>0.561</w:t>
+            </w:r>
+          </w:p>
+        </w:tc>
+        <w:tc>
+          <w:tcPr>
+            <w:tcW w:type="dxa" w:w="720"/>
+          </w:tcPr>
+          <w:p>
+            <w:r>
+              <w:rPr>
+                <w:sz w:val="15"/>
+              </w:rPr>
+              <w:t>0.251</w:t>
+            </w:r>
+          </w:p>
+        </w:tc>
+        <w:tc>
+          <w:tcPr>
+            <w:tcW w:type="dxa" w:w="720"/>
+          </w:tcPr>
+          <w:p>
+            <w:r>
+              <w:rPr>
+                <w:sz w:val="15"/>
+              </w:rPr>
+              <w:t>0.279</w:t>
+            </w:r>
+          </w:p>
+        </w:tc>
+        <w:tc>
+          <w:tcPr>
+            <w:tcW w:type="dxa" w:w="720"/>
+          </w:tcPr>
+          <w:p>
+            <w:r>
+              <w:rPr>
+                <w:sz w:val="15"/>
+              </w:rPr>
+              <w:t>373.785</w:t>
+            </w:r>
+          </w:p>
+        </w:tc>
+        <w:tc>
+          <w:tcPr>
+            <w:tcW w:type="dxa" w:w="720"/>
+          </w:tcPr>
+          <w:p>
+            <w:r>
+              <w:rPr>
+                <w:sz w:val="15"/>
+              </w:rPr>
+              <w:t>0.280</w:t>
+            </w:r>
+          </w:p>
+        </w:tc>
+        <w:tc>
+          <w:tcPr>
+            <w:tcW w:type="dxa" w:w="720"/>
+          </w:tcPr>
+          <w:p>
+            <w:r>
+              <w:rPr>
+                <w:sz w:val="15"/>
+              </w:rPr>
+              <w:t>349.705</w:t>
+            </w:r>
+          </w:p>
+        </w:tc>
+      </w:tr>
+      <w:tr>
+        <w:tc>
+          <w:tcPr>
+            <w:tcW w:type="dxa" w:w="720"/>
+          </w:tcPr>
+          <w:p>
+            <w:r>
+              <w:rPr>
+                <w:sz w:val="15"/>
+              </w:rPr>
+              <w:t>Random forest</w:t>
+            </w:r>
+          </w:p>
+        </w:tc>
+        <w:tc>
+          <w:tcPr>
+            <w:tcW w:type="dxa" w:w="720"/>
+          </w:tcPr>
+          <w:p>
+            <w:r>
+              <w:rPr>
+                <w:sz w:val="15"/>
+              </w:rPr>
+              <w:t>5</w:t>
+            </w:r>
+          </w:p>
+        </w:tc>
+        <w:tc>
+          <w:tcPr>
+            <w:tcW w:type="dxa" w:w="720"/>
+          </w:tcPr>
+          <w:p>
+            <w:r>
+              <w:rPr>
+                <w:sz w:val="15"/>
+              </w:rPr>
+              <w:t>0.130</w:t>
+            </w:r>
+          </w:p>
+        </w:tc>
+        <w:tc>
+          <w:tcPr>
+            <w:tcW w:type="dxa" w:w="720"/>
+          </w:tcPr>
+          <w:p>
+            <w:r>
+              <w:rPr>
+                <w:sz w:val="15"/>
+              </w:rPr>
+              <w:t>0.722</w:t>
+            </w:r>
+          </w:p>
+        </w:tc>
+        <w:tc>
+          <w:tcPr>
+            <w:tcW w:type="dxa" w:w="720"/>
+          </w:tcPr>
+          <w:p>
+            <w:r>
+              <w:rPr>
+                <w:sz w:val="15"/>
+              </w:rPr>
+              <w:t>0.258</w:t>
+            </w:r>
+          </w:p>
+        </w:tc>
+        <w:tc>
+          <w:tcPr>
+            <w:tcW w:type="dxa" w:w="720"/>
+          </w:tcPr>
+          <w:p>
+            <w:r>
+              <w:rPr>
+                <w:sz w:val="15"/>
+              </w:rPr>
+              <w:t>461.230</w:t>
+            </w:r>
+          </w:p>
+        </w:tc>
+        <w:tc>
+          <w:tcPr>
+            <w:tcW w:type="dxa" w:w="720"/>
+          </w:tcPr>
+          <w:p>
+            <w:r>
+              <w:rPr>
+                <w:sz w:val="15"/>
+              </w:rPr>
+              <w:t>0.709</w:t>
+            </w:r>
+          </w:p>
+        </w:tc>
+        <w:tc>
+          <w:tcPr>
+            <w:tcW w:type="dxa" w:w="720"/>
+          </w:tcPr>
+          <w:p>
+            <w:r>
+              <w:rPr>
+                <w:sz w:val="15"/>
+              </w:rPr>
+              <w:t>0.220</w:t>
+            </w:r>
+          </w:p>
+        </w:tc>
+        <w:tc>
+          <w:tcPr>
+            <w:tcW w:type="dxa" w:w="720"/>
+          </w:tcPr>
+          <w:p>
+            <w:r>
+              <w:rPr>
+                <w:sz w:val="15"/>
+              </w:rPr>
+              <w:t>0.403</w:t>
+            </w:r>
+          </w:p>
+        </w:tc>
+        <w:tc>
+          <w:tcPr>
+            <w:tcW w:type="dxa" w:w="720"/>
+          </w:tcPr>
+          <w:p>
+            <w:r>
+              <w:rPr>
+                <w:sz w:val="15"/>
+              </w:rPr>
+              <w:t>496.156</w:t>
+            </w:r>
+          </w:p>
+        </w:tc>
+        <w:tc>
+          <w:tcPr>
+            <w:tcW w:type="dxa" w:w="720"/>
+          </w:tcPr>
+          <w:p>
+            <w:r>
+              <w:rPr>
+                <w:sz w:val="15"/>
+              </w:rPr>
+              <w:t>0.180</w:t>
+            </w:r>
+          </w:p>
+        </w:tc>
+        <w:tc>
+          <w:tcPr>
+            <w:tcW w:type="dxa" w:w="720"/>
+          </w:tcPr>
+          <w:p>
+            <w:r>
+              <w:rPr>
+                <w:sz w:val="15"/>
+              </w:rPr>
+              <w:t>483.639</w:t>
+            </w:r>
+          </w:p>
+        </w:tc>
+      </w:tr>
+      <w:tr>
+        <w:tc>
+          <w:tcPr>
+            <w:tcW w:type="dxa" w:w="720"/>
+          </w:tcPr>
+          <w:p>
+            <w:r>
+              <w:rPr>
+                <w:sz w:val="15"/>
+              </w:rPr>
+              <w:t>Random forest</w:t>
+            </w:r>
+          </w:p>
+        </w:tc>
+        <w:tc>
+          <w:tcPr>
+            <w:tcW w:type="dxa" w:w="720"/>
+          </w:tcPr>
+          <w:p>
+            <w:r>
+              <w:rPr>
+                <w:sz w:val="15"/>
+              </w:rPr>
+              <w:t>10</w:t>
+            </w:r>
+          </w:p>
+        </w:tc>
+        <w:tc>
+          <w:tcPr>
+            <w:tcW w:type="dxa" w:w="720"/>
+          </w:tcPr>
+          <w:p>
+            <w:r>
+              <w:rPr>
+                <w:sz w:val="15"/>
+              </w:rPr>
+              <w:t>0.080</w:t>
+            </w:r>
+          </w:p>
+        </w:tc>
+        <w:tc>
+          <w:tcPr>
+            <w:tcW w:type="dxa" w:w="720"/>
+          </w:tcPr>
+          <w:p>
+            <w:r>
+              <w:rPr>
+                <w:sz w:val="15"/>
+              </w:rPr>
+              <w:t>0.857</w:t>
+            </w:r>
+          </w:p>
+        </w:tc>
+        <w:tc>
+          <w:tcPr>
+            <w:tcW w:type="dxa" w:w="720"/>
+          </w:tcPr>
+          <w:p>
+            <w:r>
+              <w:rPr>
+                <w:sz w:val="15"/>
+              </w:rPr>
+              <w:t>0.214</w:t>
+            </w:r>
+          </w:p>
+        </w:tc>
+        <w:tc>
+          <w:tcPr>
+            <w:tcW w:type="dxa" w:w="720"/>
+          </w:tcPr>
+          <w:p>
+            <w:r>
+              <w:rPr>
+                <w:sz w:val="15"/>
+              </w:rPr>
+              <w:t>608.251</w:t>
+            </w:r>
+          </w:p>
+        </w:tc>
+        <w:tc>
+          <w:tcPr>
+            <w:tcW w:type="dxa" w:w="720"/>
+          </w:tcPr>
+          <w:p>
+            <w:r>
+              <w:rPr>
+                <w:sz w:val="15"/>
+              </w:rPr>
+              <w:t>0.853</w:t>
+            </w:r>
+          </w:p>
+        </w:tc>
+        <w:tc>
+          <w:tcPr>
+            <w:tcW w:type="dxa" w:w="720"/>
+          </w:tcPr>
+          <w:p>
+            <w:r>
+              <w:rPr>
+                <w:sz w:val="15"/>
+              </w:rPr>
+              <w:t>0.182</w:t>
+            </w:r>
+          </w:p>
+        </w:tc>
+        <w:tc>
+          <w:tcPr>
+            <w:tcW w:type="dxa" w:w="720"/>
+          </w:tcPr>
+          <w:p>
+            <w:r>
+              <w:rPr>
+                <w:sz w:val="15"/>
+              </w:rPr>
+              <w:t>0.586</w:t>
+            </w:r>
+          </w:p>
+        </w:tc>
+        <w:tc>
+          <w:tcPr>
+            <w:tcW w:type="dxa" w:w="720"/>
+          </w:tcPr>
+          <w:p>
+            <w:r>
+              <w:rPr>
+                <w:sz w:val="15"/>
+              </w:rPr>
+              <w:t>663.458</w:t>
+            </w:r>
+          </w:p>
+        </w:tc>
+        <w:tc>
+          <w:tcPr>
+            <w:tcW w:type="dxa" w:w="720"/>
+          </w:tcPr>
+          <w:p>
+            <w:r>
+              <w:rPr>
+                <w:sz w:val="15"/>
+              </w:rPr>
+              <w:t>0.090</w:t>
+            </w:r>
+          </w:p>
+        </w:tc>
+        <w:tc>
+          <w:tcPr>
+            <w:tcW w:type="dxa" w:w="720"/>
+          </w:tcPr>
+          <w:p>
+            <w:r>
+              <w:rPr>
+                <w:sz w:val="15"/>
+              </w:rPr>
+              <w:t>658.384</w:t>
             </w:r>
           </w:p>
         </w:tc>
@@ -4937,6 +5947,374 @@
           </w:p>
         </w:tc>
       </w:tr>
+      <w:tr>
+        <w:tc>
+          <w:tcPr>
+            <w:tcW w:type="dxa" w:w="617"/>
+          </w:tcPr>
+          <w:p>
+            <w:r>
+              <w:rPr>
+                <w:sz w:val="16"/>
+              </w:rPr>
+              <w:t>Random forest</w:t>
+            </w:r>
+          </w:p>
+        </w:tc>
+        <w:tc>
+          <w:tcPr>
+            <w:tcW w:type="dxa" w:w="617"/>
+          </w:tcPr>
+          <w:p>
+            <w:r>
+              <w:rPr>
+                <w:sz w:val="16"/>
+              </w:rPr>
+              <w:t>0.50 (default)</w:t>
+            </w:r>
+          </w:p>
+        </w:tc>
+        <w:tc>
+          <w:tcPr>
+            <w:tcW w:type="dxa" w:w="617"/>
+          </w:tcPr>
+          <w:p>
+            <w:r>
+              <w:rPr>
+                <w:sz w:val="16"/>
+              </w:rPr>
+              <w:t>0.500</w:t>
+            </w:r>
+          </w:p>
+        </w:tc>
+        <w:tc>
+          <w:tcPr>
+            <w:tcW w:type="dxa" w:w="617"/>
+          </w:tcPr>
+          <w:p>
+            <w:r>
+              <w:rPr>
+                <w:sz w:val="16"/>
+              </w:rPr>
+              <w:t>148.000</w:t>
+            </w:r>
+          </w:p>
+        </w:tc>
+        <w:tc>
+          <w:tcPr>
+            <w:tcW w:type="dxa" w:w="617"/>
+          </w:tcPr>
+          <w:p>
+            <w:r>
+              <w:rPr>
+                <w:sz w:val="16"/>
+              </w:rPr>
+              <w:t>3,920</w:t>
+            </w:r>
+          </w:p>
+        </w:tc>
+        <w:tc>
+          <w:tcPr>
+            <w:tcW w:type="dxa" w:w="617"/>
+          </w:tcPr>
+          <w:p>
+            <w:r>
+              <w:rPr>
+                <w:sz w:val="16"/>
+              </w:rPr>
+              <w:t>189.000</w:t>
+            </w:r>
+          </w:p>
+        </w:tc>
+        <w:tc>
+          <w:tcPr>
+            <w:tcW w:type="dxa" w:w="617"/>
+          </w:tcPr>
+          <w:p>
+            <w:r>
+              <w:rPr>
+                <w:sz w:val="16"/>
+              </w:rPr>
+              <w:t>28,259</w:t>
+            </w:r>
+          </w:p>
+        </w:tc>
+        <w:tc>
+          <w:tcPr>
+            <w:tcW w:type="dxa" w:w="617"/>
+          </w:tcPr>
+          <w:p>
+            <w:r>
+              <w:rPr>
+                <w:sz w:val="16"/>
+              </w:rPr>
+              <w:t>0.036</w:t>
+            </w:r>
+          </w:p>
+        </w:tc>
+        <w:tc>
+          <w:tcPr>
+            <w:tcW w:type="dxa" w:w="617"/>
+          </w:tcPr>
+          <w:p>
+            <w:r>
+              <w:rPr>
+                <w:sz w:val="16"/>
+              </w:rPr>
+              <w:t>0.439</w:t>
+            </w:r>
+          </w:p>
+        </w:tc>
+        <w:tc>
+          <w:tcPr>
+            <w:tcW w:type="dxa" w:w="617"/>
+          </w:tcPr>
+          <w:p>
+            <w:r>
+              <w:rPr>
+                <w:sz w:val="16"/>
+              </w:rPr>
+              <w:t>0.993</w:t>
+            </w:r>
+          </w:p>
+        </w:tc>
+        <w:tc>
+          <w:tcPr>
+            <w:tcW w:type="dxa" w:w="617"/>
+          </w:tcPr>
+          <w:p>
+            <w:r>
+              <w:rPr>
+                <w:sz w:val="16"/>
+              </w:rPr>
+              <w:t>10.364</w:t>
+            </w:r>
+          </w:p>
+        </w:tc>
+        <w:tc>
+          <w:tcPr>
+            <w:tcW w:type="dxa" w:w="617"/>
+          </w:tcPr>
+          <w:p>
+            <w:r>
+              <w:rPr>
+                <w:sz w:val="16"/>
+              </w:rPr>
+              <w:t>4.552</w:t>
+            </w:r>
+          </w:p>
+        </w:tc>
+        <w:tc>
+          <w:tcPr>
+            <w:tcW w:type="dxa" w:w="617"/>
+          </w:tcPr>
+          <w:p>
+            <w:r>
+              <w:rPr>
+                <w:sz w:val="16"/>
+              </w:rPr>
+              <w:t>120.556</w:t>
+            </w:r>
+          </w:p>
+        </w:tc>
+        <w:tc>
+          <w:tcPr>
+            <w:tcW w:type="dxa" w:w="617"/>
+          </w:tcPr>
+          <w:p>
+            <w:r>
+              <w:rPr>
+                <w:sz w:val="16"/>
+              </w:rPr>
+              <w:t>608.593</w:t>
+            </w:r>
+          </w:p>
+        </w:tc>
+      </w:tr>
+      <w:tr>
+        <w:tc>
+          <w:tcPr>
+            <w:tcW w:type="dxa" w:w="617"/>
+          </w:tcPr>
+          <w:p>
+            <w:r>
+              <w:rPr>
+                <w:sz w:val="16"/>
+              </w:rPr>
+              <w:t>Random forest</w:t>
+            </w:r>
+          </w:p>
+        </w:tc>
+        <w:tc>
+          <w:tcPr>
+            <w:tcW w:type="dxa" w:w="617"/>
+          </w:tcPr>
+          <w:p>
+            <w:r>
+              <w:rPr>
+                <w:sz w:val="16"/>
+              </w:rPr>
+              <w:t>recommended</w:t>
+            </w:r>
+          </w:p>
+        </w:tc>
+        <w:tc>
+          <w:tcPr>
+            <w:tcW w:type="dxa" w:w="617"/>
+          </w:tcPr>
+          <w:p>
+            <w:r>
+              <w:rPr>
+                <w:sz w:val="16"/>
+              </w:rPr>
+              <w:t>0.130</w:t>
+            </w:r>
+          </w:p>
+        </w:tc>
+        <w:tc>
+          <w:tcPr>
+            <w:tcW w:type="dxa" w:w="617"/>
+          </w:tcPr>
+          <w:p>
+            <w:r>
+              <w:rPr>
+                <w:sz w:val="16"/>
+              </w:rPr>
+              <w:t>2,883</w:t>
+            </w:r>
+          </w:p>
+        </w:tc>
+        <w:tc>
+          <w:tcPr>
+            <w:tcW w:type="dxa" w:w="617"/>
+          </w:tcPr>
+          <w:p>
+            <w:r>
+              <w:rPr>
+                <w:sz w:val="16"/>
+              </w:rPr>
+              <w:t>1,185</w:t>
+            </w:r>
+          </w:p>
+        </w:tc>
+        <w:tc>
+          <w:tcPr>
+            <w:tcW w:type="dxa" w:w="617"/>
+          </w:tcPr>
+          <w:p>
+            <w:r>
+              <w:rPr>
+                <w:sz w:val="16"/>
+              </w:rPr>
+              <w:t>10,208</w:t>
+            </w:r>
+          </w:p>
+        </w:tc>
+        <w:tc>
+          <w:tcPr>
+            <w:tcW w:type="dxa" w:w="617"/>
+          </w:tcPr>
+          <w:p>
+            <w:r>
+              <w:rPr>
+                <w:sz w:val="16"/>
+              </w:rPr>
+              <w:t>18,240</w:t>
+            </w:r>
+          </w:p>
+        </w:tc>
+        <w:tc>
+          <w:tcPr>
+            <w:tcW w:type="dxa" w:w="617"/>
+          </w:tcPr>
+          <w:p>
+            <w:r>
+              <w:rPr>
+                <w:sz w:val="16"/>
+              </w:rPr>
+              <w:t>0.709</w:t>
+            </w:r>
+          </w:p>
+        </w:tc>
+        <w:tc>
+          <w:tcPr>
+            <w:tcW w:type="dxa" w:w="617"/>
+          </w:tcPr>
+          <w:p>
+            <w:r>
+              <w:rPr>
+                <w:sz w:val="16"/>
+              </w:rPr>
+              <w:t>0.220</w:t>
+            </w:r>
+          </w:p>
+        </w:tc>
+        <w:tc>
+          <w:tcPr>
+            <w:tcW w:type="dxa" w:w="617"/>
+          </w:tcPr>
+          <w:p>
+            <w:r>
+              <w:rPr>
+                <w:sz w:val="16"/>
+              </w:rPr>
+              <w:t>0.641</w:t>
+            </w:r>
+          </w:p>
+        </w:tc>
+        <w:tc>
+          <w:tcPr>
+            <w:tcW w:type="dxa" w:w="617"/>
+          </w:tcPr>
+          <w:p>
+            <w:r>
+              <w:rPr>
+                <w:sz w:val="16"/>
+              </w:rPr>
+              <w:t>402.602</w:t>
+            </w:r>
+          </w:p>
+        </w:tc>
+        <w:tc>
+          <w:tcPr>
+            <w:tcW w:type="dxa" w:w="617"/>
+          </w:tcPr>
+          <w:p>
+            <w:r>
+              <w:rPr>
+                <w:sz w:val="16"/>
+              </w:rPr>
+              <w:t>88.664</w:t>
+            </w:r>
+          </w:p>
+        </w:tc>
+        <w:tc>
+          <w:tcPr>
+            <w:tcW w:type="dxa" w:w="617"/>
+          </w:tcPr>
+          <w:p>
+            <w:r>
+              <w:rPr>
+                <w:sz w:val="16"/>
+              </w:rPr>
+              <w:t>36.444</w:t>
+            </w:r>
+          </w:p>
+        </w:tc>
+        <w:tc>
+          <w:tcPr>
+            <w:tcW w:type="dxa" w:w="617"/>
+          </w:tcPr>
+          <w:p>
+            <w:r>
+              <w:rPr>
+                <w:sz w:val="16"/>
+              </w:rPr>
+              <w:t>496.156</w:t>
+            </w:r>
+          </w:p>
+        </w:tc>
+      </w:tr>
     </w:tbl>
     <w:p/>
     <w:p>
@@ -4946,7 +6324,7 @@
       <w:r>
         <w:drawing>
           <wp:inline xmlns:a="http://schemas.openxmlformats.org/drawingml/2006/main" xmlns:pic="http://schemas.openxmlformats.org/drawingml/2006/picture">
-            <wp:extent cx="5760720" cy="2650073"/>
+            <wp:extent cx="5760720" cy="1753059"/>
             <wp:docPr id="5" name="Picture 5"/>
             <wp:cNvGraphicFramePr>
               <a:graphicFrameLocks noChangeAspect="1"/>
@@ -4967,7 +6345,7 @@
                   <pic:spPr>
                     <a:xfrm>
                       <a:off x="0" y="0"/>
-                      <a:ext cx="5760720" cy="2650073"/>
+                      <a:ext cx="5760720" cy="1753059"/>
                     </a:xfrm>
                     <a:prstGeom prst="rect"/>
                   </pic:spPr>
@@ -5003,7 +6381,7 @@
         <w:pStyle w:val="ListBullet"/>
       </w:pPr>
       <w:r>
-        <w:t>Once a missed child is weighted 5 times a wasted visit, the best cut-off drops sharply. Our recommendation is the decision tree at a cut-off of 0.16. On the held-out districts, for every 1,000 children screened it flags 328, finds 78 of the 125 who are out of school and misses 47 (recall 0.62, precision 0.24). This is the lowest hold-out cost of any policy examined. The same tree at the default 0.5 cut-off would find only 5 per 1,000.</w:t>
+        <w:t>Once a missed child is weighted 5 times a wasted visit, the best cut-off drops sharply. Ranked by hold-out cost per 1,000 at cut-offs chosen on training data, the models come out as: Decision tree 487; Random forest 496; Logistic regression 552. Our recommendation is therefore the decision tree at a cut-off of 0.16. On the held-out districts, for every 1,000 children screened it flags 328, finds 78 of the 125 who are out of school and misses 47 (recall 0.62, precision 0.24). The same model at the default 0.5 cut-off would find only 5 per 1,000.</w:t>
       </w:r>
     </w:p>
     <w:p>
@@ -5011,7 +6389,7 @@
         <w:pStyle w:val="ListBullet"/>
       </w:pPr>
       <w:r>
-        <w:t>Logistic regression at a cut-off of 0.54 is a close second (recall 0.57, precision 0.20, 353 flagged per 1,000). It is the better choice wherever officials must be able to explain, child by child, why someone was flagged, because its reasoning is a fixed list of weighted factors.</w:t>
+        <w:t>A note on the ranking. The random forest has the best ranking quality (highest hold-out ROC-AUC, 0.725), yet the decision tree wins on cost because its training-chosen cut-off transfers to the new districts almost perfectly, whereas the random forest's cut-off of 0.13 sits a little below its hold-out optimum of 0.18 and so flags more children than it needs to. The gap between the two (487 versus 496 per 1,000) is within the fold-to-fold variation seen in cross-validation, so the choice between them should rest on stability and explainability rather than on this difference alone.</w:t>
       </w:r>
     </w:p>
     <w:p>
@@ -5019,7 +6397,7 @@
         <w:pStyle w:val="ListBullet"/>
       </w:pPr>
       <w:r>
-        <w:t>At r = 10 both models flag more than half of all children in order to find 75%-83% of those out of school. Whether that is affordable is a budget decision for the programme; the cost ratio simply makes the decision explicit.</w:t>
+        <w:t>The other two models at their own training-chosen cut-offs: logistic regression at 0.54 (recall 0.57, precision 0.20, 353 flagged per 1,000); random forest at 0.13 (recall 0.71, precision 0.22, 403 flagged per 1,000). Logistic regression remains the better choice wherever officials must be able to explain, child by child, why someone was flagged, because its reasoning is a fixed list of weighted factors; the forest's advantage in ranking quality comes at the price of being harder to explain.</w:t>
       </w:r>
     </w:p>
     <w:p>
@@ -5027,7 +6405,15 @@
         <w:pStyle w:val="ListBullet"/>
       </w:pPr>
       <w:r>
-        <w:t>Honesty check. Had we chosen the cut-off on the hold-out itself, the logistic regression optimum would have been 0.57 with a cost of 545 per 1,000, against 552 at the training-chosen 0.54; for the tree the two coincide at 0.16. The flattery avoided is small here, about 1.3% of cost for logistic regression, but it is not zero, which is why every figure at the recommended cut-off in Tables 5-7 and Figures 5-6 uses the training-chosen value.</w:t>
+        <w:t>At r = 10 the models flag more than half of all children in order to find 75%-85% of those out of school. Whether that is affordable is a budget decision for the programme; the cost ratio simply makes the decision explicit.</w:t>
+      </w:r>
+    </w:p>
+    <w:p>
+      <w:pPr>
+        <w:pStyle w:val="ListBullet"/>
+      </w:pPr>
+      <w:r>
+        <w:t>Honesty check. Had we chosen each cut-off on the hold-out itself, the results would have been: logistic regression oracle 0.57 costing 545 per 1,000 versus 552 at the training-chosen 0.54; decision tree oracle 0.16 costing 487 per 1,000 versus 487 at the training-chosen 0.16; random forest oracle 0.18 costing 484 per 1,000 versus 496 at the training-chosen 0.13. The flattery avoided is at most 2.6% of cost, small but not zero, which is why every figure at the recommended cut-off in Tables 5-7 and Figures 5-6 uses the training-chosen value.</w:t>
       </w:r>
     </w:p>
     <w:p>
@@ -8769,7 +10155,7 @@
           <w:b/>
           <w:sz w:val="19"/>
         </w:rPr>
-        <w:t>Table 9. Tree Gini importance and hold-out permutation importance</w:t>
+        <w:t>Table 9. Gini importance for the tree and the forest, and hold-out permutation importance for all three models</w:t>
       </w:r>
     </w:p>
     <w:tbl>
@@ -8779,21 +10165,23 @@
         <w:tblLook w:firstColumn="1" w:firstRow="1" w:lastColumn="0" w:lastRow="0" w:noHBand="0" w:noVBand="1" w:val="04A0"/>
       </w:tblPr>
       <w:tblGrid>
-        <w:gridCol w:w="2160"/>
-        <w:gridCol w:w="2160"/>
-        <w:gridCol w:w="2160"/>
-        <w:gridCol w:w="2160"/>
+        <w:gridCol w:w="1440"/>
+        <w:gridCol w:w="1440"/>
+        <w:gridCol w:w="1440"/>
+        <w:gridCol w:w="1440"/>
+        <w:gridCol w:w="1440"/>
+        <w:gridCol w:w="1440"/>
       </w:tblGrid>
       <w:tr>
         <w:tc>
           <w:tcPr>
-            <w:tcW w:type="dxa" w:w="2160"/>
+            <w:tcW w:type="dxa" w:w="1440"/>
           </w:tcPr>
           <w:p>
             <w:r>
               <w:rPr>
                 <w:b/>
-                <w:sz w:val="17"/>
+                <w:sz w:val="16"/>
               </w:rPr>
               <w:t>Factor</w:t>
             </w:r>
@@ -8801,43 +10189,71 @@
         </w:tc>
         <w:tc>
           <w:tcPr>
-            <w:tcW w:type="dxa" w:w="2160"/>
+            <w:tcW w:type="dxa" w:w="1440"/>
           </w:tcPr>
           <w:p>
             <w:r>
               <w:rPr>
                 <w:b/>
-                <w:sz w:val="17"/>
-              </w:rPr>
-              <w:t>Tree Gini importance</w:t>
-            </w:r>
-          </w:p>
-        </w:tc>
-        <w:tc>
-          <w:tcPr>
-            <w:tcW w:type="dxa" w:w="2160"/>
+                <w:sz w:val="16"/>
+              </w:rPr>
+              <w:t>Gini (tree)</w:t>
+            </w:r>
+          </w:p>
+        </w:tc>
+        <w:tc>
+          <w:tcPr>
+            <w:tcW w:type="dxa" w:w="1440"/>
           </w:tcPr>
           <w:p>
             <w:r>
               <w:rPr>
                 <w:b/>
-                <w:sz w:val="17"/>
-              </w:rPr>
-              <w:t>Permutation ROC-AUC drop (logistic)</w:t>
-            </w:r>
-          </w:p>
-        </w:tc>
-        <w:tc>
-          <w:tcPr>
-            <w:tcW w:type="dxa" w:w="2160"/>
+                <w:sz w:val="16"/>
+              </w:rPr>
+              <w:t>Gini (forest)</w:t>
+            </w:r>
+          </w:p>
+        </w:tc>
+        <w:tc>
+          <w:tcPr>
+            <w:tcW w:type="dxa" w:w="1440"/>
           </w:tcPr>
           <w:p>
             <w:r>
               <w:rPr>
                 <w:b/>
-                <w:sz w:val="17"/>
-              </w:rPr>
-              <w:t>Permutation ROC-AUC drop (tree)</w:t>
+                <w:sz w:val="16"/>
+              </w:rPr>
+              <w:t>Permutation drop (logistic)</w:t>
+            </w:r>
+          </w:p>
+        </w:tc>
+        <w:tc>
+          <w:tcPr>
+            <w:tcW w:type="dxa" w:w="1440"/>
+          </w:tcPr>
+          <w:p>
+            <w:r>
+              <w:rPr>
+                <w:b/>
+                <w:sz w:val="16"/>
+              </w:rPr>
+              <w:t>Permutation drop (tree)</w:t>
+            </w:r>
+          </w:p>
+        </w:tc>
+        <w:tc>
+          <w:tcPr>
+            <w:tcW w:type="dxa" w:w="1440"/>
+          </w:tcPr>
+          <w:p>
+            <w:r>
+              <w:rPr>
+                <w:b/>
+                <w:sz w:val="16"/>
+              </w:rPr>
+              <w:t>Permutation drop (forest)</w:t>
             </w:r>
           </w:p>
         </w:tc>
@@ -8845,12 +10261,12 @@
       <w:tr>
         <w:tc>
           <w:tcPr>
-            <w:tcW w:type="dxa" w:w="2160"/>
-          </w:tcPr>
-          <w:p>
-            <w:r>
-              <w:rPr>
-                <w:sz w:val="17"/>
+            <w:tcW w:type="dxa" w:w="1440"/>
+          </w:tcPr>
+          <w:p>
+            <w:r>
+              <w:rPr>
+                <w:sz w:val="16"/>
               </w:rPr>
               <w:t>Housing (1 kachha - 3 pacca)</w:t>
             </w:r>
@@ -8858,12 +10274,12 @@
         </w:tc>
         <w:tc>
           <w:tcPr>
-            <w:tcW w:type="dxa" w:w="2160"/>
-          </w:tcPr>
-          <w:p>
-            <w:r>
-              <w:rPr>
-                <w:sz w:val="17"/>
+            <w:tcW w:type="dxa" w:w="1440"/>
+          </w:tcPr>
+          <w:p>
+            <w:r>
+              <w:rPr>
+                <w:sz w:val="16"/>
               </w:rPr>
               <w:t>0.305</w:t>
             </w:r>
@@ -8871,12 +10287,25 @@
         </w:tc>
         <w:tc>
           <w:tcPr>
-            <w:tcW w:type="dxa" w:w="2160"/>
-          </w:tcPr>
-          <w:p>
-            <w:r>
-              <w:rPr>
-                <w:sz w:val="17"/>
+            <w:tcW w:type="dxa" w:w="1440"/>
+          </w:tcPr>
+          <w:p>
+            <w:r>
+              <w:rPr>
+                <w:sz w:val="16"/>
+              </w:rPr>
+              <w:t>0.182</w:t>
+            </w:r>
+          </w:p>
+        </w:tc>
+        <w:tc>
+          <w:tcPr>
+            <w:tcW w:type="dxa" w:w="1440"/>
+          </w:tcPr>
+          <w:p>
+            <w:r>
+              <w:rPr>
+                <w:sz w:val="16"/>
               </w:rPr>
               <w:t>0.038</w:t>
             </w:r>
@@ -8884,14 +10313,27 @@
         </w:tc>
         <w:tc>
           <w:tcPr>
-            <w:tcW w:type="dxa" w:w="2160"/>
-          </w:tcPr>
-          <w:p>
-            <w:r>
-              <w:rPr>
-                <w:sz w:val="17"/>
+            <w:tcW w:type="dxa" w:w="1440"/>
+          </w:tcPr>
+          <w:p>
+            <w:r>
+              <w:rPr>
+                <w:sz w:val="16"/>
               </w:rPr>
               <w:t>0.051</w:t>
+            </w:r>
+          </w:p>
+        </w:tc>
+        <w:tc>
+          <w:tcPr>
+            <w:tcW w:type="dxa" w:w="1440"/>
+          </w:tcPr>
+          <w:p>
+            <w:r>
+              <w:rPr>
+                <w:sz w:val="16"/>
+              </w:rPr>
+              <w:t>0.041</w:t>
             </w:r>
           </w:p>
         </w:tc>
@@ -8899,53 +10341,79 @@
       <w:tr>
         <w:tc>
           <w:tcPr>
-            <w:tcW w:type="dxa" w:w="2160"/>
-          </w:tcPr>
-          <w:p>
-            <w:r>
-              <w:rPr>
-                <w:sz w:val="17"/>
-              </w:rPr>
-              <w:t>Province: Balochistan</w:t>
-            </w:r>
-          </w:p>
-        </w:tc>
-        <w:tc>
-          <w:tcPr>
-            <w:tcW w:type="dxa" w:w="2160"/>
-          </w:tcPr>
-          <w:p>
-            <w:r>
-              <w:rPr>
-                <w:sz w:val="17"/>
-              </w:rPr>
-              <w:t>0.154</w:t>
-            </w:r>
-          </w:p>
-        </w:tc>
-        <w:tc>
-          <w:tcPr>
-            <w:tcW w:type="dxa" w:w="2160"/>
-          </w:tcPr>
-          <w:p>
-            <w:r>
-              <w:rPr>
-                <w:sz w:val="17"/>
-              </w:rPr>
-              <w:t>0.001</w:t>
-            </w:r>
-          </w:p>
-        </w:tc>
-        <w:tc>
-          <w:tcPr>
-            <w:tcW w:type="dxa" w:w="2160"/>
-          </w:tcPr>
-          <w:p>
-            <w:r>
-              <w:rPr>
-                <w:sz w:val="17"/>
-              </w:rPr>
-              <w:t>0.013</w:t>
+            <w:tcW w:type="dxa" w:w="1440"/>
+          </w:tcPr>
+          <w:p>
+            <w:r>
+              <w:rPr>
+                <w:sz w:val="16"/>
+              </w:rPr>
+              <w:t>Digital use (0-5)</w:t>
+            </w:r>
+          </w:p>
+        </w:tc>
+        <w:tc>
+          <w:tcPr>
+            <w:tcW w:type="dxa" w:w="1440"/>
+          </w:tcPr>
+          <w:p>
+            <w:r>
+              <w:rPr>
+                <w:sz w:val="16"/>
+              </w:rPr>
+              <w:t>0.152</w:t>
+            </w:r>
+          </w:p>
+        </w:tc>
+        <w:tc>
+          <w:tcPr>
+            <w:tcW w:type="dxa" w:w="1440"/>
+          </w:tcPr>
+          <w:p>
+            <w:r>
+              <w:rPr>
+                <w:sz w:val="16"/>
+              </w:rPr>
+              <w:t>0.167</w:t>
+            </w:r>
+          </w:p>
+        </w:tc>
+        <w:tc>
+          <w:tcPr>
+            <w:tcW w:type="dxa" w:w="1440"/>
+          </w:tcPr>
+          <w:p>
+            <w:r>
+              <w:rPr>
+                <w:sz w:val="16"/>
+              </w:rPr>
+              <w:t>0.044</w:t>
+            </w:r>
+          </w:p>
+        </w:tc>
+        <w:tc>
+          <w:tcPr>
+            <w:tcW w:type="dxa" w:w="1440"/>
+          </w:tcPr>
+          <w:p>
+            <w:r>
+              <w:rPr>
+                <w:sz w:val="16"/>
+              </w:rPr>
+              <w:t>0.053</w:t>
+            </w:r>
+          </w:p>
+        </w:tc>
+        <w:tc>
+          <w:tcPr>
+            <w:tcW w:type="dxa" w:w="1440"/>
+          </w:tcPr>
+          <w:p>
+            <w:r>
+              <w:rPr>
+                <w:sz w:val="16"/>
+              </w:rPr>
+              <w:t>0.049</w:t>
             </w:r>
           </w:p>
         </w:tc>
@@ -8953,53 +10421,79 @@
       <w:tr>
         <w:tc>
           <w:tcPr>
-            <w:tcW w:type="dxa" w:w="2160"/>
-          </w:tcPr>
-          <w:p>
-            <w:r>
-              <w:rPr>
-                <w:sz w:val="17"/>
-              </w:rPr>
-              <w:t>Digital use (0-5)</w:t>
-            </w:r>
-          </w:p>
-        </w:tc>
-        <w:tc>
-          <w:tcPr>
-            <w:tcW w:type="dxa" w:w="2160"/>
-          </w:tcPr>
-          <w:p>
-            <w:r>
-              <w:rPr>
-                <w:sz w:val="17"/>
-              </w:rPr>
-              <w:t>0.152</w:t>
-            </w:r>
-          </w:p>
-        </w:tc>
-        <w:tc>
-          <w:tcPr>
-            <w:tcW w:type="dxa" w:w="2160"/>
-          </w:tcPr>
-          <w:p>
-            <w:r>
-              <w:rPr>
-                <w:sz w:val="17"/>
-              </w:rPr>
-              <w:t>0.044</w:t>
-            </w:r>
-          </w:p>
-        </w:tc>
-        <w:tc>
-          <w:tcPr>
-            <w:tcW w:type="dxa" w:w="2160"/>
-          </w:tcPr>
-          <w:p>
-            <w:r>
-              <w:rPr>
-                <w:sz w:val="17"/>
-              </w:rPr>
-              <w:t>0.053</w:t>
+            <w:tcW w:type="dxa" w:w="1440"/>
+          </w:tcPr>
+          <w:p>
+            <w:r>
+              <w:rPr>
+                <w:sz w:val="16"/>
+              </w:rPr>
+              <w:t>Household assets (0-8)</w:t>
+            </w:r>
+          </w:p>
+        </w:tc>
+        <w:tc>
+          <w:tcPr>
+            <w:tcW w:type="dxa" w:w="1440"/>
+          </w:tcPr>
+          <w:p>
+            <w:r>
+              <w:rPr>
+                <w:sz w:val="16"/>
+              </w:rPr>
+              <w:t>0.101</w:t>
+            </w:r>
+          </w:p>
+        </w:tc>
+        <w:tc>
+          <w:tcPr>
+            <w:tcW w:type="dxa" w:w="1440"/>
+          </w:tcPr>
+          <w:p>
+            <w:r>
+              <w:rPr>
+                <w:sz w:val="16"/>
+              </w:rPr>
+              <w:t>0.149</w:t>
+            </w:r>
+          </w:p>
+        </w:tc>
+        <w:tc>
+          <w:tcPr>
+            <w:tcW w:type="dxa" w:w="1440"/>
+          </w:tcPr>
+          <w:p>
+            <w:r>
+              <w:rPr>
+                <w:sz w:val="16"/>
+              </w:rPr>
+              <w:t>0.009</w:t>
+            </w:r>
+          </w:p>
+        </w:tc>
+        <w:tc>
+          <w:tcPr>
+            <w:tcW w:type="dxa" w:w="1440"/>
+          </w:tcPr>
+          <w:p>
+            <w:r>
+              <w:rPr>
+                <w:sz w:val="16"/>
+              </w:rPr>
+              <w:t>0.024</w:t>
+            </w:r>
+          </w:p>
+        </w:tc>
+        <w:tc>
+          <w:tcPr>
+            <w:tcW w:type="dxa" w:w="1440"/>
+          </w:tcPr>
+          <w:p>
+            <w:r>
+              <w:rPr>
+                <w:sz w:val="16"/>
+              </w:rPr>
+              <w:t>0.023</w:t>
             </w:r>
           </w:p>
         </w:tc>
@@ -9007,53 +10501,79 @@
       <w:tr>
         <w:tc>
           <w:tcPr>
-            <w:tcW w:type="dxa" w:w="2160"/>
-          </w:tcPr>
-          <w:p>
-            <w:r>
-              <w:rPr>
-                <w:sz w:val="17"/>
-              </w:rPr>
-              <w:t>Household assets (0-8)</w:t>
-            </w:r>
-          </w:p>
-        </w:tc>
-        <w:tc>
-          <w:tcPr>
-            <w:tcW w:type="dxa" w:w="2160"/>
-          </w:tcPr>
-          <w:p>
-            <w:r>
-              <w:rPr>
-                <w:sz w:val="17"/>
-              </w:rPr>
-              <w:t>0.101</w:t>
-            </w:r>
-          </w:p>
-        </w:tc>
-        <w:tc>
-          <w:tcPr>
-            <w:tcW w:type="dxa" w:w="2160"/>
-          </w:tcPr>
-          <w:p>
-            <w:r>
-              <w:rPr>
-                <w:sz w:val="17"/>
+            <w:tcW w:type="dxa" w:w="1440"/>
+          </w:tcPr>
+          <w:p>
+            <w:r>
+              <w:rPr>
+                <w:sz w:val="16"/>
+              </w:rPr>
+              <w:t>Province: Balochistan</w:t>
+            </w:r>
+          </w:p>
+        </w:tc>
+        <w:tc>
+          <w:tcPr>
+            <w:tcW w:type="dxa" w:w="1440"/>
+          </w:tcPr>
+          <w:p>
+            <w:r>
+              <w:rPr>
+                <w:sz w:val="16"/>
+              </w:rPr>
+              <w:t>0.154</w:t>
+            </w:r>
+          </w:p>
+        </w:tc>
+        <w:tc>
+          <w:tcPr>
+            <w:tcW w:type="dxa" w:w="1440"/>
+          </w:tcPr>
+          <w:p>
+            <w:r>
+              <w:rPr>
+                <w:sz w:val="16"/>
+              </w:rPr>
+              <w:t>0.145</w:t>
+            </w:r>
+          </w:p>
+        </w:tc>
+        <w:tc>
+          <w:tcPr>
+            <w:tcW w:type="dxa" w:w="1440"/>
+          </w:tcPr>
+          <w:p>
+            <w:r>
+              <w:rPr>
+                <w:sz w:val="16"/>
+              </w:rPr>
+              <w:t>0.001</w:t>
+            </w:r>
+          </w:p>
+        </w:tc>
+        <w:tc>
+          <w:tcPr>
+            <w:tcW w:type="dxa" w:w="1440"/>
+          </w:tcPr>
+          <w:p>
+            <w:r>
+              <w:rPr>
+                <w:sz w:val="16"/>
+              </w:rPr>
+              <w:t>0.013</w:t>
+            </w:r>
+          </w:p>
+        </w:tc>
+        <w:tc>
+          <w:tcPr>
+            <w:tcW w:type="dxa" w:w="1440"/>
+          </w:tcPr>
+          <w:p>
+            <w:r>
+              <w:rPr>
+                <w:sz w:val="16"/>
               </w:rPr>
               <w:t>0.009</w:t>
-            </w:r>
-          </w:p>
-        </w:tc>
-        <w:tc>
-          <w:tcPr>
-            <w:tcW w:type="dxa" w:w="2160"/>
-          </w:tcPr>
-          <w:p>
-            <w:r>
-              <w:rPr>
-                <w:sz w:val="17"/>
-              </w:rPr>
-              <w:t>0.024</w:t>
             </w:r>
           </w:p>
         </w:tc>
@@ -9061,12 +10581,12 @@
       <w:tr>
         <w:tc>
           <w:tcPr>
-            <w:tcW w:type="dxa" w:w="2160"/>
-          </w:tcPr>
-          <w:p>
-            <w:r>
-              <w:rPr>
-                <w:sz w:val="17"/>
+            <w:tcW w:type="dxa" w:w="1440"/>
+          </w:tcPr>
+          <w:p>
+            <w:r>
+              <w:rPr>
+                <w:sz w:val="16"/>
               </w:rPr>
               <w:t>Age (years)</w:t>
             </w:r>
@@ -9074,12 +10594,12 @@
         </w:tc>
         <w:tc>
           <w:tcPr>
-            <w:tcW w:type="dxa" w:w="2160"/>
-          </w:tcPr>
-          <w:p>
-            <w:r>
-              <w:rPr>
-                <w:sz w:val="17"/>
+            <w:tcW w:type="dxa" w:w="1440"/>
+          </w:tcPr>
+          <w:p>
+            <w:r>
+              <w:rPr>
+                <w:sz w:val="16"/>
               </w:rPr>
               <w:t>0.068</w:t>
             </w:r>
@@ -9087,12 +10607,25 @@
         </w:tc>
         <w:tc>
           <w:tcPr>
-            <w:tcW w:type="dxa" w:w="2160"/>
-          </w:tcPr>
-          <w:p>
-            <w:r>
-              <w:rPr>
-                <w:sz w:val="17"/>
+            <w:tcW w:type="dxa" w:w="1440"/>
+          </w:tcPr>
+          <w:p>
+            <w:r>
+              <w:rPr>
+                <w:sz w:val="16"/>
+              </w:rPr>
+              <w:t>0.100</w:t>
+            </w:r>
+          </w:p>
+        </w:tc>
+        <w:tc>
+          <w:tcPr>
+            <w:tcW w:type="dxa" w:w="1440"/>
+          </w:tcPr>
+          <w:p>
+            <w:r>
+              <w:rPr>
+                <w:sz w:val="16"/>
               </w:rPr>
               <w:t>0.000</w:t>
             </w:r>
@@ -9100,14 +10633,27 @@
         </w:tc>
         <w:tc>
           <w:tcPr>
-            <w:tcW w:type="dxa" w:w="2160"/>
-          </w:tcPr>
-          <w:p>
-            <w:r>
-              <w:rPr>
-                <w:sz w:val="17"/>
+            <w:tcW w:type="dxa" w:w="1440"/>
+          </w:tcPr>
+          <w:p>
+            <w:r>
+              <w:rPr>
+                <w:sz w:val="16"/>
               </w:rPr>
               <w:t>0.030</w:t>
+            </w:r>
+          </w:p>
+        </w:tc>
+        <w:tc>
+          <w:tcPr>
+            <w:tcW w:type="dxa" w:w="1440"/>
+          </w:tcPr>
+          <w:p>
+            <w:r>
+              <w:rPr>
+                <w:sz w:val="16"/>
+              </w:rPr>
+              <w:t>0.032</w:t>
             </w:r>
           </w:p>
         </w:tc>
@@ -9115,12 +10661,12 @@
       <w:tr>
         <w:tc>
           <w:tcPr>
-            <w:tcW w:type="dxa" w:w="2160"/>
-          </w:tcPr>
-          <w:p>
-            <w:r>
-              <w:rPr>
-                <w:sz w:val="17"/>
+            <w:tcW w:type="dxa" w:w="1440"/>
+          </w:tcPr>
+          <w:p>
+            <w:r>
+              <w:rPr>
+                <w:sz w:val="16"/>
               </w:rPr>
               <w:t>Any disability</w:t>
             </w:r>
@@ -9128,12 +10674,12 @@
         </w:tc>
         <w:tc>
           <w:tcPr>
-            <w:tcW w:type="dxa" w:w="2160"/>
-          </w:tcPr>
-          <w:p>
-            <w:r>
-              <w:rPr>
-                <w:sz w:val="17"/>
+            <w:tcW w:type="dxa" w:w="1440"/>
+          </w:tcPr>
+          <w:p>
+            <w:r>
+              <w:rPr>
+                <w:sz w:val="16"/>
               </w:rPr>
               <w:t>0.053</w:t>
             </w:r>
@@ -9141,12 +10687,25 @@
         </w:tc>
         <w:tc>
           <w:tcPr>
-            <w:tcW w:type="dxa" w:w="2160"/>
-          </w:tcPr>
-          <w:p>
-            <w:r>
-              <w:rPr>
-                <w:sz w:val="17"/>
+            <w:tcW w:type="dxa" w:w="1440"/>
+          </w:tcPr>
+          <w:p>
+            <w:r>
+              <w:rPr>
+                <w:sz w:val="16"/>
+              </w:rPr>
+              <w:t>0.067</w:t>
+            </w:r>
+          </w:p>
+        </w:tc>
+        <w:tc>
+          <w:tcPr>
+            <w:tcW w:type="dxa" w:w="1440"/>
+          </w:tcPr>
+          <w:p>
+            <w:r>
+              <w:rPr>
+                <w:sz w:val="16"/>
               </w:rPr>
               <w:t>-0.000</w:t>
             </w:r>
@@ -9154,14 +10713,27 @@
         </w:tc>
         <w:tc>
           <w:tcPr>
-            <w:tcW w:type="dxa" w:w="2160"/>
-          </w:tcPr>
-          <w:p>
-            <w:r>
-              <w:rPr>
-                <w:sz w:val="17"/>
+            <w:tcW w:type="dxa" w:w="1440"/>
+          </w:tcPr>
+          <w:p>
+            <w:r>
+              <w:rPr>
+                <w:sz w:val="16"/>
               </w:rPr>
               <w:t>0.003</w:t>
+            </w:r>
+          </w:p>
+        </w:tc>
+        <w:tc>
+          <w:tcPr>
+            <w:tcW w:type="dxa" w:w="1440"/>
+          </w:tcPr>
+          <w:p>
+            <w:r>
+              <w:rPr>
+                <w:sz w:val="16"/>
+              </w:rPr>
+              <w:t>0.004</w:t>
             </w:r>
           </w:p>
         </w:tc>
@@ -9169,53 +10741,79 @@
       <w:tr>
         <w:tc>
           <w:tcPr>
-            <w:tcW w:type="dxa" w:w="2160"/>
-          </w:tcPr>
-          <w:p>
-            <w:r>
-              <w:rPr>
-                <w:sz w:val="17"/>
-              </w:rPr>
-              <w:t>Female</w:t>
-            </w:r>
-          </w:p>
-        </w:tc>
-        <w:tc>
-          <w:tcPr>
-            <w:tcW w:type="dxa" w:w="2160"/>
-          </w:tcPr>
-          <w:p>
-            <w:r>
-              <w:rPr>
-                <w:sz w:val="17"/>
-              </w:rPr>
-              <w:t>0.046</w:t>
-            </w:r>
-          </w:p>
-        </w:tc>
-        <w:tc>
-          <w:tcPr>
-            <w:tcW w:type="dxa" w:w="2160"/>
-          </w:tcPr>
-          <w:p>
-            <w:r>
-              <w:rPr>
-                <w:sz w:val="17"/>
-              </w:rPr>
-              <w:t>0.009</w:t>
-            </w:r>
-          </w:p>
-        </w:tc>
-        <w:tc>
-          <w:tcPr>
-            <w:tcW w:type="dxa" w:w="2160"/>
-          </w:tcPr>
-          <w:p>
-            <w:r>
-              <w:rPr>
-                <w:sz w:val="17"/>
-              </w:rPr>
-              <w:t>0.018</w:t>
+            <w:tcW w:type="dxa" w:w="1440"/>
+          </w:tcPr>
+          <w:p>
+            <w:r>
+              <w:rPr>
+                <w:sz w:val="16"/>
+              </w:rPr>
+              <w:t>B-form registered</w:t>
+            </w:r>
+          </w:p>
+        </w:tc>
+        <w:tc>
+          <w:tcPr>
+            <w:tcW w:type="dxa" w:w="1440"/>
+          </w:tcPr>
+          <w:p>
+            <w:r>
+              <w:rPr>
+                <w:sz w:val="16"/>
+              </w:rPr>
+              <w:t>0.043</w:t>
+            </w:r>
+          </w:p>
+        </w:tc>
+        <w:tc>
+          <w:tcPr>
+            <w:tcW w:type="dxa" w:w="1440"/>
+          </w:tcPr>
+          <w:p>
+            <w:r>
+              <w:rPr>
+                <w:sz w:val="16"/>
+              </w:rPr>
+              <w:t>0.050</w:t>
+            </w:r>
+          </w:p>
+        </w:tc>
+        <w:tc>
+          <w:tcPr>
+            <w:tcW w:type="dxa" w:w="1440"/>
+          </w:tcPr>
+          <w:p>
+            <w:r>
+              <w:rPr>
+                <w:sz w:val="16"/>
+              </w:rPr>
+              <w:t>0.012</w:t>
+            </w:r>
+          </w:p>
+        </w:tc>
+        <w:tc>
+          <w:tcPr>
+            <w:tcW w:type="dxa" w:w="1440"/>
+          </w:tcPr>
+          <w:p>
+            <w:r>
+              <w:rPr>
+                <w:sz w:val="16"/>
+              </w:rPr>
+              <w:t>0.013</w:t>
+            </w:r>
+          </w:p>
+        </w:tc>
+        <w:tc>
+          <w:tcPr>
+            <w:tcW w:type="dxa" w:w="1440"/>
+          </w:tcPr>
+          <w:p>
+            <w:r>
+              <w:rPr>
+                <w:sz w:val="16"/>
+              </w:rPr>
+              <w:t>0.011</w:t>
             </w:r>
           </w:p>
         </w:tc>
@@ -9223,53 +10821,79 @@
       <w:tr>
         <w:tc>
           <w:tcPr>
-            <w:tcW w:type="dxa" w:w="2160"/>
-          </w:tcPr>
-          <w:p>
-            <w:r>
-              <w:rPr>
-                <w:sz w:val="17"/>
-              </w:rPr>
-              <w:t>B-form registered</w:t>
-            </w:r>
-          </w:p>
-        </w:tc>
-        <w:tc>
-          <w:tcPr>
-            <w:tcW w:type="dxa" w:w="2160"/>
-          </w:tcPr>
-          <w:p>
-            <w:r>
-              <w:rPr>
-                <w:sz w:val="17"/>
-              </w:rPr>
-              <w:t>0.043</w:t>
-            </w:r>
-          </w:p>
-        </w:tc>
-        <w:tc>
-          <w:tcPr>
-            <w:tcW w:type="dxa" w:w="2160"/>
-          </w:tcPr>
-          <w:p>
-            <w:r>
-              <w:rPr>
-                <w:sz w:val="17"/>
-              </w:rPr>
-              <w:t>0.012</w:t>
-            </w:r>
-          </w:p>
-        </w:tc>
-        <w:tc>
-          <w:tcPr>
-            <w:tcW w:type="dxa" w:w="2160"/>
-          </w:tcPr>
-          <w:p>
-            <w:r>
-              <w:rPr>
-                <w:sz w:val="17"/>
-              </w:rPr>
-              <w:t>0.013</w:t>
+            <w:tcW w:type="dxa" w:w="1440"/>
+          </w:tcPr>
+          <w:p>
+            <w:r>
+              <w:rPr>
+                <w:sz w:val="16"/>
+              </w:rPr>
+              <w:t>Female</w:t>
+            </w:r>
+          </w:p>
+        </w:tc>
+        <w:tc>
+          <w:tcPr>
+            <w:tcW w:type="dxa" w:w="1440"/>
+          </w:tcPr>
+          <w:p>
+            <w:r>
+              <w:rPr>
+                <w:sz w:val="16"/>
+              </w:rPr>
+              <w:t>0.046</w:t>
+            </w:r>
+          </w:p>
+        </w:tc>
+        <w:tc>
+          <w:tcPr>
+            <w:tcW w:type="dxa" w:w="1440"/>
+          </w:tcPr>
+          <w:p>
+            <w:r>
+              <w:rPr>
+                <w:sz w:val="16"/>
+              </w:rPr>
+              <w:t>0.045</w:t>
+            </w:r>
+          </w:p>
+        </w:tc>
+        <w:tc>
+          <w:tcPr>
+            <w:tcW w:type="dxa" w:w="1440"/>
+          </w:tcPr>
+          <w:p>
+            <w:r>
+              <w:rPr>
+                <w:sz w:val="16"/>
+              </w:rPr>
+              <w:t>0.009</w:t>
+            </w:r>
+          </w:p>
+        </w:tc>
+        <w:tc>
+          <w:tcPr>
+            <w:tcW w:type="dxa" w:w="1440"/>
+          </w:tcPr>
+          <w:p>
+            <w:r>
+              <w:rPr>
+                <w:sz w:val="16"/>
+              </w:rPr>
+              <w:t>0.018</w:t>
+            </w:r>
+          </w:p>
+        </w:tc>
+        <w:tc>
+          <w:tcPr>
+            <w:tcW w:type="dxa" w:w="1440"/>
+          </w:tcPr>
+          <w:p>
+            <w:r>
+              <w:rPr>
+                <w:sz w:val="16"/>
+              </w:rPr>
+              <w:t>0.016</w:t>
             </w:r>
           </w:p>
         </w:tc>
@@ -9277,53 +10901,79 @@
       <w:tr>
         <w:tc>
           <w:tcPr>
-            <w:tcW w:type="dxa" w:w="2160"/>
-          </w:tcPr>
-          <w:p>
-            <w:r>
-              <w:rPr>
-                <w:sz w:val="17"/>
-              </w:rPr>
-              <w:t>Province: Sindh</w:t>
-            </w:r>
-          </w:p>
-        </w:tc>
-        <w:tc>
-          <w:tcPr>
-            <w:tcW w:type="dxa" w:w="2160"/>
-          </w:tcPr>
-          <w:p>
-            <w:r>
-              <w:rPr>
-                <w:sz w:val="17"/>
-              </w:rPr>
-              <w:t>0.031</w:t>
-            </w:r>
-          </w:p>
-        </w:tc>
-        <w:tc>
-          <w:tcPr>
-            <w:tcW w:type="dxa" w:w="2160"/>
-          </w:tcPr>
-          <w:p>
-            <w:r>
-              <w:rPr>
-                <w:sz w:val="17"/>
-              </w:rPr>
-              <w:t>-0.007</w:t>
-            </w:r>
-          </w:p>
-        </w:tc>
-        <w:tc>
-          <w:tcPr>
-            <w:tcW w:type="dxa" w:w="2160"/>
-          </w:tcPr>
-          <w:p>
-            <w:r>
-              <w:rPr>
-                <w:sz w:val="17"/>
-              </w:rPr>
-              <w:t>0.007</w:t>
+            <w:tcW w:type="dxa" w:w="1440"/>
+          </w:tcPr>
+          <w:p>
+            <w:r>
+              <w:rPr>
+                <w:sz w:val="16"/>
+              </w:rPr>
+              <w:t>Urban</w:t>
+            </w:r>
+          </w:p>
+        </w:tc>
+        <w:tc>
+          <w:tcPr>
+            <w:tcW w:type="dxa" w:w="1440"/>
+          </w:tcPr>
+          <w:p>
+            <w:r>
+              <w:rPr>
+                <w:sz w:val="16"/>
+              </w:rPr>
+              <w:t>0.017</w:t>
+            </w:r>
+          </w:p>
+        </w:tc>
+        <w:tc>
+          <w:tcPr>
+            <w:tcW w:type="dxa" w:w="1440"/>
+          </w:tcPr>
+          <w:p>
+            <w:r>
+              <w:rPr>
+                <w:sz w:val="16"/>
+              </w:rPr>
+              <w:t>0.033</w:t>
+            </w:r>
+          </w:p>
+        </w:tc>
+        <w:tc>
+          <w:tcPr>
+            <w:tcW w:type="dxa" w:w="1440"/>
+          </w:tcPr>
+          <w:p>
+            <w:r>
+              <w:rPr>
+                <w:sz w:val="16"/>
+              </w:rPr>
+              <w:t>-0.001</w:t>
+            </w:r>
+          </w:p>
+        </w:tc>
+        <w:tc>
+          <w:tcPr>
+            <w:tcW w:type="dxa" w:w="1440"/>
+          </w:tcPr>
+          <w:p>
+            <w:r>
+              <w:rPr>
+                <w:sz w:val="16"/>
+              </w:rPr>
+              <w:t>-0.002</w:t>
+            </w:r>
+          </w:p>
+        </w:tc>
+        <w:tc>
+          <w:tcPr>
+            <w:tcW w:type="dxa" w:w="1440"/>
+          </w:tcPr>
+          <w:p>
+            <w:r>
+              <w:rPr>
+                <w:sz w:val="16"/>
+              </w:rPr>
+              <w:t>-0.002</w:t>
             </w:r>
           </w:p>
         </w:tc>
@@ -9331,53 +10981,79 @@
       <w:tr>
         <w:tc>
           <w:tcPr>
-            <w:tcW w:type="dxa" w:w="2160"/>
-          </w:tcPr>
-          <w:p>
-            <w:r>
-              <w:rPr>
-                <w:sz w:val="17"/>
-              </w:rPr>
-              <w:t>Province: KP</w:t>
-            </w:r>
-          </w:p>
-        </w:tc>
-        <w:tc>
-          <w:tcPr>
-            <w:tcW w:type="dxa" w:w="2160"/>
-          </w:tcPr>
-          <w:p>
-            <w:r>
-              <w:rPr>
-                <w:sz w:val="17"/>
-              </w:rPr>
-              <w:t>0.026</w:t>
-            </w:r>
-          </w:p>
-        </w:tc>
-        <w:tc>
-          <w:tcPr>
-            <w:tcW w:type="dxa" w:w="2160"/>
-          </w:tcPr>
-          <w:p>
-            <w:r>
-              <w:rPr>
-                <w:sz w:val="17"/>
-              </w:rPr>
-              <w:t>-0.001</w:t>
-            </w:r>
-          </w:p>
-        </w:tc>
-        <w:tc>
-          <w:tcPr>
-            <w:tcW w:type="dxa" w:w="2160"/>
-          </w:tcPr>
-          <w:p>
-            <w:r>
-              <w:rPr>
-                <w:sz w:val="17"/>
-              </w:rPr>
-              <w:t>0.010</w:t>
+            <w:tcW w:type="dxa" w:w="1440"/>
+          </w:tcPr>
+          <w:p>
+            <w:r>
+              <w:rPr>
+                <w:sz w:val="16"/>
+              </w:rPr>
+              <w:t>Province: Sindh</w:t>
+            </w:r>
+          </w:p>
+        </w:tc>
+        <w:tc>
+          <w:tcPr>
+            <w:tcW w:type="dxa" w:w="1440"/>
+          </w:tcPr>
+          <w:p>
+            <w:r>
+              <w:rPr>
+                <w:sz w:val="16"/>
+              </w:rPr>
+              <w:t>0.031</w:t>
+            </w:r>
+          </w:p>
+        </w:tc>
+        <w:tc>
+          <w:tcPr>
+            <w:tcW w:type="dxa" w:w="1440"/>
+          </w:tcPr>
+          <w:p>
+            <w:r>
+              <w:rPr>
+                <w:sz w:val="16"/>
+              </w:rPr>
+              <w:t>0.031</w:t>
+            </w:r>
+          </w:p>
+        </w:tc>
+        <w:tc>
+          <w:tcPr>
+            <w:tcW w:type="dxa" w:w="1440"/>
+          </w:tcPr>
+          <w:p>
+            <w:r>
+              <w:rPr>
+                <w:sz w:val="16"/>
+              </w:rPr>
+              <w:t>-0.007</w:t>
+            </w:r>
+          </w:p>
+        </w:tc>
+        <w:tc>
+          <w:tcPr>
+            <w:tcW w:type="dxa" w:w="1440"/>
+          </w:tcPr>
+          <w:p>
+            <w:r>
+              <w:rPr>
+                <w:sz w:val="16"/>
+              </w:rPr>
+              <w:t>0.007</w:t>
+            </w:r>
+          </w:p>
+        </w:tc>
+        <w:tc>
+          <w:tcPr>
+            <w:tcW w:type="dxa" w:w="1440"/>
+          </w:tcPr>
+          <w:p>
+            <w:r>
+              <w:rPr>
+                <w:sz w:val="16"/>
+              </w:rPr>
+              <w:t>0.003</w:t>
             </w:r>
           </w:p>
         </w:tc>
@@ -9385,38 +11061,51 @@
       <w:tr>
         <w:tc>
           <w:tcPr>
-            <w:tcW w:type="dxa" w:w="2160"/>
-          </w:tcPr>
-          <w:p>
-            <w:r>
-              <w:rPr>
-                <w:sz w:val="17"/>
-              </w:rPr>
-              <w:t>Urban</w:t>
-            </w:r>
-          </w:p>
-        </w:tc>
-        <w:tc>
-          <w:tcPr>
-            <w:tcW w:type="dxa" w:w="2160"/>
-          </w:tcPr>
-          <w:p>
-            <w:r>
-              <w:rPr>
-                <w:sz w:val="17"/>
-              </w:rPr>
-              <w:t>0.017</w:t>
-            </w:r>
-          </w:p>
-        </w:tc>
-        <w:tc>
-          <w:tcPr>
-            <w:tcW w:type="dxa" w:w="2160"/>
-          </w:tcPr>
-          <w:p>
-            <w:r>
-              <w:rPr>
-                <w:sz w:val="17"/>
+            <w:tcW w:type="dxa" w:w="1440"/>
+          </w:tcPr>
+          <w:p>
+            <w:r>
+              <w:rPr>
+                <w:sz w:val="16"/>
+              </w:rPr>
+              <w:t>Province: KP</w:t>
+            </w:r>
+          </w:p>
+        </w:tc>
+        <w:tc>
+          <w:tcPr>
+            <w:tcW w:type="dxa" w:w="1440"/>
+          </w:tcPr>
+          <w:p>
+            <w:r>
+              <w:rPr>
+                <w:sz w:val="16"/>
+              </w:rPr>
+              <w:t>0.026</w:t>
+            </w:r>
+          </w:p>
+        </w:tc>
+        <w:tc>
+          <w:tcPr>
+            <w:tcW w:type="dxa" w:w="1440"/>
+          </w:tcPr>
+          <w:p>
+            <w:r>
+              <w:rPr>
+                <w:sz w:val="16"/>
+              </w:rPr>
+              <w:t>0.020</w:t>
+            </w:r>
+          </w:p>
+        </w:tc>
+        <w:tc>
+          <w:tcPr>
+            <w:tcW w:type="dxa" w:w="1440"/>
+          </w:tcPr>
+          <w:p>
+            <w:r>
+              <w:rPr>
+                <w:sz w:val="16"/>
               </w:rPr>
               <w:t>-0.001</w:t>
             </w:r>
@@ -9424,14 +11113,27 @@
         </w:tc>
         <w:tc>
           <w:tcPr>
-            <w:tcW w:type="dxa" w:w="2160"/>
-          </w:tcPr>
-          <w:p>
-            <w:r>
-              <w:rPr>
-                <w:sz w:val="17"/>
-              </w:rPr>
-              <w:t>-0.002</w:t>
+            <w:tcW w:type="dxa" w:w="1440"/>
+          </w:tcPr>
+          <w:p>
+            <w:r>
+              <w:rPr>
+                <w:sz w:val="16"/>
+              </w:rPr>
+              <w:t>0.010</w:t>
+            </w:r>
+          </w:p>
+        </w:tc>
+        <w:tc>
+          <w:tcPr>
+            <w:tcW w:type="dxa" w:w="1440"/>
+          </w:tcPr>
+          <w:p>
+            <w:r>
+              <w:rPr>
+                <w:sz w:val="16"/>
+              </w:rPr>
+              <w:t>0.005</w:t>
             </w:r>
           </w:p>
         </w:tc>
@@ -9439,12 +11141,12 @@
       <w:tr>
         <w:tc>
           <w:tcPr>
-            <w:tcW w:type="dxa" w:w="2160"/>
-          </w:tcPr>
-          <w:p>
-            <w:r>
-              <w:rPr>
-                <w:sz w:val="17"/>
+            <w:tcW w:type="dxa" w:w="1440"/>
+          </w:tcPr>
+          <w:p>
+            <w:r>
+              <w:rPr>
+                <w:sz w:val="16"/>
               </w:rPr>
               <w:t>Female x Urban</w:t>
             </w:r>
@@ -9452,12 +11154,12 @@
         </w:tc>
         <w:tc>
           <w:tcPr>
-            <w:tcW w:type="dxa" w:w="2160"/>
-          </w:tcPr>
-          <w:p>
-            <w:r>
-              <w:rPr>
-                <w:sz w:val="17"/>
+            <w:tcW w:type="dxa" w:w="1440"/>
+          </w:tcPr>
+          <w:p>
+            <w:r>
+              <w:rPr>
+                <w:sz w:val="16"/>
               </w:rPr>
               <w:t>0.004</w:t>
             </w:r>
@@ -9465,12 +11167,25 @@
         </w:tc>
         <w:tc>
           <w:tcPr>
-            <w:tcW w:type="dxa" w:w="2160"/>
-          </w:tcPr>
-          <w:p>
-            <w:r>
-              <w:rPr>
-                <w:sz w:val="17"/>
+            <w:tcW w:type="dxa" w:w="1440"/>
+          </w:tcPr>
+          <w:p>
+            <w:r>
+              <w:rPr>
+                <w:sz w:val="16"/>
+              </w:rPr>
+              <w:t>0.011</w:t>
+            </w:r>
+          </w:p>
+        </w:tc>
+        <w:tc>
+          <w:tcPr>
+            <w:tcW w:type="dxa" w:w="1440"/>
+          </w:tcPr>
+          <w:p>
+            <w:r>
+              <w:rPr>
+                <w:sz w:val="16"/>
               </w:rPr>
               <w:t>-0.002</w:t>
             </w:r>
@@ -9478,14 +11193,27 @@
         </w:tc>
         <w:tc>
           <w:tcPr>
-            <w:tcW w:type="dxa" w:w="2160"/>
-          </w:tcPr>
-          <w:p>
-            <w:r>
-              <w:rPr>
-                <w:sz w:val="17"/>
+            <w:tcW w:type="dxa" w:w="1440"/>
+          </w:tcPr>
+          <w:p>
+            <w:r>
+              <w:rPr>
+                <w:sz w:val="16"/>
               </w:rPr>
               <w:t>0.002</w:t>
+            </w:r>
+          </w:p>
+        </w:tc>
+        <w:tc>
+          <w:tcPr>
+            <w:tcW w:type="dxa" w:w="1440"/>
+          </w:tcPr>
+          <w:p>
+            <w:r>
+              <w:rPr>
+                <w:sz w:val="16"/>
+              </w:rPr>
+              <w:t>-0.000</w:t>
             </w:r>
           </w:p>
         </w:tc>
@@ -9493,12 +11221,12 @@
       <w:tr>
         <w:tc>
           <w:tcPr>
-            <w:tcW w:type="dxa" w:w="2160"/>
-          </w:tcPr>
-          <w:p>
-            <w:r>
-              <w:rPr>
-                <w:sz w:val="17"/>
+            <w:tcW w:type="dxa" w:w="1440"/>
+          </w:tcPr>
+          <w:p>
+            <w:r>
+              <w:rPr>
+                <w:sz w:val="16"/>
               </w:rPr>
               <w:t>Province: ICT</w:t>
             </w:r>
@@ -9506,12 +11234,12 @@
         </w:tc>
         <w:tc>
           <w:tcPr>
-            <w:tcW w:type="dxa" w:w="2160"/>
-          </w:tcPr>
-          <w:p>
-            <w:r>
-              <w:rPr>
-                <w:sz w:val="17"/>
+            <w:tcW w:type="dxa" w:w="1440"/>
+          </w:tcPr>
+          <w:p>
+            <w:r>
+              <w:rPr>
+                <w:sz w:val="16"/>
               </w:rPr>
               <w:t>0.000</w:t>
             </w:r>
@@ -9519,12 +11247,25 @@
         </w:tc>
         <w:tc>
           <w:tcPr>
-            <w:tcW w:type="dxa" w:w="2160"/>
-          </w:tcPr>
-          <w:p>
-            <w:r>
-              <w:rPr>
-                <w:sz w:val="17"/>
+            <w:tcW w:type="dxa" w:w="1440"/>
+          </w:tcPr>
+          <w:p>
+            <w:r>
+              <w:rPr>
+                <w:sz w:val="16"/>
+              </w:rPr>
+              <w:t>0.001</w:t>
+            </w:r>
+          </w:p>
+        </w:tc>
+        <w:tc>
+          <w:tcPr>
+            <w:tcW w:type="dxa" w:w="1440"/>
+          </w:tcPr>
+          <w:p>
+            <w:r>
+              <w:rPr>
+                <w:sz w:val="16"/>
               </w:rPr>
               <w:t>0.000</w:t>
             </w:r>
@@ -9532,12 +11273,25 @@
         </w:tc>
         <w:tc>
           <w:tcPr>
-            <w:tcW w:type="dxa" w:w="2160"/>
-          </w:tcPr>
-          <w:p>
-            <w:r>
-              <w:rPr>
-                <w:sz w:val="17"/>
+            <w:tcW w:type="dxa" w:w="1440"/>
+          </w:tcPr>
+          <w:p>
+            <w:r>
+              <w:rPr>
+                <w:sz w:val="16"/>
+              </w:rPr>
+              <w:t>0.000</w:t>
+            </w:r>
+          </w:p>
+        </w:tc>
+        <w:tc>
+          <w:tcPr>
+            <w:tcW w:type="dxa" w:w="1440"/>
+          </w:tcPr>
+          <w:p>
+            <w:r>
+              <w:rPr>
+                <w:sz w:val="16"/>
               </w:rPr>
               <w:t>0.000</w:t>
             </w:r>
@@ -9645,7 +11399,58 @@
           <w:i/>
           <w:sz w:val="18"/>
         </w:rPr>
-        <w:t>Figure 8. Standardised coefficients, Gini importance and permutation importance side by side.</w:t>
+        <w:t>Figure 8. Logistic standardised coefficients, tree Gini importance and permutation importance side by side.</w:t>
+      </w:r>
+    </w:p>
+    <w:p>
+      <w:pPr>
+        <w:jc w:val="center"/>
+      </w:pPr>
+      <w:r>
+        <w:drawing>
+          <wp:inline xmlns:a="http://schemas.openxmlformats.org/drawingml/2006/main" xmlns:pic="http://schemas.openxmlformats.org/drawingml/2006/picture">
+            <wp:extent cx="5760720" cy="2036670"/>
+            <wp:docPr id="9" name="Picture 9"/>
+            <wp:cNvGraphicFramePr>
+              <a:graphicFrameLocks noChangeAspect="1"/>
+            </wp:cNvGraphicFramePr>
+            <a:graphic>
+              <a:graphicData uri="http://schemas.openxmlformats.org/drawingml/2006/picture">
+                <pic:pic>
+                  <pic:nvPicPr>
+                    <pic:cNvPr id="0" name="fig10_rf_importance.png"/>
+                    <pic:cNvPicPr/>
+                  </pic:nvPicPr>
+                  <pic:blipFill>
+                    <a:blip r:embed="rId17"/>
+                    <a:stretch>
+                      <a:fillRect/>
+                    </a:stretch>
+                  </pic:blipFill>
+                  <pic:spPr>
+                    <a:xfrm>
+                      <a:off x="0" y="0"/>
+                      <a:ext cx="5760720" cy="2036670"/>
+                    </a:xfrm>
+                    <a:prstGeom prst="rect"/>
+                  </pic:spPr>
+                </pic:pic>
+              </a:graphicData>
+            </a:graphic>
+          </wp:inline>
+        </w:drawing>
+      </w:r>
+    </w:p>
+    <w:p>
+      <w:pPr>
+        <w:jc w:val="center"/>
+      </w:pPr>
+      <w:r>
+        <w:rPr>
+          <w:i/>
+          <w:sz w:val="18"/>
+        </w:rPr>
+        <w:t>Figure 8b. Random forest Gini and permutation importance.</w:t>
       </w:r>
     </w:p>
     <w:p>
@@ -9656,7 +11461,7 @@
         <w:drawing>
           <wp:inline xmlns:a="http://schemas.openxmlformats.org/drawingml/2006/main" xmlns:pic="http://schemas.openxmlformats.org/drawingml/2006/picture">
             <wp:extent cx="4206240" cy="2830076"/>
-            <wp:docPr id="9" name="Picture 9"/>
+            <wp:docPr id="10" name="Picture 10"/>
             <wp:cNvGraphicFramePr>
               <a:graphicFrameLocks noChangeAspect="1"/>
             </wp:cNvGraphicFramePr>
@@ -9668,7 +11473,7 @@
                     <pic:cNvPicPr/>
                   </pic:nvPicPr>
                   <pic:blipFill>
-                    <a:blip r:embed="rId17"/>
+                    <a:blip r:embed="rId18"/>
                     <a:stretch>
                       <a:fillRect/>
                     </a:stretch>
@@ -10455,7 +12260,7 @@
         <w:pStyle w:val="ListBullet"/>
       </w:pPr>
       <w:r>
-        <w:t>H1 Poverty (asset count). The odds ratio is 0.964 per additional asset and its interval excludes 1, so the direction is as hypothesised, but the effect per asset is small; the count ranks 4th in Gini importance. Housing structure (odds ratio 0.56 per step from kachha to pacca) and digital access (odds ratio 0.82 per service) are the dominant poverty signals in both models. The null is rejected, with the qualification that the asset count is a weaker measure of poverty than housing.</w:t>
+        <w:t>H1 Poverty (asset count). The odds ratio is 0.964 per additional asset and its interval excludes 1, so the direction is as hypothesised, but the effect per asset is small; the count ranks 4th in Gini importance. Housing structure (odds ratio 0.56 per step from kachha to pacca) and digital access (odds ratio 0.82 per service) are the dominant poverty signals in all three models. The null is rejected, with the qualification that the asset count is a weaker measure of poverty than housing.</w:t>
       </w:r>
     </w:p>
     <w:p>
@@ -10463,7 +12268,7 @@
         <w:pStyle w:val="ListBullet"/>
       </w:pPr>
       <w:r>
-        <w:t>H2 Legal identity (B-form). Registered children have an odds ratio of 0.753, which means unregistered children have about 1.33 times the odds of being out of school. The result is significant and consistent across all three importance views. The null is rejected.</w:t>
+        <w:t>H2 Legal identity (B-form). Registered children have an odds ratio of 0.753, which means unregistered children have about 1.33 times the odds of being out of school. The result is significant and consistent across all importance views and all three models. The null is rejected.</w:t>
       </w:r>
     </w:p>
     <w:p>
@@ -10564,7 +12369,7 @@
         <w:pStyle w:val="ListBullet"/>
       </w:pPr>
       <w:r>
-        <w:t>Set the operating cut-off deliberately, and choose it on training data. At a 5:1 cost ratio the recommended policy flags about 33% of children and finds 62% of those out of school in districts the model has never seen. The default cut-off of 0.5 is not a defensible choice for outreach.</w:t>
+        <w:t>Set the operating cut-off deliberately, and choose it on training data. At a 5:1 cost ratio the recommended policy (decision tree at 0.16) flags about 33% of children and finds 62% of those out of school in districts the model has never seen. The default cut-off of 0.5 is not a defensible choice for outreach.</w:t>
       </w:r>
     </w:p>
     <w:p>
@@ -10585,7 +12390,7 @@
         <w:pStyle w:val="ListBullet"/>
       </w:pPr>
       <w:r>
-        <w:t>Modest discrimination (the ability to tell the two groups apart): hold-out ROC-AUC of 0.67-0.71 and a pseudo-R-squared of 0.12. This is a sign of underfitting (the model is too simple for the pattern). Thirteen household features cannot separate the harder cases, especially urban or better-off dropouts; the missing information is probably on the school side (distance, supply, cost) and in the child's history.</w:t>
+        <w:t>Modest discrimination (the ability to tell the two groups apart): hold-out ROC-AUC of 0.67-0.72 and a pseudo-R-squared of 0.12. This is a sign of underfitting (the model is too simple for the pattern). Thirteen household features cannot separate the harder cases, especially urban or better-off dropouts; the missing information is probably on the school side (distance, supply, cost) and in the child's history.</w:t>
       </w:r>
     </w:p>
     <w:p>
@@ -10646,7 +12451,7 @@
         <w:pStyle w:val="ListBullet"/>
       </w:pPr>
       <w:r>
-        <w:t>Stronger models under the same district-grouped cross-validation: random forests and gradient boosting (ensembles that combine many trees and usually predict better than a single tree); calibration (checking that a predicted 30% really means about 30%); interaction terms suggested by the tree; and a cost-sensitive objective (training the model to minimise the weighted error cost directly rather than fixing it afterwards with a cut-off).</w:t>
+        <w:t>Stronger models under the same district-grouped cross-validation: gradient boosting (an ensemble that builds trees one after another, each correcting the errors of the last, and usually the strongest tabular learner), building on the random forest already fitted here; calibration (checking that a predicted 30% really means about 30%); interaction terms suggested by the tree; and a cost-sensitive objective (training the model to minimise the weighted error cost directly rather than fixing it afterwards with a cut-off).</w:t>
       </w:r>
     </w:p>
     <w:p>
@@ -11722,6 +13527,34 @@
                 <w:sz w:val="17"/>
               </w:rPr>
               <w:t>A model too simple to capture the pattern in the data.</w:t>
+            </w:r>
+          </w:p>
+        </w:tc>
+      </w:tr>
+      <w:tr>
+        <w:tc>
+          <w:tcPr>
+            <w:tcW w:type="dxa" w:w="4320"/>
+          </w:tcPr>
+          <w:p>
+            <w:r>
+              <w:rPr>
+                <w:sz w:val="17"/>
+              </w:rPr>
+              <w:t>Ensemble / random forest / bagging</w:t>
+            </w:r>
+          </w:p>
+        </w:tc>
+        <w:tc>
+          <w:tcPr>
+            <w:tcW w:type="dxa" w:w="4320"/>
+          </w:tcPr>
+          <w:p>
+            <w:r>
+              <w:rPr>
+                <w:sz w:val="17"/>
+              </w:rPr>
+              <w:t>A model made of many models; a forest averages many trees, each trained on a bootstrap re-sample (bagging) with random feature subsets.</w:t>
             </w:r>
           </w:p>
         </w:tc>

</xml_diff>